<commit_message>
Dcomunentacion completada ala  mitad
</commit_message>
<xml_diff>
--- a/Documentacion/Documentacion completa/Sistema gestor de ventas Salud y Armonia.docx
+++ b/Documentacion/Documentacion completa/Sistema gestor de ventas Salud y Armonia.docx
@@ -4207,21 +4207,7 @@
               <w:rPr>
                 <w:sz w:val="22"/>
               </w:rPr>
-              <w:t xml:space="preserve">-El usuario no este </w:t>
-            </w:r>
-            <w:proofErr w:type="spellStart"/>
-            <w:r>
-              <w:rPr>
-                <w:sz w:val="22"/>
-              </w:rPr>
-              <w:t>logeado</w:t>
-            </w:r>
-            <w:proofErr w:type="spellEnd"/>
-            <w:r>
-              <w:rPr>
-                <w:sz w:val="22"/>
-              </w:rPr>
-              <w:t xml:space="preserve"> </w:t>
+              <w:t xml:space="preserve">-El usuario no este logeado </w:t>
             </w:r>
           </w:p>
         </w:tc>
@@ -4639,21 +4625,7 @@
                 <w:sz w:val="22"/>
               </w:rPr>
               <w:tab/>
-              <w:t xml:space="preserve">si </w:t>
-            </w:r>
-            <w:proofErr w:type="spellStart"/>
-            <w:r>
-              <w:rPr>
-                <w:sz w:val="22"/>
-              </w:rPr>
-              <w:t>esta</w:t>
-            </w:r>
-            <w:proofErr w:type="spellEnd"/>
-            <w:r>
-              <w:rPr>
-                <w:sz w:val="22"/>
-              </w:rPr>
-              <w:t xml:space="preserve"> completa y es valida </w:t>
+              <w:t xml:space="preserve">si esta completa y es valida </w:t>
             </w:r>
           </w:p>
         </w:tc>
@@ -8360,15 +8332,7 @@
               <w:ind w:left="107" w:right="0" w:firstLine="0"/>
             </w:pPr>
             <w:r>
-              <w:t xml:space="preserve">El sistema debe adaptarse correctamente a dispositivos móviles, </w:t>
-            </w:r>
-            <w:proofErr w:type="spellStart"/>
-            <w:r>
-              <w:t>tablets</w:t>
-            </w:r>
-            <w:proofErr w:type="spellEnd"/>
-            <w:r>
-              <w:t xml:space="preserve"> y computadoras. </w:t>
+              <w:t xml:space="preserve">El sistema debe adaptarse correctamente a dispositivos móviles, tablets y computadoras. </w:t>
             </w:r>
           </w:p>
         </w:tc>
@@ -10077,15 +10041,7 @@
         <w:t xml:space="preserve"> y </w:t>
       </w:r>
       <w:r>
-        <w:t xml:space="preserve">elige si desea comprar algo más o continuar, también puede elegir borrar algún </w:t>
-      </w:r>
-      <w:proofErr w:type="spellStart"/>
-      <w:r>
-        <w:t>articulo</w:t>
-      </w:r>
-      <w:proofErr w:type="spellEnd"/>
-      <w:r>
-        <w:t xml:space="preserve"> de su compra, si desea realizar la compra, debe ingresar los datos, procesar el pago y confirmar pedido.</w:t>
+        <w:t>elige si desea comprar algo más o continuar, también puede elegir borrar algún articulo de su compra, si desea realizar la compra, debe ingresar los datos, procesar el pago y confirmar pedido.</w:t>
       </w:r>
       <w:r>
         <w:rPr>
@@ -11375,13 +11331,13 @@
       <w:pPr>
         <w:pStyle w:val="Ttulo4"/>
         <w:rPr>
+          <w:rFonts w:ascii="Times New Roman" w:eastAsia="Times New Roman" w:hAnsi="Times New Roman" w:cs="Times New Roman"/>
+        </w:rPr>
+      </w:pPr>
+      <w:r>
+        <w:rPr>
           <w:rFonts w:ascii="Times New Roman" w:hAnsi="Times New Roman" w:cs="Times New Roman"/>
         </w:rPr>
-      </w:pPr>
-      <w:r>
-        <w:rPr>
-          <w:rFonts w:ascii="Times New Roman" w:hAnsi="Times New Roman" w:cs="Times New Roman"/>
-        </w:rPr>
         <w:t>Diagrama GENERAL del sistema</w:t>
       </w:r>
       <w:r>
@@ -11391,6 +11347,7 @@
         <w:t xml:space="preserve"> </w:t>
       </w:r>
     </w:p>
+    <w:p/>
     <w:p>
       <w:pPr>
         <w:spacing w:after="96"/>
@@ -11467,6 +11424,7 @@
           <w:b/>
           <w:sz w:val="22"/>
         </w:rPr>
+        <w:lastRenderedPageBreak/>
         <w:t xml:space="preserve"> </w:t>
       </w:r>
       <w:r>
@@ -11479,7 +11437,6 @@
         <w:ind w:right="425"/>
       </w:pPr>
       <w:r>
-        <w:lastRenderedPageBreak/>
         <w:t xml:space="preserve">Primero está el cliente, que es cualquier persona que entra a la página. </w:t>
       </w:r>
     </w:p>
@@ -11812,7 +11769,11 @@
       </w:r>
       <w:r>
         <w:tab/>
-        <w:t>La capa de lógica es la que define como se moverá el sistema, es lo que hará que un botón, un comentario de verdad llege a algo, dicha capa de lógica se implementara utilizando JavaScript, un conocido lenguaje de programación específicamente usando el framework de Node.js el cual permite trabajarlo de manera eficaz como Backend, la función será procesar la información que el usuario desee y que lo haga de manera rápida y sin consumo en exceso de recursos.</w:t>
+        <w:t xml:space="preserve">La capa de lógica es la que define como se moverá el sistema, es lo que hará que un botón, un comentario de verdad llege a algo, dicha capa de lógica se implementara utilizando JavaScript, un conocido lenguaje de programación específicamente usando el framework de Node.js el cual permite trabajarlo de manera </w:t>
+      </w:r>
+      <w:r>
+        <w:lastRenderedPageBreak/>
+        <w:t>eficaz como Backend, la función será procesar la información que el usuario desee y que lo haga de manera rápida y sin consumo en exceso de recursos.</w:t>
       </w:r>
     </w:p>
     <w:p>
@@ -11827,7 +11788,6 @@
         <w:rPr>
           <w:rFonts w:ascii="Times New Roman" w:hAnsi="Times New Roman" w:cs="Times New Roman"/>
         </w:rPr>
-        <w:lastRenderedPageBreak/>
         <w:tab/>
       </w:r>
       <w:r>
@@ -12280,7 +12240,6 @@
         <w:rPr>
           <w:rFonts w:ascii="Times New Roman" w:hAnsi="Times New Roman" w:cs="Times New Roman"/>
         </w:rPr>
-        <w:lastRenderedPageBreak/>
         <w:t>Diseño de Base de Datos</w:t>
       </w:r>
     </w:p>
@@ -12458,7 +12417,7 @@
         <w:spacing w:line="360" w:lineRule="auto"/>
       </w:pPr>
       <w:r>
-        <w:t>rol (cliente/admin)</w:t>
+        <w:t>direccion(opcional)</w:t>
       </w:r>
     </w:p>
     <w:p>
@@ -12470,6 +12429,19 @@
         <w:spacing w:line="360" w:lineRule="auto"/>
       </w:pPr>
       <w:r>
+        <w:t>rol (cliente/admin)</w:t>
+      </w:r>
+    </w:p>
+    <w:p>
+      <w:pPr>
+        <w:numPr>
+          <w:ilvl w:val="0"/>
+          <w:numId w:val="10"/>
+        </w:numPr>
+        <w:spacing w:line="360" w:lineRule="auto"/>
+      </w:pPr>
+      <w:r>
+        <w:lastRenderedPageBreak/>
         <w:t>fecha_registro</w:t>
       </w:r>
     </w:p>
@@ -12491,7 +12463,6 @@
           <w:b/>
           <w:bCs/>
         </w:rPr>
-        <w:lastRenderedPageBreak/>
         <w:t>Productos</w:t>
       </w:r>
     </w:p>
@@ -12511,13 +12482,8 @@
         </w:numPr>
         <w:spacing w:line="360" w:lineRule="auto"/>
       </w:pPr>
-      <w:proofErr w:type="spellStart"/>
-      <w:r>
-        <w:t>id_producto</w:t>
-      </w:r>
-      <w:proofErr w:type="spellEnd"/>
-      <w:r>
-        <w:t xml:space="preserve"> (PK)</w:t>
+      <w:r>
+        <w:t>id_producto (PK)</w:t>
       </w:r>
     </w:p>
     <w:p>
@@ -12540,11 +12506,9 @@
         </w:numPr>
         <w:spacing w:line="360" w:lineRule="auto"/>
       </w:pPr>
-      <w:proofErr w:type="spellStart"/>
       <w:r>
         <w:t>descripcion</w:t>
       </w:r>
-      <w:proofErr w:type="spellEnd"/>
     </w:p>
     <w:p>
       <w:pPr>
@@ -12578,11 +12542,15 @@
         </w:numPr>
         <w:spacing w:line="360" w:lineRule="auto"/>
       </w:pPr>
-      <w:proofErr w:type="spellStart"/>
-      <w:r>
-        <w:t>categoria</w:t>
-      </w:r>
-      <w:proofErr w:type="spellEnd"/>
+      <w:r>
+        <w:t>categor</w:t>
+      </w:r>
+      <w:r>
+        <w:t>i</w:t>
+      </w:r>
+      <w:r>
+        <w:t>a</w:t>
+      </w:r>
     </w:p>
     <w:p>
       <w:pPr>
@@ -12616,13 +12584,8 @@
         </w:numPr>
         <w:spacing w:line="360" w:lineRule="auto"/>
       </w:pPr>
-      <w:proofErr w:type="spellStart"/>
-      <w:r>
-        <w:t>id_pedido</w:t>
-      </w:r>
-      <w:proofErr w:type="spellEnd"/>
-      <w:r>
-        <w:t xml:space="preserve"> (PK)</w:t>
+      <w:r>
+        <w:t>id_pedido (PK)</w:t>
       </w:r>
     </w:p>
     <w:p>
@@ -12701,16 +12664,13 @@
           <w:bCs/>
         </w:rPr>
       </w:pPr>
-      <w:proofErr w:type="spellStart"/>
       <w:r>
         <w:rPr>
           <w:b/>
           <w:bCs/>
         </w:rPr>
-        <w:lastRenderedPageBreak/>
         <w:t>Detalle_Pedido</w:t>
       </w:r>
-      <w:proofErr w:type="spellEnd"/>
     </w:p>
     <w:p>
       <w:pPr>
@@ -12728,13 +12688,8 @@
         </w:numPr>
         <w:spacing w:line="360" w:lineRule="auto"/>
       </w:pPr>
-      <w:proofErr w:type="spellStart"/>
-      <w:r>
-        <w:t>id_detalle</w:t>
-      </w:r>
-      <w:proofErr w:type="spellEnd"/>
-      <w:r>
-        <w:t xml:space="preserve"> (PK)</w:t>
+      <w:r>
+        <w:t>id_detalle (PK)</w:t>
       </w:r>
     </w:p>
     <w:p>
@@ -12745,13 +12700,8 @@
         </w:numPr>
         <w:spacing w:line="360" w:lineRule="auto"/>
       </w:pPr>
-      <w:proofErr w:type="spellStart"/>
-      <w:r>
-        <w:t>id_pedido</w:t>
-      </w:r>
-      <w:proofErr w:type="spellEnd"/>
-      <w:r>
-        <w:t xml:space="preserve"> (FK)</w:t>
+      <w:r>
+        <w:t>id_pedido (FK)</w:t>
       </w:r>
     </w:p>
     <w:p>
@@ -12762,13 +12712,8 @@
         </w:numPr>
         <w:spacing w:line="360" w:lineRule="auto"/>
       </w:pPr>
-      <w:proofErr w:type="spellStart"/>
-      <w:r>
-        <w:t>id_producto</w:t>
-      </w:r>
-      <w:proofErr w:type="spellEnd"/>
-      <w:r>
-        <w:t xml:space="preserve"> (FK)</w:t>
+      <w:r>
+        <w:t>id_producto (FK)</w:t>
       </w:r>
     </w:p>
     <w:p>
@@ -12791,11 +12736,9 @@
         </w:numPr>
         <w:spacing w:line="360" w:lineRule="auto"/>
       </w:pPr>
-      <w:proofErr w:type="spellStart"/>
       <w:r>
         <w:t>precio_unitario</w:t>
       </w:r>
-      <w:proofErr w:type="spellEnd"/>
     </w:p>
     <w:p>
       <w:pPr>
@@ -12829,13 +12772,8 @@
         </w:numPr>
         <w:spacing w:line="360" w:lineRule="auto"/>
       </w:pPr>
-      <w:proofErr w:type="spellStart"/>
-      <w:r>
-        <w:t>id_carrito</w:t>
-      </w:r>
-      <w:proofErr w:type="spellEnd"/>
-      <w:r>
-        <w:t xml:space="preserve"> (PK)</w:t>
+      <w:r>
+        <w:t>id_carrito (PK)</w:t>
       </w:r>
     </w:p>
     <w:p>
@@ -12858,13 +12796,8 @@
         </w:numPr>
         <w:spacing w:line="360" w:lineRule="auto"/>
       </w:pPr>
-      <w:proofErr w:type="spellStart"/>
-      <w:r>
-        <w:t>id_producto</w:t>
-      </w:r>
-      <w:proofErr w:type="spellEnd"/>
-      <w:r>
-        <w:t xml:space="preserve"> (FK)</w:t>
+      <w:r>
+        <w:t>id_producto (FK)</w:t>
       </w:r>
     </w:p>
     <w:p>
@@ -12917,7 +12850,6 @@
           <w:b/>
           <w:bCs/>
         </w:rPr>
-        <w:lastRenderedPageBreak/>
         <w:t>Contacto / Mensajes</w:t>
       </w:r>
     </w:p>
@@ -12937,13 +12869,8 @@
         </w:numPr>
         <w:spacing w:line="360" w:lineRule="auto"/>
       </w:pPr>
-      <w:proofErr w:type="spellStart"/>
-      <w:r>
-        <w:t>id_mensaje</w:t>
-      </w:r>
-      <w:proofErr w:type="spellEnd"/>
-      <w:r>
-        <w:t xml:space="preserve"> (PK)</w:t>
+      <w:r>
+        <w:t>id_mensaje (PK)</w:t>
       </w:r>
     </w:p>
     <w:p>
@@ -13038,15 +12965,7 @@
         <w:spacing w:line="360" w:lineRule="auto"/>
       </w:pPr>
       <w:r>
-        <w:t xml:space="preserve">Un pedido puede contener múltiples productos (1 a través de </w:t>
-      </w:r>
-      <w:proofErr w:type="spellStart"/>
-      <w:r>
-        <w:t>detalle_pedido</w:t>
-      </w:r>
-      <w:proofErr w:type="spellEnd"/>
-      <w:r>
-        <w:t>).</w:t>
+        <w:t>Un pedido puede contener múltiples productos (1 a través de detalle_pedido).</w:t>
       </w:r>
     </w:p>
     <w:p>
@@ -13133,7 +13052,6 @@
         <w:rPr>
           <w:rFonts w:ascii="Times New Roman" w:hAnsi="Times New Roman" w:cs="Times New Roman"/>
         </w:rPr>
-        <w:lastRenderedPageBreak/>
         <w:t>Integridad de Datos</w:t>
       </w:r>
     </w:p>
@@ -13317,14 +13235,8 @@
         <w:spacing w:line="360" w:lineRule="auto"/>
       </w:pPr>
       <w:r>
-        <w:lastRenderedPageBreak/>
-        <w:t>Diagrama de Entidad Relación (ER</w:t>
-      </w:r>
-      <w:proofErr w:type="gramStart"/>
-      <w:r>
-        <w:t>) :</w:t>
-      </w:r>
-      <w:proofErr w:type="gramEnd"/>
+        <w:t>Diagrama de Entidad Relación (ER):</w:t>
+      </w:r>
     </w:p>
     <w:p>
       <w:pPr>
@@ -13407,14 +13319,14 @@
         <w:ind w:left="0" w:right="0" w:firstLine="0"/>
         <w:jc w:val="left"/>
         <w:rPr>
-          <w:rFonts w:ascii="Calibri" w:eastAsia="Calibri" w:hAnsi="Calibri" w:cs="Calibri"/>
+          <w:rFonts w:eastAsia="Calibri"/>
           <w:b/>
           <w:sz w:val="22"/>
         </w:rPr>
       </w:pPr>
       <w:r>
         <w:rPr>
-          <w:rFonts w:ascii="Calibri" w:eastAsia="Calibri" w:hAnsi="Calibri" w:cs="Calibri"/>
+          <w:rFonts w:eastAsia="Calibri"/>
           <w:b/>
           <w:sz w:val="22"/>
         </w:rPr>
@@ -13424,49 +13336,1136 @@
     <w:p>
       <w:pPr>
         <w:pStyle w:val="Ttulo2"/>
+        <w:rPr>
+          <w:rFonts w:ascii="Times New Roman" w:hAnsi="Times New Roman" w:cs="Times New Roman"/>
+        </w:rPr>
+      </w:pPr>
+      <w:r>
+        <w:rPr>
+          <w:rFonts w:ascii="Times New Roman" w:hAnsi="Times New Roman" w:cs="Times New Roman"/>
+        </w:rPr>
+        <w:t>Diseño de Interfaces (UI/UX)</w:t>
+      </w:r>
+    </w:p>
+    <w:p>
+      <w:pPr>
+        <w:rPr>
+          <w:b/>
+          <w:bCs/>
+        </w:rPr>
+      </w:pPr>
+      <w:r>
+        <w:tab/>
+      </w:r>
+      <w:r>
+        <w:rPr>
+          <w:b/>
+          <w:bCs/>
+        </w:rPr>
+        <w:t>Módulo: Interfaz principal</w:t>
+      </w:r>
+    </w:p>
+    <w:p>
+      <w:r>
+        <w:t>Pantallas públicas que ve cualquier visitante.</w:t>
+      </w:r>
+    </w:p>
+    <w:p>
+      <w:r>
+        <w:rPr>
+          <w:b/>
+          <w:bCs/>
+        </w:rPr>
+        <w:t>Pantallas:</w:t>
+      </w:r>
+    </w:p>
+    <w:p>
+      <w:pPr>
+        <w:numPr>
+          <w:ilvl w:val="0"/>
+          <w:numId w:val="19"/>
+        </w:numPr>
+      </w:pPr>
+      <w:r>
+        <w:rPr>
+          <w:b/>
+          <w:bCs/>
+        </w:rPr>
+        <w:t>Inicio (Home)</w:t>
+      </w:r>
+      <w:r>
+        <w:t xml:space="preserve"> </w:t>
+      </w:r>
+    </w:p>
+    <w:p>
+      <w:pPr>
+        <w:numPr>
+          <w:ilvl w:val="1"/>
+          <w:numId w:val="19"/>
+        </w:numPr>
+      </w:pPr>
+      <w:r>
+        <w:t xml:space="preserve">Banner principal </w:t>
+      </w:r>
+    </w:p>
+    <w:p>
+      <w:pPr>
+        <w:numPr>
+          <w:ilvl w:val="1"/>
+          <w:numId w:val="19"/>
+        </w:numPr>
+      </w:pPr>
+      <w:r>
+        <w:t xml:space="preserve">Productos destacados </w:t>
+      </w:r>
+    </w:p>
+    <w:p>
+      <w:pPr>
+        <w:numPr>
+          <w:ilvl w:val="1"/>
+          <w:numId w:val="19"/>
+        </w:numPr>
+      </w:pPr>
+      <w:r>
+        <w:t xml:space="preserve">Acceso a menú </w:t>
+      </w:r>
+    </w:p>
+    <w:p>
+      <w:pPr>
+        <w:numPr>
+          <w:ilvl w:val="0"/>
+          <w:numId w:val="19"/>
+        </w:numPr>
+      </w:pPr>
+      <w:r>
+        <w:rPr>
+          <w:b/>
+          <w:bCs/>
+        </w:rPr>
+        <w:t>Acerca de Nosotros</w:t>
+      </w:r>
+      <w:r>
+        <w:t xml:space="preserve"> </w:t>
+      </w:r>
+    </w:p>
+    <w:p>
+      <w:pPr>
+        <w:numPr>
+          <w:ilvl w:val="1"/>
+          <w:numId w:val="19"/>
+        </w:numPr>
+      </w:pPr>
+      <w:r>
+        <w:t xml:space="preserve">Información del emprendimiento </w:t>
+      </w:r>
+    </w:p>
+    <w:p>
+      <w:pPr>
+        <w:numPr>
+          <w:ilvl w:val="0"/>
+          <w:numId w:val="19"/>
+        </w:numPr>
+      </w:pPr>
+      <w:r>
+        <w:rPr>
+          <w:b/>
+          <w:bCs/>
+        </w:rPr>
+        <w:t>Acerca de mí</w:t>
+      </w:r>
+      <w:r>
+        <w:t xml:space="preserve"> </w:t>
+      </w:r>
+    </w:p>
+    <w:p>
+      <w:pPr>
+        <w:numPr>
+          <w:ilvl w:val="1"/>
+          <w:numId w:val="19"/>
+        </w:numPr>
+      </w:pPr>
+      <w:r>
+        <w:t xml:space="preserve">Historia del negocio o de la dueña </w:t>
+      </w:r>
+    </w:p>
+    <w:p>
+      <w:pPr>
+        <w:numPr>
+          <w:ilvl w:val="0"/>
+          <w:numId w:val="19"/>
+        </w:numPr>
+      </w:pPr>
+      <w:r>
+        <w:rPr>
+          <w:b/>
+          <w:bCs/>
+        </w:rPr>
+        <w:t>Menú / Navegación</w:t>
+      </w:r>
+      <w:r>
+        <w:t xml:space="preserve"> </w:t>
+      </w:r>
+    </w:p>
+    <w:p>
+      <w:pPr>
+        <w:numPr>
+          <w:ilvl w:val="1"/>
+          <w:numId w:val="19"/>
+        </w:numPr>
+      </w:pPr>
+      <w:r>
+        <w:t xml:space="preserve">Acceso a: </w:t>
+      </w:r>
+    </w:p>
+    <w:p>
+      <w:pPr>
+        <w:numPr>
+          <w:ilvl w:val="2"/>
+          <w:numId w:val="19"/>
+        </w:numPr>
+      </w:pPr>
+      <w:r>
+        <w:t xml:space="preserve">Inicio </w:t>
+      </w:r>
+    </w:p>
+    <w:p>
+      <w:pPr>
+        <w:numPr>
+          <w:ilvl w:val="2"/>
+          <w:numId w:val="19"/>
+        </w:numPr>
+      </w:pPr>
+      <w:r>
+        <w:t xml:space="preserve">Productos </w:t>
+      </w:r>
+    </w:p>
+    <w:p>
+      <w:pPr>
+        <w:numPr>
+          <w:ilvl w:val="2"/>
+          <w:numId w:val="19"/>
+        </w:numPr>
+      </w:pPr>
+      <w:r>
+        <w:t xml:space="preserve">Contacto </w:t>
+      </w:r>
+    </w:p>
+    <w:p>
+      <w:pPr>
+        <w:numPr>
+          <w:ilvl w:val="2"/>
+          <w:numId w:val="19"/>
+        </w:numPr>
+      </w:pPr>
+      <w:r>
+        <w:t>Login</w:t>
+      </w:r>
+    </w:p>
+    <w:p>
+      <w:pPr>
+        <w:ind w:left="720" w:firstLine="0"/>
+      </w:pPr>
+    </w:p>
+    <w:p>
+      <w:pPr>
+        <w:ind w:left="720" w:firstLine="0"/>
+      </w:pPr>
+    </w:p>
+    <w:p>
+      <w:pPr>
+        <w:ind w:left="720" w:firstLine="0"/>
+      </w:pPr>
+    </w:p>
+    <w:p>
+      <w:pPr>
+        <w:ind w:left="720" w:firstLine="0"/>
+      </w:pPr>
+    </w:p>
+    <w:p>
+      <w:pPr>
+        <w:ind w:left="720" w:firstLine="0"/>
+      </w:pPr>
+    </w:p>
+    <w:p>
+      <w:pPr>
+        <w:ind w:left="720" w:firstLine="0"/>
+        <w:rPr>
+          <w:b/>
+          <w:bCs/>
+        </w:rPr>
+      </w:pPr>
+      <w:r>
+        <w:rPr>
+          <w:b/>
+          <w:bCs/>
+        </w:rPr>
+        <w:t>Módulo: Catálogo de productos</w:t>
+      </w:r>
+    </w:p>
+    <w:p>
+      <w:pPr>
+        <w:ind w:left="720" w:firstLine="0"/>
+      </w:pPr>
+      <w:r>
+        <w:rPr>
+          <w:b/>
+          <w:bCs/>
+        </w:rPr>
+        <w:t>Pantallas:</w:t>
+      </w:r>
+    </w:p>
+    <w:p>
+      <w:pPr>
+        <w:numPr>
+          <w:ilvl w:val="0"/>
+          <w:numId w:val="20"/>
+        </w:numPr>
+      </w:pPr>
+      <w:r>
+        <w:rPr>
+          <w:b/>
+          <w:bCs/>
+        </w:rPr>
+        <w:t>Lista de productos</w:t>
+      </w:r>
+      <w:r>
+        <w:t xml:space="preserve"> </w:t>
+      </w:r>
+    </w:p>
+    <w:p>
+      <w:pPr>
+        <w:numPr>
+          <w:ilvl w:val="1"/>
+          <w:numId w:val="20"/>
+        </w:numPr>
+      </w:pPr>
+      <w:r>
+        <w:t xml:space="preserve">Catálogo general </w:t>
+      </w:r>
+    </w:p>
+    <w:p>
+      <w:pPr>
+        <w:numPr>
+          <w:ilvl w:val="1"/>
+          <w:numId w:val="20"/>
+        </w:numPr>
+      </w:pPr>
+      <w:r>
+        <w:t xml:space="preserve">Filtros </w:t>
+      </w:r>
+    </w:p>
+    <w:p>
+      <w:pPr>
+        <w:numPr>
+          <w:ilvl w:val="1"/>
+          <w:numId w:val="20"/>
+        </w:numPr>
+      </w:pPr>
+      <w:r>
+        <w:t xml:space="preserve">Buscador </w:t>
+      </w:r>
+    </w:p>
+    <w:p>
+      <w:pPr>
+        <w:numPr>
+          <w:ilvl w:val="0"/>
+          <w:numId w:val="20"/>
+        </w:numPr>
+      </w:pPr>
+      <w:r>
+        <w:rPr>
+          <w:b/>
+          <w:bCs/>
+        </w:rPr>
+        <w:t>Detalle del producto</w:t>
+      </w:r>
+      <w:r>
+        <w:t xml:space="preserve"> </w:t>
+      </w:r>
+    </w:p>
+    <w:p>
+      <w:pPr>
+        <w:numPr>
+          <w:ilvl w:val="1"/>
+          <w:numId w:val="20"/>
+        </w:numPr>
+      </w:pPr>
+      <w:r>
+        <w:t xml:space="preserve">Imagen </w:t>
+      </w:r>
+    </w:p>
+    <w:p>
+      <w:pPr>
+        <w:numPr>
+          <w:ilvl w:val="1"/>
+          <w:numId w:val="20"/>
+        </w:numPr>
+      </w:pPr>
+      <w:r>
+        <w:t xml:space="preserve">Descripción </w:t>
+      </w:r>
+    </w:p>
+    <w:p>
+      <w:pPr>
+        <w:numPr>
+          <w:ilvl w:val="1"/>
+          <w:numId w:val="20"/>
+        </w:numPr>
+      </w:pPr>
+      <w:r>
+        <w:t xml:space="preserve">Precio </w:t>
+      </w:r>
+    </w:p>
+    <w:p>
+      <w:pPr>
+        <w:numPr>
+          <w:ilvl w:val="1"/>
+          <w:numId w:val="20"/>
+        </w:numPr>
+      </w:pPr>
+      <w:r>
+        <w:t xml:space="preserve">Botón agregar al carrito </w:t>
+      </w:r>
+    </w:p>
+    <w:p>
+      <w:pPr>
+        <w:numPr>
+          <w:ilvl w:val="1"/>
+          <w:numId w:val="20"/>
+        </w:numPr>
+      </w:pPr>
+      <w:r>
+        <w:t>Botón WhatsApp</w:t>
+      </w:r>
+    </w:p>
+    <w:p>
+      <w:pPr>
+        <w:ind w:left="720" w:firstLine="0"/>
+      </w:pPr>
+    </w:p>
+    <w:p>
+      <w:pPr>
+        <w:rPr>
+          <w:b/>
+          <w:bCs/>
+        </w:rPr>
+      </w:pPr>
+      <w:r>
+        <w:rPr>
+          <w:b/>
+          <w:bCs/>
+        </w:rPr>
+        <w:t>Módulo: Carrito y compras</w:t>
+      </w:r>
+    </w:p>
+    <w:p>
+      <w:pPr>
+        <w:ind w:left="720" w:firstLine="0"/>
+      </w:pPr>
+      <w:r>
+        <w:rPr>
+          <w:b/>
+          <w:bCs/>
+        </w:rPr>
+        <w:t>Pantallas:</w:t>
+      </w:r>
+    </w:p>
+    <w:p>
+      <w:pPr>
+        <w:numPr>
+          <w:ilvl w:val="0"/>
+          <w:numId w:val="21"/>
+        </w:numPr>
+      </w:pPr>
+      <w:r>
+        <w:rPr>
+          <w:b/>
+          <w:bCs/>
+        </w:rPr>
+        <w:t>Carrito de compras</w:t>
+      </w:r>
+      <w:r>
+        <w:t xml:space="preserve"> </w:t>
+      </w:r>
+    </w:p>
+    <w:p>
+      <w:pPr>
+        <w:numPr>
+          <w:ilvl w:val="1"/>
+          <w:numId w:val="21"/>
+        </w:numPr>
+      </w:pPr>
+      <w:r>
+        <w:t xml:space="preserve">Lista de productos </w:t>
+      </w:r>
+    </w:p>
+    <w:p>
+      <w:pPr>
+        <w:numPr>
+          <w:ilvl w:val="1"/>
+          <w:numId w:val="21"/>
+        </w:numPr>
+      </w:pPr>
+      <w:r>
+        <w:t xml:space="preserve">Cantidad </w:t>
+      </w:r>
+    </w:p>
+    <w:p>
+      <w:pPr>
+        <w:numPr>
+          <w:ilvl w:val="1"/>
+          <w:numId w:val="21"/>
+        </w:numPr>
+      </w:pPr>
+      <w:r>
+        <w:t xml:space="preserve">Eliminar producto </w:t>
+      </w:r>
+    </w:p>
+    <w:p>
+      <w:pPr>
+        <w:numPr>
+          <w:ilvl w:val="1"/>
+          <w:numId w:val="21"/>
+        </w:numPr>
+      </w:pPr>
+      <w:r>
+        <w:t xml:space="preserve">Total </w:t>
+      </w:r>
+    </w:p>
+    <w:p>
+      <w:pPr>
+        <w:numPr>
+          <w:ilvl w:val="0"/>
+          <w:numId w:val="21"/>
+        </w:numPr>
+      </w:pPr>
+      <w:r>
+        <w:rPr>
+          <w:b/>
+          <w:bCs/>
+        </w:rPr>
+        <w:t>Checkout / datos de compra</w:t>
+      </w:r>
+      <w:r>
+        <w:t xml:space="preserve"> </w:t>
+      </w:r>
+    </w:p>
+    <w:p>
+      <w:pPr>
+        <w:numPr>
+          <w:ilvl w:val="1"/>
+          <w:numId w:val="21"/>
+        </w:numPr>
       </w:pPr>
       <w:r>
         <w:lastRenderedPageBreak/>
-        <w:t>Diagramas de Flujo / Secuencia</w:t>
+        <w:t xml:space="preserve">Nombre </w:t>
+      </w:r>
+    </w:p>
+    <w:p>
+      <w:pPr>
+        <w:numPr>
+          <w:ilvl w:val="1"/>
+          <w:numId w:val="21"/>
+        </w:numPr>
+      </w:pPr>
+      <w:r>
+        <w:t xml:space="preserve">Dirección </w:t>
+      </w:r>
+    </w:p>
+    <w:p>
+      <w:pPr>
+        <w:numPr>
+          <w:ilvl w:val="1"/>
+          <w:numId w:val="21"/>
+        </w:numPr>
+      </w:pPr>
+      <w:r>
+        <w:t xml:space="preserve">Contacto </w:t>
+      </w:r>
+    </w:p>
+    <w:p>
+      <w:pPr>
+        <w:numPr>
+          <w:ilvl w:val="1"/>
+          <w:numId w:val="21"/>
+        </w:numPr>
+      </w:pPr>
+      <w:r>
+        <w:t xml:space="preserve">Método de pago </w:t>
+      </w:r>
+    </w:p>
+    <w:p>
+      <w:pPr>
+        <w:numPr>
+          <w:ilvl w:val="0"/>
+          <w:numId w:val="21"/>
+        </w:numPr>
+      </w:pPr>
+      <w:r>
+        <w:rPr>
+          <w:b/>
+          <w:bCs/>
+        </w:rPr>
+        <w:t>Confirmación de compra</w:t>
+      </w:r>
+      <w:r>
+        <w:t xml:space="preserve"> </w:t>
+      </w:r>
+    </w:p>
+    <w:p>
+      <w:pPr>
+        <w:numPr>
+          <w:ilvl w:val="1"/>
+          <w:numId w:val="21"/>
+        </w:numPr>
+      </w:pPr>
+      <w:r>
+        <w:t xml:space="preserve">Pedido realizado </w:t>
+      </w:r>
+    </w:p>
+    <w:p>
+      <w:pPr>
+        <w:numPr>
+          <w:ilvl w:val="1"/>
+          <w:numId w:val="21"/>
+        </w:numPr>
+      </w:pPr>
+      <w:r>
+        <w:t xml:space="preserve">Número de pedido </w:t>
+      </w:r>
+    </w:p>
+    <w:p>
+      <w:pPr>
+        <w:numPr>
+          <w:ilvl w:val="0"/>
+          <w:numId w:val="21"/>
+        </w:numPr>
+      </w:pPr>
+      <w:r>
+        <w:rPr>
+          <w:b/>
+          <w:bCs/>
+        </w:rPr>
+        <w:t>Estado del pedido</w:t>
+      </w:r>
+      <w:r>
+        <w:t xml:space="preserve"> </w:t>
+      </w:r>
+    </w:p>
+    <w:p>
+      <w:pPr>
+        <w:numPr>
+          <w:ilvl w:val="0"/>
+          <w:numId w:val="22"/>
+        </w:numPr>
+      </w:pPr>
+      <w:r>
+        <w:t xml:space="preserve">Pendiente </w:t>
+      </w:r>
+    </w:p>
+    <w:p>
+      <w:pPr>
+        <w:numPr>
+          <w:ilvl w:val="0"/>
+          <w:numId w:val="22"/>
+        </w:numPr>
+      </w:pPr>
+      <w:r>
+        <w:t xml:space="preserve">En proceso </w:t>
+      </w:r>
+    </w:p>
+    <w:p>
+      <w:pPr>
+        <w:numPr>
+          <w:ilvl w:val="0"/>
+          <w:numId w:val="22"/>
+        </w:numPr>
+      </w:pPr>
+      <w:r>
+        <w:t xml:space="preserve">Entregado </w:t>
+      </w:r>
+    </w:p>
+    <w:p>
+      <w:pPr>
+        <w:rPr>
+          <w:b/>
+          <w:bCs/>
+        </w:rPr>
+      </w:pPr>
+      <w:r>
+        <w:rPr>
+          <w:b/>
+          <w:bCs/>
+        </w:rPr>
+        <w:t>Módulo: Usuarios y autenticación</w:t>
+      </w:r>
+    </w:p>
+    <w:p>
+      <w:r>
+        <w:rPr>
+          <w:b/>
+          <w:bCs/>
+        </w:rPr>
+        <w:t>Pantallas:</w:t>
+      </w:r>
+    </w:p>
+    <w:p>
+      <w:pPr>
+        <w:numPr>
+          <w:ilvl w:val="0"/>
+          <w:numId w:val="23"/>
+        </w:numPr>
+      </w:pPr>
+      <w:r>
+        <w:rPr>
+          <w:b/>
+          <w:bCs/>
+        </w:rPr>
+        <w:t>Registro de usuario</w:t>
+      </w:r>
+      <w:r>
+        <w:t xml:space="preserve"> </w:t>
+      </w:r>
+    </w:p>
+    <w:p>
+      <w:pPr>
+        <w:numPr>
+          <w:ilvl w:val="0"/>
+          <w:numId w:val="23"/>
+        </w:numPr>
+      </w:pPr>
+      <w:r>
+        <w:rPr>
+          <w:b/>
+          <w:bCs/>
+        </w:rPr>
+        <w:t>Login</w:t>
+      </w:r>
+      <w:r>
+        <w:t xml:space="preserve"> </w:t>
+      </w:r>
+    </w:p>
+    <w:p>
+      <w:pPr>
+        <w:numPr>
+          <w:ilvl w:val="0"/>
+          <w:numId w:val="23"/>
+        </w:numPr>
+      </w:pPr>
+      <w:r>
+        <w:rPr>
+          <w:b/>
+          <w:bCs/>
+        </w:rPr>
+        <w:t>Recuperar contraseña</w:t>
+      </w:r>
+      <w:r>
+        <w:t xml:space="preserve"> </w:t>
+      </w:r>
+    </w:p>
+    <w:p>
+      <w:pPr>
+        <w:numPr>
+          <w:ilvl w:val="0"/>
+          <w:numId w:val="23"/>
+        </w:numPr>
+      </w:pPr>
+      <w:r>
+        <w:rPr>
+          <w:b/>
+          <w:bCs/>
+        </w:rPr>
+        <w:t>Cerrar sesión / perfil usuario</w:t>
+      </w:r>
+    </w:p>
+    <w:p>
+      <w:pPr>
+        <w:rPr>
+          <w:b/>
+          <w:bCs/>
+        </w:rPr>
+      </w:pPr>
+      <w:r>
+        <w:rPr>
+          <w:b/>
+          <w:bCs/>
+        </w:rPr>
+        <w:t>Módulo: Interacción con el cliente</w:t>
+      </w:r>
+    </w:p>
+    <w:p>
+      <w:r>
+        <w:rPr>
+          <w:b/>
+          <w:bCs/>
+        </w:rPr>
+        <w:t>Pantallas:</w:t>
+      </w:r>
+    </w:p>
+    <w:p>
+      <w:pPr>
+        <w:numPr>
+          <w:ilvl w:val="0"/>
+          <w:numId w:val="24"/>
+        </w:numPr>
+      </w:pPr>
+      <w:r>
+        <w:rPr>
+          <w:b/>
+          <w:bCs/>
+        </w:rPr>
+        <w:t>Enviar comentarios</w:t>
+      </w:r>
+      <w:r>
+        <w:t xml:space="preserve"> </w:t>
+      </w:r>
+    </w:p>
+    <w:p>
+      <w:pPr>
+        <w:numPr>
+          <w:ilvl w:val="0"/>
+          <w:numId w:val="24"/>
+        </w:numPr>
+      </w:pPr>
+      <w:r>
+        <w:rPr>
+          <w:b/>
+          <w:bCs/>
+        </w:rPr>
+        <w:t>Reportar errores</w:t>
+      </w:r>
+    </w:p>
+    <w:p/>
+    <w:p/>
+    <w:p/>
+    <w:p>
+      <w:pPr>
+        <w:rPr>
+          <w:b/>
+          <w:bCs/>
+        </w:rPr>
+      </w:pPr>
+      <w:r>
+        <w:rPr>
+          <w:b/>
+          <w:bCs/>
+        </w:rPr>
+        <w:t>Módulo: Panel administrativo</w:t>
+      </w:r>
+    </w:p>
+    <w:p>
+      <w:r>
+        <w:t>Solo para administrador.</w:t>
+      </w:r>
+    </w:p>
+    <w:p>
+      <w:r>
+        <w:rPr>
+          <w:b/>
+          <w:bCs/>
+        </w:rPr>
+        <w:t>Pantallas:</w:t>
+      </w:r>
+    </w:p>
+    <w:p>
+      <w:pPr>
+        <w:numPr>
+          <w:ilvl w:val="0"/>
+          <w:numId w:val="25"/>
+        </w:numPr>
+      </w:pPr>
+      <w:r>
+        <w:rPr>
+          <w:b/>
+          <w:bCs/>
+        </w:rPr>
+        <w:t>Dashboard administrador</w:t>
+      </w:r>
+      <w:r>
+        <w:t xml:space="preserve"> </w:t>
+      </w:r>
+    </w:p>
+    <w:p>
+      <w:pPr>
+        <w:numPr>
+          <w:ilvl w:val="0"/>
+          <w:numId w:val="25"/>
+        </w:numPr>
+      </w:pPr>
+      <w:r>
+        <w:rPr>
+          <w:b/>
+          <w:bCs/>
+        </w:rPr>
+        <w:t>Gestión de productos</w:t>
+      </w:r>
+      <w:r>
+        <w:t xml:space="preserve"> </w:t>
+      </w:r>
+    </w:p>
+    <w:p>
+      <w:pPr>
+        <w:numPr>
+          <w:ilvl w:val="0"/>
+          <w:numId w:val="26"/>
+        </w:numPr>
+      </w:pPr>
+      <w:r>
+        <w:t xml:space="preserve">Lista productos </w:t>
+      </w:r>
+    </w:p>
+    <w:p>
+      <w:pPr>
+        <w:numPr>
+          <w:ilvl w:val="0"/>
+          <w:numId w:val="26"/>
+        </w:numPr>
+      </w:pPr>
+      <w:r>
+        <w:t xml:space="preserve">Crear producto </w:t>
+      </w:r>
+    </w:p>
+    <w:p>
+      <w:pPr>
+        <w:numPr>
+          <w:ilvl w:val="0"/>
+          <w:numId w:val="26"/>
+        </w:numPr>
+      </w:pPr>
+      <w:r>
+        <w:t xml:space="preserve">Editar producto </w:t>
+      </w:r>
+    </w:p>
+    <w:p>
+      <w:pPr>
+        <w:numPr>
+          <w:ilvl w:val="0"/>
+          <w:numId w:val="26"/>
+        </w:numPr>
+      </w:pPr>
+      <w:r>
+        <w:t xml:space="preserve">Eliminar producto </w:t>
+      </w:r>
+    </w:p>
+    <w:p>
+      <w:pPr>
+        <w:numPr>
+          <w:ilvl w:val="0"/>
+          <w:numId w:val="27"/>
+        </w:numPr>
+      </w:pPr>
+      <w:r>
+        <w:rPr>
+          <w:b/>
+          <w:bCs/>
+        </w:rPr>
+        <w:t>Gestión de usuarios</w:t>
+      </w:r>
+      <w:r>
+        <w:t xml:space="preserve"> </w:t>
+      </w:r>
+    </w:p>
+    <w:p>
+      <w:pPr>
+        <w:numPr>
+          <w:ilvl w:val="0"/>
+          <w:numId w:val="28"/>
+        </w:numPr>
+      </w:pPr>
+      <w:r>
+        <w:t xml:space="preserve">Lista usuarios </w:t>
+      </w:r>
+    </w:p>
+    <w:p>
+      <w:pPr>
+        <w:numPr>
+          <w:ilvl w:val="0"/>
+          <w:numId w:val="28"/>
+        </w:numPr>
+      </w:pPr>
+      <w:r>
+        <w:t xml:space="preserve">Crear usuario </w:t>
+      </w:r>
+    </w:p>
+    <w:p>
+      <w:pPr>
+        <w:numPr>
+          <w:ilvl w:val="0"/>
+          <w:numId w:val="28"/>
+        </w:numPr>
+      </w:pPr>
+      <w:r>
+        <w:t xml:space="preserve">Editar usuario </w:t>
+      </w:r>
+    </w:p>
+    <w:p>
+      <w:pPr>
+        <w:numPr>
+          <w:ilvl w:val="0"/>
+          <w:numId w:val="28"/>
+        </w:numPr>
+      </w:pPr>
+      <w:r>
+        <w:t xml:space="preserve">Eliminar usuario </w:t>
+      </w:r>
+    </w:p>
+    <w:p>
+      <w:pPr>
+        <w:numPr>
+          <w:ilvl w:val="0"/>
+          <w:numId w:val="29"/>
+        </w:numPr>
+      </w:pPr>
+      <w:r>
+        <w:rPr>
+          <w:b/>
+          <w:bCs/>
+        </w:rPr>
+        <w:t>Inventario</w:t>
+      </w:r>
+      <w:r>
+        <w:t xml:space="preserve"> </w:t>
+      </w:r>
+    </w:p>
+    <w:p>
+      <w:pPr>
+        <w:numPr>
+          <w:ilvl w:val="0"/>
+          <w:numId w:val="30"/>
+        </w:numPr>
+      </w:pPr>
+      <w:r>
+        <w:t xml:space="preserve">Cantidad de productos </w:t>
+      </w:r>
+    </w:p>
+    <w:p>
+      <w:pPr>
+        <w:numPr>
+          <w:ilvl w:val="0"/>
+          <w:numId w:val="30"/>
+        </w:numPr>
+      </w:pPr>
+      <w:r>
+        <w:t xml:space="preserve">Alertas de stock </w:t>
+      </w:r>
+    </w:p>
+    <w:p>
+      <w:pPr>
+        <w:numPr>
+          <w:ilvl w:val="0"/>
+          <w:numId w:val="31"/>
+        </w:numPr>
+      </w:pPr>
+      <w:r>
+        <w:rPr>
+          <w:b/>
+          <w:bCs/>
+        </w:rPr>
+        <w:t>Reportes</w:t>
+      </w:r>
+      <w:r>
+        <w:t xml:space="preserve"> </w:t>
+      </w:r>
+    </w:p>
+    <w:p>
+      <w:pPr>
+        <w:numPr>
+          <w:ilvl w:val="0"/>
+          <w:numId w:val="32"/>
+        </w:numPr>
+      </w:pPr>
+      <w:r>
+        <w:t xml:space="preserve">Ventas </w:t>
+      </w:r>
+    </w:p>
+    <w:p>
+      <w:pPr>
+        <w:numPr>
+          <w:ilvl w:val="0"/>
+          <w:numId w:val="32"/>
+        </w:numPr>
+      </w:pPr>
+      <w:r>
+        <w:t>Productos más vendidos</w:t>
+      </w:r>
+    </w:p>
+    <w:p>
+      <w:pPr>
+        <w:numPr>
+          <w:ilvl w:val="0"/>
+          <w:numId w:val="32"/>
+        </w:numPr>
+      </w:pPr>
+      <w:r>
+        <w:t>Reporte de errores</w:t>
+      </w:r>
+    </w:p>
+    <w:p>
+      <w:pPr>
+        <w:numPr>
+          <w:ilvl w:val="0"/>
+          <w:numId w:val="32"/>
+        </w:numPr>
+      </w:pPr>
+      <w:r>
+        <w:t>Comentarios</w:t>
       </w:r>
     </w:p>
     <w:p>
       <w:pPr>
         <w:pStyle w:val="Ttulo2"/>
-      </w:pPr>
-      <w:r>
-        <w:t>Diseño de Interfaces (UI/UX)</w:t>
+        <w:rPr>
+          <w:rFonts w:ascii="Times New Roman" w:hAnsi="Times New Roman" w:cs="Times New Roman"/>
+        </w:rPr>
+      </w:pPr>
+      <w:r>
+        <w:rPr>
+          <w:rFonts w:ascii="Times New Roman" w:hAnsi="Times New Roman" w:cs="Times New Roman"/>
+        </w:rPr>
+        <w:lastRenderedPageBreak/>
+        <w:t>Plan de Pruebas</w:t>
       </w:r>
     </w:p>
     <w:p>
       <w:pPr>
         <w:pStyle w:val="Ttulo2"/>
-      </w:pPr>
-      <w:r>
-        <w:t>Plan de Pruebas</w:t>
+        <w:rPr>
+          <w:rFonts w:ascii="Times New Roman" w:hAnsi="Times New Roman" w:cs="Times New Roman"/>
+        </w:rPr>
+      </w:pPr>
+      <w:r>
+        <w:rPr>
+          <w:rFonts w:ascii="Times New Roman" w:hAnsi="Times New Roman" w:cs="Times New Roman"/>
+        </w:rPr>
+        <w:t>Especificación Técnica</w:t>
       </w:r>
     </w:p>
     <w:p>
       <w:pPr>
         <w:pStyle w:val="Ttulo2"/>
-      </w:pPr>
-      <w:r>
-        <w:t>Especificación Técnica</w:t>
+        <w:rPr>
+          <w:rFonts w:ascii="Times New Roman" w:hAnsi="Times New Roman" w:cs="Times New Roman"/>
+        </w:rPr>
+      </w:pPr>
+      <w:r>
+        <w:rPr>
+          <w:rFonts w:ascii="Times New Roman" w:hAnsi="Times New Roman" w:cs="Times New Roman"/>
+        </w:rPr>
+        <w:t>Manual de Usuario</w:t>
       </w:r>
     </w:p>
     <w:p>
       <w:pPr>
         <w:pStyle w:val="Ttulo2"/>
-      </w:pPr>
-      <w:r>
-        <w:t>Manual de Usuario</w:t>
-      </w:r>
-    </w:p>
-    <w:p>
-      <w:pPr>
-        <w:pStyle w:val="Ttulo2"/>
-      </w:pPr>
-      <w:r>
+        <w:rPr>
+          <w:rFonts w:ascii="Times New Roman" w:hAnsi="Times New Roman" w:cs="Times New Roman"/>
+        </w:rPr>
+      </w:pPr>
+      <w:r>
+        <w:rPr>
+          <w:rFonts w:ascii="Times New Roman" w:hAnsi="Times New Roman" w:cs="Times New Roman"/>
+        </w:rPr>
         <w:t>Conclusiones</w:t>
       </w:r>
     </w:p>
@@ -13482,6 +14481,349 @@
 <file path=word/numbering.xml><?xml version="1.0" encoding="utf-8"?>
 <w:numbering xmlns:wpc="http://schemas.microsoft.com/office/word/2010/wordprocessingCanvas" xmlns:cx="http://schemas.microsoft.com/office/drawing/2014/chartex" xmlns:cx1="http://schemas.microsoft.com/office/drawing/2015/9/8/chartex" xmlns:cx2="http://schemas.microsoft.com/office/drawing/2015/10/21/chartex" xmlns:cx3="http://schemas.microsoft.com/office/drawing/2016/5/9/chartex" xmlns:cx4="http://schemas.microsoft.com/office/drawing/2016/5/10/chartex" xmlns:cx5="http://schemas.microsoft.com/office/drawing/2016/5/11/chartex" xmlns:cx6="http://schemas.microsoft.com/office/drawing/2016/5/12/chartex" xmlns:cx7="http://schemas.microsoft.com/office/drawing/2016/5/13/chartex" xmlns:cx8="http://schemas.microsoft.com/office/drawing/2016/5/14/chartex" xmlns:mc="http://schemas.openxmlformats.org/markup-compatibility/2006" xmlns:aink="http://schemas.microsoft.com/office/drawing/2016/ink" xmlns:am3d="http://schemas.microsoft.com/office/drawing/2017/model3d" xmlns:o="urn:schemas-microsoft-com:office:office" xmlns:oel="http://schemas.microsoft.com/office/2019/extlst" xmlns:r="http://schemas.openxmlformats.org/officeDocument/2006/relationships" xmlns:m="http://schemas.openxmlformats.org/officeDocument/2006/math" xmlns:v="urn:schemas-microsoft-com:vml" xmlns:wp14="http://schemas.microsoft.com/office/word/2010/wordprocessingDrawing" xmlns:wp="http://schemas.openxmlformats.org/drawingml/2006/wordprocessingDrawing" xmlns:w10="urn:schemas-microsoft-com:office:word" xmlns:w="http://schemas.openxmlformats.org/wordprocessingml/2006/main" xmlns:w14="http://schemas.microsoft.com/office/word/2010/wordml" xmlns:w15="http://schemas.microsoft.com/office/word/2012/wordml" xmlns:w16cex="http://schemas.microsoft.com/office/word/2018/wordml/cex" xmlns:w16cid="http://schemas.microsoft.com/office/word/2016/wordml/cid" xmlns:w16="http://schemas.microsoft.com/office/word/2018/wordml" xmlns:w16du="http://schemas.microsoft.com/office/word/2023/wordml/word16du" xmlns:w16sdtdh="http://schemas.microsoft.com/office/word/2020/wordml/sdtdatahash" xmlns:w16sdtfl="http://schemas.microsoft.com/office/word/2024/wordml/sdtformatlock" xmlns:w16se="http://schemas.microsoft.com/office/word/2015/wordml/symex" xmlns:wpg="http://schemas.microsoft.com/office/word/2010/wordprocessingGroup" xmlns:wpi="http://schemas.microsoft.com/office/word/2010/wordprocessingInk" xmlns:wne="http://schemas.microsoft.com/office/word/2006/wordml" xmlns:wps="http://schemas.microsoft.com/office/word/2010/wordprocessingShape" mc:Ignorable="w14 w15 w16se w16cid w16 w16cex w16sdtdh w16sdtfl w16du wp14">
   <w:abstractNum w:abstractNumId="0" w15:restartNumberingAfterBreak="0">
+    <w:nsid w:val="001011F6"/>
+    <w:multiLevelType w:val="multilevel"/>
+    <w:tmpl w:val="8F5E79E8"/>
+    <w:lvl w:ilvl="0">
+      <w:start w:val="18"/>
+      <w:numFmt w:val="decimal"/>
+      <w:lvlText w:val="%1."/>
+      <w:lvlJc w:val="left"/>
+      <w:pPr>
+        <w:tabs>
+          <w:tab w:val="num" w:pos="720"/>
+        </w:tabs>
+        <w:ind w:left="720" w:hanging="360"/>
+      </w:pPr>
+    </w:lvl>
+    <w:lvl w:ilvl="1" w:tentative="1">
+      <w:start w:val="1"/>
+      <w:numFmt w:val="decimal"/>
+      <w:lvlText w:val="%2."/>
+      <w:lvlJc w:val="left"/>
+      <w:pPr>
+        <w:tabs>
+          <w:tab w:val="num" w:pos="1440"/>
+        </w:tabs>
+        <w:ind w:left="1440" w:hanging="360"/>
+      </w:pPr>
+    </w:lvl>
+    <w:lvl w:ilvl="2" w:tentative="1">
+      <w:start w:val="1"/>
+      <w:numFmt w:val="decimal"/>
+      <w:lvlText w:val="%3."/>
+      <w:lvlJc w:val="left"/>
+      <w:pPr>
+        <w:tabs>
+          <w:tab w:val="num" w:pos="2160"/>
+        </w:tabs>
+        <w:ind w:left="2160" w:hanging="360"/>
+      </w:pPr>
+    </w:lvl>
+    <w:lvl w:ilvl="3" w:tentative="1">
+      <w:start w:val="1"/>
+      <w:numFmt w:val="decimal"/>
+      <w:lvlText w:val="%4."/>
+      <w:lvlJc w:val="left"/>
+      <w:pPr>
+        <w:tabs>
+          <w:tab w:val="num" w:pos="2880"/>
+        </w:tabs>
+        <w:ind w:left="2880" w:hanging="360"/>
+      </w:pPr>
+    </w:lvl>
+    <w:lvl w:ilvl="4" w:tentative="1">
+      <w:start w:val="1"/>
+      <w:numFmt w:val="decimal"/>
+      <w:lvlText w:val="%5."/>
+      <w:lvlJc w:val="left"/>
+      <w:pPr>
+        <w:tabs>
+          <w:tab w:val="num" w:pos="3600"/>
+        </w:tabs>
+        <w:ind w:left="3600" w:hanging="360"/>
+      </w:pPr>
+    </w:lvl>
+    <w:lvl w:ilvl="5" w:tentative="1">
+      <w:start w:val="1"/>
+      <w:numFmt w:val="decimal"/>
+      <w:lvlText w:val="%6."/>
+      <w:lvlJc w:val="left"/>
+      <w:pPr>
+        <w:tabs>
+          <w:tab w:val="num" w:pos="4320"/>
+        </w:tabs>
+        <w:ind w:left="4320" w:hanging="360"/>
+      </w:pPr>
+    </w:lvl>
+    <w:lvl w:ilvl="6" w:tentative="1">
+      <w:start w:val="1"/>
+      <w:numFmt w:val="decimal"/>
+      <w:lvlText w:val="%7."/>
+      <w:lvlJc w:val="left"/>
+      <w:pPr>
+        <w:tabs>
+          <w:tab w:val="num" w:pos="5040"/>
+        </w:tabs>
+        <w:ind w:left="5040" w:hanging="360"/>
+      </w:pPr>
+    </w:lvl>
+    <w:lvl w:ilvl="7" w:tentative="1">
+      <w:start w:val="1"/>
+      <w:numFmt w:val="decimal"/>
+      <w:lvlText w:val="%8."/>
+      <w:lvlJc w:val="left"/>
+      <w:pPr>
+        <w:tabs>
+          <w:tab w:val="num" w:pos="5760"/>
+        </w:tabs>
+        <w:ind w:left="5760" w:hanging="360"/>
+      </w:pPr>
+    </w:lvl>
+    <w:lvl w:ilvl="8" w:tentative="1">
+      <w:start w:val="1"/>
+      <w:numFmt w:val="decimal"/>
+      <w:lvlText w:val="%9."/>
+      <w:lvlJc w:val="left"/>
+      <w:pPr>
+        <w:tabs>
+          <w:tab w:val="num" w:pos="6480"/>
+        </w:tabs>
+        <w:ind w:left="6480" w:hanging="360"/>
+      </w:pPr>
+    </w:lvl>
+  </w:abstractNum>
+  <w:abstractNum w:abstractNumId="1" w15:restartNumberingAfterBreak="0">
+    <w:nsid w:val="01334081"/>
+    <w:multiLevelType w:val="multilevel"/>
+    <w:tmpl w:val="8E50130E"/>
+    <w:lvl w:ilvl="0">
+      <w:start w:val="22"/>
+      <w:numFmt w:val="decimal"/>
+      <w:lvlText w:val="%1."/>
+      <w:lvlJc w:val="left"/>
+      <w:pPr>
+        <w:tabs>
+          <w:tab w:val="num" w:pos="720"/>
+        </w:tabs>
+        <w:ind w:left="720" w:hanging="360"/>
+      </w:pPr>
+    </w:lvl>
+    <w:lvl w:ilvl="1" w:tentative="1">
+      <w:start w:val="1"/>
+      <w:numFmt w:val="decimal"/>
+      <w:lvlText w:val="%2."/>
+      <w:lvlJc w:val="left"/>
+      <w:pPr>
+        <w:tabs>
+          <w:tab w:val="num" w:pos="1440"/>
+        </w:tabs>
+        <w:ind w:left="1440" w:hanging="360"/>
+      </w:pPr>
+    </w:lvl>
+    <w:lvl w:ilvl="2" w:tentative="1">
+      <w:start w:val="1"/>
+      <w:numFmt w:val="decimal"/>
+      <w:lvlText w:val="%3."/>
+      <w:lvlJc w:val="left"/>
+      <w:pPr>
+        <w:tabs>
+          <w:tab w:val="num" w:pos="2160"/>
+        </w:tabs>
+        <w:ind w:left="2160" w:hanging="360"/>
+      </w:pPr>
+    </w:lvl>
+    <w:lvl w:ilvl="3" w:tentative="1">
+      <w:start w:val="1"/>
+      <w:numFmt w:val="decimal"/>
+      <w:lvlText w:val="%4."/>
+      <w:lvlJc w:val="left"/>
+      <w:pPr>
+        <w:tabs>
+          <w:tab w:val="num" w:pos="2880"/>
+        </w:tabs>
+        <w:ind w:left="2880" w:hanging="360"/>
+      </w:pPr>
+    </w:lvl>
+    <w:lvl w:ilvl="4" w:tentative="1">
+      <w:start w:val="1"/>
+      <w:numFmt w:val="decimal"/>
+      <w:lvlText w:val="%5."/>
+      <w:lvlJc w:val="left"/>
+      <w:pPr>
+        <w:tabs>
+          <w:tab w:val="num" w:pos="3600"/>
+        </w:tabs>
+        <w:ind w:left="3600" w:hanging="360"/>
+      </w:pPr>
+    </w:lvl>
+    <w:lvl w:ilvl="5" w:tentative="1">
+      <w:start w:val="1"/>
+      <w:numFmt w:val="decimal"/>
+      <w:lvlText w:val="%6."/>
+      <w:lvlJc w:val="left"/>
+      <w:pPr>
+        <w:tabs>
+          <w:tab w:val="num" w:pos="4320"/>
+        </w:tabs>
+        <w:ind w:left="4320" w:hanging="360"/>
+      </w:pPr>
+    </w:lvl>
+    <w:lvl w:ilvl="6" w:tentative="1">
+      <w:start w:val="1"/>
+      <w:numFmt w:val="decimal"/>
+      <w:lvlText w:val="%7."/>
+      <w:lvlJc w:val="left"/>
+      <w:pPr>
+        <w:tabs>
+          <w:tab w:val="num" w:pos="5040"/>
+        </w:tabs>
+        <w:ind w:left="5040" w:hanging="360"/>
+      </w:pPr>
+    </w:lvl>
+    <w:lvl w:ilvl="7" w:tentative="1">
+      <w:start w:val="1"/>
+      <w:numFmt w:val="decimal"/>
+      <w:lvlText w:val="%8."/>
+      <w:lvlJc w:val="left"/>
+      <w:pPr>
+        <w:tabs>
+          <w:tab w:val="num" w:pos="5760"/>
+        </w:tabs>
+        <w:ind w:left="5760" w:hanging="360"/>
+      </w:pPr>
+    </w:lvl>
+    <w:lvl w:ilvl="8" w:tentative="1">
+      <w:start w:val="1"/>
+      <w:numFmt w:val="decimal"/>
+      <w:lvlText w:val="%9."/>
+      <w:lvlJc w:val="left"/>
+      <w:pPr>
+        <w:tabs>
+          <w:tab w:val="num" w:pos="6480"/>
+        </w:tabs>
+        <w:ind w:left="6480" w:hanging="360"/>
+      </w:pPr>
+    </w:lvl>
+  </w:abstractNum>
+  <w:abstractNum w:abstractNumId="2" w15:restartNumberingAfterBreak="0">
+    <w:nsid w:val="023D119C"/>
+    <w:multiLevelType w:val="multilevel"/>
+    <w:tmpl w:val="9F46A9F4"/>
+    <w:lvl w:ilvl="0">
+      <w:start w:val="7"/>
+      <w:numFmt w:val="decimal"/>
+      <w:lvlText w:val="%1."/>
+      <w:lvlJc w:val="left"/>
+      <w:pPr>
+        <w:tabs>
+          <w:tab w:val="num" w:pos="720"/>
+        </w:tabs>
+        <w:ind w:left="720" w:hanging="360"/>
+      </w:pPr>
+    </w:lvl>
+    <w:lvl w:ilvl="1">
+      <w:start w:val="1"/>
+      <w:numFmt w:val="bullet"/>
+      <w:lvlText w:val="o"/>
+      <w:lvlJc w:val="left"/>
+      <w:pPr>
+        <w:tabs>
+          <w:tab w:val="num" w:pos="1440"/>
+        </w:tabs>
+        <w:ind w:left="1440" w:hanging="360"/>
+      </w:pPr>
+      <w:rPr>
+        <w:rFonts w:ascii="Courier New" w:hAnsi="Courier New" w:hint="default"/>
+        <w:sz w:val="20"/>
+      </w:rPr>
+    </w:lvl>
+    <w:lvl w:ilvl="2" w:tentative="1">
+      <w:start w:val="1"/>
+      <w:numFmt w:val="decimal"/>
+      <w:lvlText w:val="%3."/>
+      <w:lvlJc w:val="left"/>
+      <w:pPr>
+        <w:tabs>
+          <w:tab w:val="num" w:pos="2160"/>
+        </w:tabs>
+        <w:ind w:left="2160" w:hanging="360"/>
+      </w:pPr>
+    </w:lvl>
+    <w:lvl w:ilvl="3" w:tentative="1">
+      <w:start w:val="1"/>
+      <w:numFmt w:val="decimal"/>
+      <w:lvlText w:val="%4."/>
+      <w:lvlJc w:val="left"/>
+      <w:pPr>
+        <w:tabs>
+          <w:tab w:val="num" w:pos="2880"/>
+        </w:tabs>
+        <w:ind w:left="2880" w:hanging="360"/>
+      </w:pPr>
+    </w:lvl>
+    <w:lvl w:ilvl="4" w:tentative="1">
+      <w:start w:val="1"/>
+      <w:numFmt w:val="decimal"/>
+      <w:lvlText w:val="%5."/>
+      <w:lvlJc w:val="left"/>
+      <w:pPr>
+        <w:tabs>
+          <w:tab w:val="num" w:pos="3600"/>
+        </w:tabs>
+        <w:ind w:left="3600" w:hanging="360"/>
+      </w:pPr>
+    </w:lvl>
+    <w:lvl w:ilvl="5" w:tentative="1">
+      <w:start w:val="1"/>
+      <w:numFmt w:val="decimal"/>
+      <w:lvlText w:val="%6."/>
+      <w:lvlJc w:val="left"/>
+      <w:pPr>
+        <w:tabs>
+          <w:tab w:val="num" w:pos="4320"/>
+        </w:tabs>
+        <w:ind w:left="4320" w:hanging="360"/>
+      </w:pPr>
+    </w:lvl>
+    <w:lvl w:ilvl="6" w:tentative="1">
+      <w:start w:val="1"/>
+      <w:numFmt w:val="decimal"/>
+      <w:lvlText w:val="%7."/>
+      <w:lvlJc w:val="left"/>
+      <w:pPr>
+        <w:tabs>
+          <w:tab w:val="num" w:pos="5040"/>
+        </w:tabs>
+        <w:ind w:left="5040" w:hanging="360"/>
+      </w:pPr>
+    </w:lvl>
+    <w:lvl w:ilvl="7" w:tentative="1">
+      <w:start w:val="1"/>
+      <w:numFmt w:val="decimal"/>
+      <w:lvlText w:val="%8."/>
+      <w:lvlJc w:val="left"/>
+      <w:pPr>
+        <w:tabs>
+          <w:tab w:val="num" w:pos="5760"/>
+        </w:tabs>
+        <w:ind w:left="5760" w:hanging="360"/>
+      </w:pPr>
+    </w:lvl>
+    <w:lvl w:ilvl="8" w:tentative="1">
+      <w:start w:val="1"/>
+      <w:numFmt w:val="decimal"/>
+      <w:lvlText w:val="%9."/>
+      <w:lvlJc w:val="left"/>
+      <w:pPr>
+        <w:tabs>
+          <w:tab w:val="num" w:pos="6480"/>
+        </w:tabs>
+        <w:ind w:left="6480" w:hanging="360"/>
+      </w:pPr>
+    </w:lvl>
+  </w:abstractNum>
+  <w:abstractNum w:abstractNumId="3" w15:restartNumberingAfterBreak="0">
     <w:nsid w:val="03F32A63"/>
     <w:multiLevelType w:val="hybridMultilevel"/>
     <w:tmpl w:val="BB100EB2"/>
@@ -13693,7 +15035,7 @@
       </w:rPr>
     </w:lvl>
   </w:abstractNum>
-  <w:abstractNum w:abstractNumId="1" w15:restartNumberingAfterBreak="0">
+  <w:abstractNum w:abstractNumId="4" w15:restartNumberingAfterBreak="0">
     <w:nsid w:val="07476CAB"/>
     <w:multiLevelType w:val="multilevel"/>
     <w:tmpl w:val="3DB6F800"/>
@@ -13842,7 +15184,156 @@
       </w:rPr>
     </w:lvl>
   </w:abstractNum>
-  <w:abstractNum w:abstractNumId="2" w15:restartNumberingAfterBreak="0">
+  <w:abstractNum w:abstractNumId="5" w15:restartNumberingAfterBreak="0">
+    <w:nsid w:val="09BD563C"/>
+    <w:multiLevelType w:val="multilevel"/>
+    <w:tmpl w:val="F14EDE1A"/>
+    <w:lvl w:ilvl="0">
+      <w:start w:val="1"/>
+      <w:numFmt w:val="bullet"/>
+      <w:lvlText w:val=""/>
+      <w:lvlJc w:val="left"/>
+      <w:pPr>
+        <w:tabs>
+          <w:tab w:val="num" w:pos="720"/>
+        </w:tabs>
+        <w:ind w:left="720" w:hanging="360"/>
+      </w:pPr>
+      <w:rPr>
+        <w:rFonts w:ascii="Symbol" w:hAnsi="Symbol" w:hint="default"/>
+        <w:sz w:val="20"/>
+      </w:rPr>
+    </w:lvl>
+    <w:lvl w:ilvl="1" w:tentative="1">
+      <w:start w:val="1"/>
+      <w:numFmt w:val="bullet"/>
+      <w:lvlText w:val="o"/>
+      <w:lvlJc w:val="left"/>
+      <w:pPr>
+        <w:tabs>
+          <w:tab w:val="num" w:pos="1440"/>
+        </w:tabs>
+        <w:ind w:left="1440" w:hanging="360"/>
+      </w:pPr>
+      <w:rPr>
+        <w:rFonts w:ascii="Courier New" w:hAnsi="Courier New" w:hint="default"/>
+        <w:sz w:val="20"/>
+      </w:rPr>
+    </w:lvl>
+    <w:lvl w:ilvl="2" w:tentative="1">
+      <w:start w:val="1"/>
+      <w:numFmt w:val="bullet"/>
+      <w:lvlText w:val=""/>
+      <w:lvlJc w:val="left"/>
+      <w:pPr>
+        <w:tabs>
+          <w:tab w:val="num" w:pos="2160"/>
+        </w:tabs>
+        <w:ind w:left="2160" w:hanging="360"/>
+      </w:pPr>
+      <w:rPr>
+        <w:rFonts w:ascii="Wingdings" w:hAnsi="Wingdings" w:hint="default"/>
+        <w:sz w:val="20"/>
+      </w:rPr>
+    </w:lvl>
+    <w:lvl w:ilvl="3" w:tentative="1">
+      <w:start w:val="1"/>
+      <w:numFmt w:val="bullet"/>
+      <w:lvlText w:val=""/>
+      <w:lvlJc w:val="left"/>
+      <w:pPr>
+        <w:tabs>
+          <w:tab w:val="num" w:pos="2880"/>
+        </w:tabs>
+        <w:ind w:left="2880" w:hanging="360"/>
+      </w:pPr>
+      <w:rPr>
+        <w:rFonts w:ascii="Wingdings" w:hAnsi="Wingdings" w:hint="default"/>
+        <w:sz w:val="20"/>
+      </w:rPr>
+    </w:lvl>
+    <w:lvl w:ilvl="4" w:tentative="1">
+      <w:start w:val="1"/>
+      <w:numFmt w:val="bullet"/>
+      <w:lvlText w:val=""/>
+      <w:lvlJc w:val="left"/>
+      <w:pPr>
+        <w:tabs>
+          <w:tab w:val="num" w:pos="3600"/>
+        </w:tabs>
+        <w:ind w:left="3600" w:hanging="360"/>
+      </w:pPr>
+      <w:rPr>
+        <w:rFonts w:ascii="Wingdings" w:hAnsi="Wingdings" w:hint="default"/>
+        <w:sz w:val="20"/>
+      </w:rPr>
+    </w:lvl>
+    <w:lvl w:ilvl="5" w:tentative="1">
+      <w:start w:val="1"/>
+      <w:numFmt w:val="bullet"/>
+      <w:lvlText w:val=""/>
+      <w:lvlJc w:val="left"/>
+      <w:pPr>
+        <w:tabs>
+          <w:tab w:val="num" w:pos="4320"/>
+        </w:tabs>
+        <w:ind w:left="4320" w:hanging="360"/>
+      </w:pPr>
+      <w:rPr>
+        <w:rFonts w:ascii="Wingdings" w:hAnsi="Wingdings" w:hint="default"/>
+        <w:sz w:val="20"/>
+      </w:rPr>
+    </w:lvl>
+    <w:lvl w:ilvl="6" w:tentative="1">
+      <w:start w:val="1"/>
+      <w:numFmt w:val="bullet"/>
+      <w:lvlText w:val=""/>
+      <w:lvlJc w:val="left"/>
+      <w:pPr>
+        <w:tabs>
+          <w:tab w:val="num" w:pos="5040"/>
+        </w:tabs>
+        <w:ind w:left="5040" w:hanging="360"/>
+      </w:pPr>
+      <w:rPr>
+        <w:rFonts w:ascii="Wingdings" w:hAnsi="Wingdings" w:hint="default"/>
+        <w:sz w:val="20"/>
+      </w:rPr>
+    </w:lvl>
+    <w:lvl w:ilvl="7" w:tentative="1">
+      <w:start w:val="1"/>
+      <w:numFmt w:val="bullet"/>
+      <w:lvlText w:val=""/>
+      <w:lvlJc w:val="left"/>
+      <w:pPr>
+        <w:tabs>
+          <w:tab w:val="num" w:pos="5760"/>
+        </w:tabs>
+        <w:ind w:left="5760" w:hanging="360"/>
+      </w:pPr>
+      <w:rPr>
+        <w:rFonts w:ascii="Wingdings" w:hAnsi="Wingdings" w:hint="default"/>
+        <w:sz w:val="20"/>
+      </w:rPr>
+    </w:lvl>
+    <w:lvl w:ilvl="8" w:tentative="1">
+      <w:start w:val="1"/>
+      <w:numFmt w:val="bullet"/>
+      <w:lvlText w:val=""/>
+      <w:lvlJc w:val="left"/>
+      <w:pPr>
+        <w:tabs>
+          <w:tab w:val="num" w:pos="6480"/>
+        </w:tabs>
+        <w:ind w:left="6480" w:hanging="360"/>
+      </w:pPr>
+      <w:rPr>
+        <w:rFonts w:ascii="Wingdings" w:hAnsi="Wingdings" w:hint="default"/>
+        <w:sz w:val="20"/>
+      </w:rPr>
+    </w:lvl>
+  </w:abstractNum>
+  <w:abstractNum w:abstractNumId="6" w15:restartNumberingAfterBreak="0">
     <w:nsid w:val="0B137B19"/>
     <w:multiLevelType w:val="hybridMultilevel"/>
     <w:tmpl w:val="5C80132A"/>
@@ -14054,7 +15545,237 @@
       </w:rPr>
     </w:lvl>
   </w:abstractNum>
-  <w:abstractNum w:abstractNumId="3" w15:restartNumberingAfterBreak="0">
+  <w:abstractNum w:abstractNumId="7" w15:restartNumberingAfterBreak="0">
+    <w:nsid w:val="0C2C1738"/>
+    <w:multiLevelType w:val="multilevel"/>
+    <w:tmpl w:val="F46680E0"/>
+    <w:lvl w:ilvl="0">
+      <w:start w:val="11"/>
+      <w:numFmt w:val="decimal"/>
+      <w:lvlText w:val="%1."/>
+      <w:lvlJc w:val="left"/>
+      <w:pPr>
+        <w:tabs>
+          <w:tab w:val="num" w:pos="720"/>
+        </w:tabs>
+        <w:ind w:left="720" w:hanging="360"/>
+      </w:pPr>
+    </w:lvl>
+    <w:lvl w:ilvl="1" w:tentative="1">
+      <w:start w:val="1"/>
+      <w:numFmt w:val="decimal"/>
+      <w:lvlText w:val="%2."/>
+      <w:lvlJc w:val="left"/>
+      <w:pPr>
+        <w:tabs>
+          <w:tab w:val="num" w:pos="1440"/>
+        </w:tabs>
+        <w:ind w:left="1440" w:hanging="360"/>
+      </w:pPr>
+    </w:lvl>
+    <w:lvl w:ilvl="2" w:tentative="1">
+      <w:start w:val="1"/>
+      <w:numFmt w:val="decimal"/>
+      <w:lvlText w:val="%3."/>
+      <w:lvlJc w:val="left"/>
+      <w:pPr>
+        <w:tabs>
+          <w:tab w:val="num" w:pos="2160"/>
+        </w:tabs>
+        <w:ind w:left="2160" w:hanging="360"/>
+      </w:pPr>
+    </w:lvl>
+    <w:lvl w:ilvl="3" w:tentative="1">
+      <w:start w:val="1"/>
+      <w:numFmt w:val="decimal"/>
+      <w:lvlText w:val="%4."/>
+      <w:lvlJc w:val="left"/>
+      <w:pPr>
+        <w:tabs>
+          <w:tab w:val="num" w:pos="2880"/>
+        </w:tabs>
+        <w:ind w:left="2880" w:hanging="360"/>
+      </w:pPr>
+    </w:lvl>
+    <w:lvl w:ilvl="4" w:tentative="1">
+      <w:start w:val="1"/>
+      <w:numFmt w:val="decimal"/>
+      <w:lvlText w:val="%5."/>
+      <w:lvlJc w:val="left"/>
+      <w:pPr>
+        <w:tabs>
+          <w:tab w:val="num" w:pos="3600"/>
+        </w:tabs>
+        <w:ind w:left="3600" w:hanging="360"/>
+      </w:pPr>
+    </w:lvl>
+    <w:lvl w:ilvl="5" w:tentative="1">
+      <w:start w:val="1"/>
+      <w:numFmt w:val="decimal"/>
+      <w:lvlText w:val="%6."/>
+      <w:lvlJc w:val="left"/>
+      <w:pPr>
+        <w:tabs>
+          <w:tab w:val="num" w:pos="4320"/>
+        </w:tabs>
+        <w:ind w:left="4320" w:hanging="360"/>
+      </w:pPr>
+    </w:lvl>
+    <w:lvl w:ilvl="6" w:tentative="1">
+      <w:start w:val="1"/>
+      <w:numFmt w:val="decimal"/>
+      <w:lvlText w:val="%7."/>
+      <w:lvlJc w:val="left"/>
+      <w:pPr>
+        <w:tabs>
+          <w:tab w:val="num" w:pos="5040"/>
+        </w:tabs>
+        <w:ind w:left="5040" w:hanging="360"/>
+      </w:pPr>
+    </w:lvl>
+    <w:lvl w:ilvl="7" w:tentative="1">
+      <w:start w:val="1"/>
+      <w:numFmt w:val="decimal"/>
+      <w:lvlText w:val="%8."/>
+      <w:lvlJc w:val="left"/>
+      <w:pPr>
+        <w:tabs>
+          <w:tab w:val="num" w:pos="5760"/>
+        </w:tabs>
+        <w:ind w:left="5760" w:hanging="360"/>
+      </w:pPr>
+    </w:lvl>
+    <w:lvl w:ilvl="8" w:tentative="1">
+      <w:start w:val="1"/>
+      <w:numFmt w:val="decimal"/>
+      <w:lvlText w:val="%9."/>
+      <w:lvlJc w:val="left"/>
+      <w:pPr>
+        <w:tabs>
+          <w:tab w:val="num" w:pos="6480"/>
+        </w:tabs>
+        <w:ind w:left="6480" w:hanging="360"/>
+      </w:pPr>
+    </w:lvl>
+  </w:abstractNum>
+  <w:abstractNum w:abstractNumId="8" w15:restartNumberingAfterBreak="0">
+    <w:nsid w:val="0F3A5BFB"/>
+    <w:multiLevelType w:val="multilevel"/>
+    <w:tmpl w:val="0658DF10"/>
+    <w:lvl w:ilvl="0">
+      <w:start w:val="5"/>
+      <w:numFmt w:val="decimal"/>
+      <w:lvlText w:val="%1."/>
+      <w:lvlJc w:val="left"/>
+      <w:pPr>
+        <w:tabs>
+          <w:tab w:val="num" w:pos="720"/>
+        </w:tabs>
+        <w:ind w:left="720" w:hanging="360"/>
+      </w:pPr>
+    </w:lvl>
+    <w:lvl w:ilvl="1">
+      <w:start w:val="1"/>
+      <w:numFmt w:val="bullet"/>
+      <w:lvlText w:val="o"/>
+      <w:lvlJc w:val="left"/>
+      <w:pPr>
+        <w:tabs>
+          <w:tab w:val="num" w:pos="1440"/>
+        </w:tabs>
+        <w:ind w:left="1440" w:hanging="360"/>
+      </w:pPr>
+      <w:rPr>
+        <w:rFonts w:ascii="Courier New" w:hAnsi="Courier New" w:hint="default"/>
+        <w:sz w:val="20"/>
+      </w:rPr>
+    </w:lvl>
+    <w:lvl w:ilvl="2" w:tentative="1">
+      <w:start w:val="1"/>
+      <w:numFmt w:val="decimal"/>
+      <w:lvlText w:val="%3."/>
+      <w:lvlJc w:val="left"/>
+      <w:pPr>
+        <w:tabs>
+          <w:tab w:val="num" w:pos="2160"/>
+        </w:tabs>
+        <w:ind w:left="2160" w:hanging="360"/>
+      </w:pPr>
+    </w:lvl>
+    <w:lvl w:ilvl="3" w:tentative="1">
+      <w:start w:val="1"/>
+      <w:numFmt w:val="decimal"/>
+      <w:lvlText w:val="%4."/>
+      <w:lvlJc w:val="left"/>
+      <w:pPr>
+        <w:tabs>
+          <w:tab w:val="num" w:pos="2880"/>
+        </w:tabs>
+        <w:ind w:left="2880" w:hanging="360"/>
+      </w:pPr>
+    </w:lvl>
+    <w:lvl w:ilvl="4" w:tentative="1">
+      <w:start w:val="1"/>
+      <w:numFmt w:val="decimal"/>
+      <w:lvlText w:val="%5."/>
+      <w:lvlJc w:val="left"/>
+      <w:pPr>
+        <w:tabs>
+          <w:tab w:val="num" w:pos="3600"/>
+        </w:tabs>
+        <w:ind w:left="3600" w:hanging="360"/>
+      </w:pPr>
+    </w:lvl>
+    <w:lvl w:ilvl="5" w:tentative="1">
+      <w:start w:val="1"/>
+      <w:numFmt w:val="decimal"/>
+      <w:lvlText w:val="%6."/>
+      <w:lvlJc w:val="left"/>
+      <w:pPr>
+        <w:tabs>
+          <w:tab w:val="num" w:pos="4320"/>
+        </w:tabs>
+        <w:ind w:left="4320" w:hanging="360"/>
+      </w:pPr>
+    </w:lvl>
+    <w:lvl w:ilvl="6" w:tentative="1">
+      <w:start w:val="1"/>
+      <w:numFmt w:val="decimal"/>
+      <w:lvlText w:val="%7."/>
+      <w:lvlJc w:val="left"/>
+      <w:pPr>
+        <w:tabs>
+          <w:tab w:val="num" w:pos="5040"/>
+        </w:tabs>
+        <w:ind w:left="5040" w:hanging="360"/>
+      </w:pPr>
+    </w:lvl>
+    <w:lvl w:ilvl="7" w:tentative="1">
+      <w:start w:val="1"/>
+      <w:numFmt w:val="decimal"/>
+      <w:lvlText w:val="%8."/>
+      <w:lvlJc w:val="left"/>
+      <w:pPr>
+        <w:tabs>
+          <w:tab w:val="num" w:pos="5760"/>
+        </w:tabs>
+        <w:ind w:left="5760" w:hanging="360"/>
+      </w:pPr>
+    </w:lvl>
+    <w:lvl w:ilvl="8" w:tentative="1">
+      <w:start w:val="1"/>
+      <w:numFmt w:val="decimal"/>
+      <w:lvlText w:val="%9."/>
+      <w:lvlJc w:val="left"/>
+      <w:pPr>
+        <w:tabs>
+          <w:tab w:val="num" w:pos="6480"/>
+        </w:tabs>
+        <w:ind w:left="6480" w:hanging="360"/>
+      </w:pPr>
+    </w:lvl>
+  </w:abstractNum>
+  <w:abstractNum w:abstractNumId="9" w15:restartNumberingAfterBreak="0">
     <w:nsid w:val="1031618B"/>
     <w:multiLevelType w:val="multilevel"/>
     <w:tmpl w:val="95BCE514"/>
@@ -14167,7 +15888,241 @@
       </w:pPr>
     </w:lvl>
   </w:abstractNum>
-  <w:abstractNum w:abstractNumId="4" w15:restartNumberingAfterBreak="0">
+  <w:abstractNum w:abstractNumId="10" w15:restartNumberingAfterBreak="0">
+    <w:nsid w:val="15551441"/>
+    <w:multiLevelType w:val="multilevel"/>
+    <w:tmpl w:val="4934CC72"/>
+    <w:lvl w:ilvl="0">
+      <w:start w:val="20"/>
+      <w:numFmt w:val="decimal"/>
+      <w:lvlText w:val="%1."/>
+      <w:lvlJc w:val="left"/>
+      <w:pPr>
+        <w:tabs>
+          <w:tab w:val="num" w:pos="720"/>
+        </w:tabs>
+        <w:ind w:left="720" w:hanging="360"/>
+      </w:pPr>
+    </w:lvl>
+    <w:lvl w:ilvl="1" w:tentative="1">
+      <w:start w:val="1"/>
+      <w:numFmt w:val="decimal"/>
+      <w:lvlText w:val="%2."/>
+      <w:lvlJc w:val="left"/>
+      <w:pPr>
+        <w:tabs>
+          <w:tab w:val="num" w:pos="1440"/>
+        </w:tabs>
+        <w:ind w:left="1440" w:hanging="360"/>
+      </w:pPr>
+    </w:lvl>
+    <w:lvl w:ilvl="2" w:tentative="1">
+      <w:start w:val="1"/>
+      <w:numFmt w:val="decimal"/>
+      <w:lvlText w:val="%3."/>
+      <w:lvlJc w:val="left"/>
+      <w:pPr>
+        <w:tabs>
+          <w:tab w:val="num" w:pos="2160"/>
+        </w:tabs>
+        <w:ind w:left="2160" w:hanging="360"/>
+      </w:pPr>
+    </w:lvl>
+    <w:lvl w:ilvl="3" w:tentative="1">
+      <w:start w:val="1"/>
+      <w:numFmt w:val="decimal"/>
+      <w:lvlText w:val="%4."/>
+      <w:lvlJc w:val="left"/>
+      <w:pPr>
+        <w:tabs>
+          <w:tab w:val="num" w:pos="2880"/>
+        </w:tabs>
+        <w:ind w:left="2880" w:hanging="360"/>
+      </w:pPr>
+    </w:lvl>
+    <w:lvl w:ilvl="4" w:tentative="1">
+      <w:start w:val="1"/>
+      <w:numFmt w:val="decimal"/>
+      <w:lvlText w:val="%5."/>
+      <w:lvlJc w:val="left"/>
+      <w:pPr>
+        <w:tabs>
+          <w:tab w:val="num" w:pos="3600"/>
+        </w:tabs>
+        <w:ind w:left="3600" w:hanging="360"/>
+      </w:pPr>
+    </w:lvl>
+    <w:lvl w:ilvl="5" w:tentative="1">
+      <w:start w:val="1"/>
+      <w:numFmt w:val="decimal"/>
+      <w:lvlText w:val="%6."/>
+      <w:lvlJc w:val="left"/>
+      <w:pPr>
+        <w:tabs>
+          <w:tab w:val="num" w:pos="4320"/>
+        </w:tabs>
+        <w:ind w:left="4320" w:hanging="360"/>
+      </w:pPr>
+    </w:lvl>
+    <w:lvl w:ilvl="6" w:tentative="1">
+      <w:start w:val="1"/>
+      <w:numFmt w:val="decimal"/>
+      <w:lvlText w:val="%7."/>
+      <w:lvlJc w:val="left"/>
+      <w:pPr>
+        <w:tabs>
+          <w:tab w:val="num" w:pos="5040"/>
+        </w:tabs>
+        <w:ind w:left="5040" w:hanging="360"/>
+      </w:pPr>
+    </w:lvl>
+    <w:lvl w:ilvl="7" w:tentative="1">
+      <w:start w:val="1"/>
+      <w:numFmt w:val="decimal"/>
+      <w:lvlText w:val="%8."/>
+      <w:lvlJc w:val="left"/>
+      <w:pPr>
+        <w:tabs>
+          <w:tab w:val="num" w:pos="5760"/>
+        </w:tabs>
+        <w:ind w:left="5760" w:hanging="360"/>
+      </w:pPr>
+    </w:lvl>
+    <w:lvl w:ilvl="8" w:tentative="1">
+      <w:start w:val="1"/>
+      <w:numFmt w:val="decimal"/>
+      <w:lvlText w:val="%9."/>
+      <w:lvlJc w:val="left"/>
+      <w:pPr>
+        <w:tabs>
+          <w:tab w:val="num" w:pos="6480"/>
+        </w:tabs>
+        <w:ind w:left="6480" w:hanging="360"/>
+      </w:pPr>
+    </w:lvl>
+  </w:abstractNum>
+  <w:abstractNum w:abstractNumId="11" w15:restartNumberingAfterBreak="0">
+    <w:nsid w:val="164B01D1"/>
+    <w:multiLevelType w:val="multilevel"/>
+    <w:tmpl w:val="CB609584"/>
+    <w:lvl w:ilvl="0">
+      <w:start w:val="1"/>
+      <w:numFmt w:val="decimal"/>
+      <w:lvlText w:val="%1."/>
+      <w:lvlJc w:val="left"/>
+      <w:pPr>
+        <w:tabs>
+          <w:tab w:val="num" w:pos="720"/>
+        </w:tabs>
+        <w:ind w:left="720" w:hanging="360"/>
+      </w:pPr>
+    </w:lvl>
+    <w:lvl w:ilvl="1">
+      <w:start w:val="1"/>
+      <w:numFmt w:val="bullet"/>
+      <w:lvlText w:val="o"/>
+      <w:lvlJc w:val="left"/>
+      <w:pPr>
+        <w:tabs>
+          <w:tab w:val="num" w:pos="1440"/>
+        </w:tabs>
+        <w:ind w:left="1440" w:hanging="360"/>
+      </w:pPr>
+      <w:rPr>
+        <w:rFonts w:ascii="Courier New" w:hAnsi="Courier New" w:hint="default"/>
+        <w:sz w:val="20"/>
+      </w:rPr>
+    </w:lvl>
+    <w:lvl w:ilvl="2">
+      <w:start w:val="1"/>
+      <w:numFmt w:val="bullet"/>
+      <w:lvlText w:val=""/>
+      <w:lvlJc w:val="left"/>
+      <w:pPr>
+        <w:tabs>
+          <w:tab w:val="num" w:pos="2160"/>
+        </w:tabs>
+        <w:ind w:left="2160" w:hanging="360"/>
+      </w:pPr>
+      <w:rPr>
+        <w:rFonts w:ascii="Wingdings" w:hAnsi="Wingdings" w:hint="default"/>
+        <w:sz w:val="20"/>
+      </w:rPr>
+    </w:lvl>
+    <w:lvl w:ilvl="3" w:tentative="1">
+      <w:start w:val="1"/>
+      <w:numFmt w:val="decimal"/>
+      <w:lvlText w:val="%4."/>
+      <w:lvlJc w:val="left"/>
+      <w:pPr>
+        <w:tabs>
+          <w:tab w:val="num" w:pos="2880"/>
+        </w:tabs>
+        <w:ind w:left="2880" w:hanging="360"/>
+      </w:pPr>
+    </w:lvl>
+    <w:lvl w:ilvl="4" w:tentative="1">
+      <w:start w:val="1"/>
+      <w:numFmt w:val="decimal"/>
+      <w:lvlText w:val="%5."/>
+      <w:lvlJc w:val="left"/>
+      <w:pPr>
+        <w:tabs>
+          <w:tab w:val="num" w:pos="3600"/>
+        </w:tabs>
+        <w:ind w:left="3600" w:hanging="360"/>
+      </w:pPr>
+    </w:lvl>
+    <w:lvl w:ilvl="5" w:tentative="1">
+      <w:start w:val="1"/>
+      <w:numFmt w:val="decimal"/>
+      <w:lvlText w:val="%6."/>
+      <w:lvlJc w:val="left"/>
+      <w:pPr>
+        <w:tabs>
+          <w:tab w:val="num" w:pos="4320"/>
+        </w:tabs>
+        <w:ind w:left="4320" w:hanging="360"/>
+      </w:pPr>
+    </w:lvl>
+    <w:lvl w:ilvl="6" w:tentative="1">
+      <w:start w:val="1"/>
+      <w:numFmt w:val="decimal"/>
+      <w:lvlText w:val="%7."/>
+      <w:lvlJc w:val="left"/>
+      <w:pPr>
+        <w:tabs>
+          <w:tab w:val="num" w:pos="5040"/>
+        </w:tabs>
+        <w:ind w:left="5040" w:hanging="360"/>
+      </w:pPr>
+    </w:lvl>
+    <w:lvl w:ilvl="7" w:tentative="1">
+      <w:start w:val="1"/>
+      <w:numFmt w:val="decimal"/>
+      <w:lvlText w:val="%8."/>
+      <w:lvlJc w:val="left"/>
+      <w:pPr>
+        <w:tabs>
+          <w:tab w:val="num" w:pos="5760"/>
+        </w:tabs>
+        <w:ind w:left="5760" w:hanging="360"/>
+      </w:pPr>
+    </w:lvl>
+    <w:lvl w:ilvl="8" w:tentative="1">
+      <w:start w:val="1"/>
+      <w:numFmt w:val="decimal"/>
+      <w:lvlText w:val="%9."/>
+      <w:lvlJc w:val="left"/>
+      <w:pPr>
+        <w:tabs>
+          <w:tab w:val="num" w:pos="6480"/>
+        </w:tabs>
+        <w:ind w:left="6480" w:hanging="360"/>
+      </w:pPr>
+    </w:lvl>
+  </w:abstractNum>
+  <w:abstractNum w:abstractNumId="12" w15:restartNumberingAfterBreak="0">
     <w:nsid w:val="227400E8"/>
     <w:multiLevelType w:val="multilevel"/>
     <w:tmpl w:val="02688A7A"/>
@@ -14316,7 +16271,7 @@
       </w:rPr>
     </w:lvl>
   </w:abstractNum>
-  <w:abstractNum w:abstractNumId="5" w15:restartNumberingAfterBreak="0">
+  <w:abstractNum w:abstractNumId="13" w15:restartNumberingAfterBreak="0">
     <w:nsid w:val="26444577"/>
     <w:multiLevelType w:val="multilevel"/>
     <w:tmpl w:val="6F884C3C"/>
@@ -14465,7 +16420,7 @@
       </w:rPr>
     </w:lvl>
   </w:abstractNum>
-  <w:abstractNum w:abstractNumId="6" w15:restartNumberingAfterBreak="0">
+  <w:abstractNum w:abstractNumId="14" w15:restartNumberingAfterBreak="0">
     <w:nsid w:val="275101A2"/>
     <w:multiLevelType w:val="multilevel"/>
     <w:tmpl w:val="BCF80D00"/>
@@ -14614,7 +16569,120 @@
       </w:rPr>
     </w:lvl>
   </w:abstractNum>
-  <w:abstractNum w:abstractNumId="7" w15:restartNumberingAfterBreak="0">
+  <w:abstractNum w:abstractNumId="15" w15:restartNumberingAfterBreak="0">
+    <w:nsid w:val="309E5B60"/>
+    <w:multiLevelType w:val="multilevel"/>
+    <w:tmpl w:val="9738CF14"/>
+    <w:lvl w:ilvl="0">
+      <w:start w:val="21"/>
+      <w:numFmt w:val="decimal"/>
+      <w:lvlText w:val="%1."/>
+      <w:lvlJc w:val="left"/>
+      <w:pPr>
+        <w:tabs>
+          <w:tab w:val="num" w:pos="720"/>
+        </w:tabs>
+        <w:ind w:left="720" w:hanging="360"/>
+      </w:pPr>
+    </w:lvl>
+    <w:lvl w:ilvl="1" w:tentative="1">
+      <w:start w:val="1"/>
+      <w:numFmt w:val="decimal"/>
+      <w:lvlText w:val="%2."/>
+      <w:lvlJc w:val="left"/>
+      <w:pPr>
+        <w:tabs>
+          <w:tab w:val="num" w:pos="1440"/>
+        </w:tabs>
+        <w:ind w:left="1440" w:hanging="360"/>
+      </w:pPr>
+    </w:lvl>
+    <w:lvl w:ilvl="2" w:tentative="1">
+      <w:start w:val="1"/>
+      <w:numFmt w:val="decimal"/>
+      <w:lvlText w:val="%3."/>
+      <w:lvlJc w:val="left"/>
+      <w:pPr>
+        <w:tabs>
+          <w:tab w:val="num" w:pos="2160"/>
+        </w:tabs>
+        <w:ind w:left="2160" w:hanging="360"/>
+      </w:pPr>
+    </w:lvl>
+    <w:lvl w:ilvl="3" w:tentative="1">
+      <w:start w:val="1"/>
+      <w:numFmt w:val="decimal"/>
+      <w:lvlText w:val="%4."/>
+      <w:lvlJc w:val="left"/>
+      <w:pPr>
+        <w:tabs>
+          <w:tab w:val="num" w:pos="2880"/>
+        </w:tabs>
+        <w:ind w:left="2880" w:hanging="360"/>
+      </w:pPr>
+    </w:lvl>
+    <w:lvl w:ilvl="4" w:tentative="1">
+      <w:start w:val="1"/>
+      <w:numFmt w:val="decimal"/>
+      <w:lvlText w:val="%5."/>
+      <w:lvlJc w:val="left"/>
+      <w:pPr>
+        <w:tabs>
+          <w:tab w:val="num" w:pos="3600"/>
+        </w:tabs>
+        <w:ind w:left="3600" w:hanging="360"/>
+      </w:pPr>
+    </w:lvl>
+    <w:lvl w:ilvl="5" w:tentative="1">
+      <w:start w:val="1"/>
+      <w:numFmt w:val="decimal"/>
+      <w:lvlText w:val="%6."/>
+      <w:lvlJc w:val="left"/>
+      <w:pPr>
+        <w:tabs>
+          <w:tab w:val="num" w:pos="4320"/>
+        </w:tabs>
+        <w:ind w:left="4320" w:hanging="360"/>
+      </w:pPr>
+    </w:lvl>
+    <w:lvl w:ilvl="6" w:tentative="1">
+      <w:start w:val="1"/>
+      <w:numFmt w:val="decimal"/>
+      <w:lvlText w:val="%7."/>
+      <w:lvlJc w:val="left"/>
+      <w:pPr>
+        <w:tabs>
+          <w:tab w:val="num" w:pos="5040"/>
+        </w:tabs>
+        <w:ind w:left="5040" w:hanging="360"/>
+      </w:pPr>
+    </w:lvl>
+    <w:lvl w:ilvl="7" w:tentative="1">
+      <w:start w:val="1"/>
+      <w:numFmt w:val="decimal"/>
+      <w:lvlText w:val="%8."/>
+      <w:lvlJc w:val="left"/>
+      <w:pPr>
+        <w:tabs>
+          <w:tab w:val="num" w:pos="5760"/>
+        </w:tabs>
+        <w:ind w:left="5760" w:hanging="360"/>
+      </w:pPr>
+    </w:lvl>
+    <w:lvl w:ilvl="8" w:tentative="1">
+      <w:start w:val="1"/>
+      <w:numFmt w:val="decimal"/>
+      <w:lvlText w:val="%9."/>
+      <w:lvlJc w:val="left"/>
+      <w:pPr>
+        <w:tabs>
+          <w:tab w:val="num" w:pos="6480"/>
+        </w:tabs>
+        <w:ind w:left="6480" w:hanging="360"/>
+      </w:pPr>
+    </w:lvl>
+  </w:abstractNum>
+  <w:abstractNum w:abstractNumId="16" w15:restartNumberingAfterBreak="0">
     <w:nsid w:val="369702EC"/>
     <w:multiLevelType w:val="hybridMultilevel"/>
     <w:tmpl w:val="40D222E6"/>
@@ -14826,7 +16894,7 @@
       </w:rPr>
     </w:lvl>
   </w:abstractNum>
-  <w:abstractNum w:abstractNumId="8" w15:restartNumberingAfterBreak="0">
+  <w:abstractNum w:abstractNumId="17" w15:restartNumberingAfterBreak="0">
     <w:nsid w:val="388D41E8"/>
     <w:multiLevelType w:val="multilevel"/>
     <w:tmpl w:val="354861A0"/>
@@ -14975,7 +17043,7 @@
       </w:rPr>
     </w:lvl>
   </w:abstractNum>
-  <w:abstractNum w:abstractNumId="9" w15:restartNumberingAfterBreak="0">
+  <w:abstractNum w:abstractNumId="18" w15:restartNumberingAfterBreak="0">
     <w:nsid w:val="39320470"/>
     <w:multiLevelType w:val="multilevel"/>
     <w:tmpl w:val="E91ECF00"/>
@@ -15124,7 +17192,7 @@
       </w:rPr>
     </w:lvl>
   </w:abstractNum>
-  <w:abstractNum w:abstractNumId="10" w15:restartNumberingAfterBreak="0">
+  <w:abstractNum w:abstractNumId="19" w15:restartNumberingAfterBreak="0">
     <w:nsid w:val="3E7E1C38"/>
     <w:multiLevelType w:val="multilevel"/>
     <w:tmpl w:val="87C28890"/>
@@ -15273,7 +17341,7 @@
       </w:rPr>
     </w:lvl>
   </w:abstractNum>
-  <w:abstractNum w:abstractNumId="11" w15:restartNumberingAfterBreak="0">
+  <w:abstractNum w:abstractNumId="20" w15:restartNumberingAfterBreak="0">
     <w:nsid w:val="403324E3"/>
     <w:multiLevelType w:val="multilevel"/>
     <w:tmpl w:val="B3262BD6"/>
@@ -15422,7 +17490,7 @@
       </w:rPr>
     </w:lvl>
   </w:abstractNum>
-  <w:abstractNum w:abstractNumId="12" w15:restartNumberingAfterBreak="0">
+  <w:abstractNum w:abstractNumId="21" w15:restartNumberingAfterBreak="0">
     <w:nsid w:val="46C82CFD"/>
     <w:multiLevelType w:val="multilevel"/>
     <w:tmpl w:val="3B626B1C"/>
@@ -15571,7 +17639,7 @@
       </w:rPr>
     </w:lvl>
   </w:abstractNum>
-  <w:abstractNum w:abstractNumId="13" w15:restartNumberingAfterBreak="0">
+  <w:abstractNum w:abstractNumId="22" w15:restartNumberingAfterBreak="0">
     <w:nsid w:val="473D28AA"/>
     <w:multiLevelType w:val="hybridMultilevel"/>
     <w:tmpl w:val="7FC8C128"/>
@@ -15783,7 +17851,156 @@
       </w:rPr>
     </w:lvl>
   </w:abstractNum>
-  <w:abstractNum w:abstractNumId="14" w15:restartNumberingAfterBreak="0">
+  <w:abstractNum w:abstractNumId="23" w15:restartNumberingAfterBreak="0">
+    <w:nsid w:val="54882C28"/>
+    <w:multiLevelType w:val="multilevel"/>
+    <w:tmpl w:val="715405B8"/>
+    <w:lvl w:ilvl="0">
+      <w:start w:val="1"/>
+      <w:numFmt w:val="bullet"/>
+      <w:lvlText w:val=""/>
+      <w:lvlJc w:val="left"/>
+      <w:pPr>
+        <w:tabs>
+          <w:tab w:val="num" w:pos="720"/>
+        </w:tabs>
+        <w:ind w:left="720" w:hanging="360"/>
+      </w:pPr>
+      <w:rPr>
+        <w:rFonts w:ascii="Symbol" w:hAnsi="Symbol" w:hint="default"/>
+        <w:sz w:val="20"/>
+      </w:rPr>
+    </w:lvl>
+    <w:lvl w:ilvl="1" w:tentative="1">
+      <w:start w:val="1"/>
+      <w:numFmt w:val="bullet"/>
+      <w:lvlText w:val="o"/>
+      <w:lvlJc w:val="left"/>
+      <w:pPr>
+        <w:tabs>
+          <w:tab w:val="num" w:pos="1440"/>
+        </w:tabs>
+        <w:ind w:left="1440" w:hanging="360"/>
+      </w:pPr>
+      <w:rPr>
+        <w:rFonts w:ascii="Courier New" w:hAnsi="Courier New" w:hint="default"/>
+        <w:sz w:val="20"/>
+      </w:rPr>
+    </w:lvl>
+    <w:lvl w:ilvl="2" w:tentative="1">
+      <w:start w:val="1"/>
+      <w:numFmt w:val="bullet"/>
+      <w:lvlText w:val=""/>
+      <w:lvlJc w:val="left"/>
+      <w:pPr>
+        <w:tabs>
+          <w:tab w:val="num" w:pos="2160"/>
+        </w:tabs>
+        <w:ind w:left="2160" w:hanging="360"/>
+      </w:pPr>
+      <w:rPr>
+        <w:rFonts w:ascii="Wingdings" w:hAnsi="Wingdings" w:hint="default"/>
+        <w:sz w:val="20"/>
+      </w:rPr>
+    </w:lvl>
+    <w:lvl w:ilvl="3" w:tentative="1">
+      <w:start w:val="1"/>
+      <w:numFmt w:val="bullet"/>
+      <w:lvlText w:val=""/>
+      <w:lvlJc w:val="left"/>
+      <w:pPr>
+        <w:tabs>
+          <w:tab w:val="num" w:pos="2880"/>
+        </w:tabs>
+        <w:ind w:left="2880" w:hanging="360"/>
+      </w:pPr>
+      <w:rPr>
+        <w:rFonts w:ascii="Wingdings" w:hAnsi="Wingdings" w:hint="default"/>
+        <w:sz w:val="20"/>
+      </w:rPr>
+    </w:lvl>
+    <w:lvl w:ilvl="4" w:tentative="1">
+      <w:start w:val="1"/>
+      <w:numFmt w:val="bullet"/>
+      <w:lvlText w:val=""/>
+      <w:lvlJc w:val="left"/>
+      <w:pPr>
+        <w:tabs>
+          <w:tab w:val="num" w:pos="3600"/>
+        </w:tabs>
+        <w:ind w:left="3600" w:hanging="360"/>
+      </w:pPr>
+      <w:rPr>
+        <w:rFonts w:ascii="Wingdings" w:hAnsi="Wingdings" w:hint="default"/>
+        <w:sz w:val="20"/>
+      </w:rPr>
+    </w:lvl>
+    <w:lvl w:ilvl="5" w:tentative="1">
+      <w:start w:val="1"/>
+      <w:numFmt w:val="bullet"/>
+      <w:lvlText w:val=""/>
+      <w:lvlJc w:val="left"/>
+      <w:pPr>
+        <w:tabs>
+          <w:tab w:val="num" w:pos="4320"/>
+        </w:tabs>
+        <w:ind w:left="4320" w:hanging="360"/>
+      </w:pPr>
+      <w:rPr>
+        <w:rFonts w:ascii="Wingdings" w:hAnsi="Wingdings" w:hint="default"/>
+        <w:sz w:val="20"/>
+      </w:rPr>
+    </w:lvl>
+    <w:lvl w:ilvl="6" w:tentative="1">
+      <w:start w:val="1"/>
+      <w:numFmt w:val="bullet"/>
+      <w:lvlText w:val=""/>
+      <w:lvlJc w:val="left"/>
+      <w:pPr>
+        <w:tabs>
+          <w:tab w:val="num" w:pos="5040"/>
+        </w:tabs>
+        <w:ind w:left="5040" w:hanging="360"/>
+      </w:pPr>
+      <w:rPr>
+        <w:rFonts w:ascii="Wingdings" w:hAnsi="Wingdings" w:hint="default"/>
+        <w:sz w:val="20"/>
+      </w:rPr>
+    </w:lvl>
+    <w:lvl w:ilvl="7" w:tentative="1">
+      <w:start w:val="1"/>
+      <w:numFmt w:val="bullet"/>
+      <w:lvlText w:val=""/>
+      <w:lvlJc w:val="left"/>
+      <w:pPr>
+        <w:tabs>
+          <w:tab w:val="num" w:pos="5760"/>
+        </w:tabs>
+        <w:ind w:left="5760" w:hanging="360"/>
+      </w:pPr>
+      <w:rPr>
+        <w:rFonts w:ascii="Wingdings" w:hAnsi="Wingdings" w:hint="default"/>
+        <w:sz w:val="20"/>
+      </w:rPr>
+    </w:lvl>
+    <w:lvl w:ilvl="8" w:tentative="1">
+      <w:start w:val="1"/>
+      <w:numFmt w:val="bullet"/>
+      <w:lvlText w:val=""/>
+      <w:lvlJc w:val="left"/>
+      <w:pPr>
+        <w:tabs>
+          <w:tab w:val="num" w:pos="6480"/>
+        </w:tabs>
+        <w:ind w:left="6480" w:hanging="360"/>
+      </w:pPr>
+      <w:rPr>
+        <w:rFonts w:ascii="Wingdings" w:hAnsi="Wingdings" w:hint="default"/>
+        <w:sz w:val="20"/>
+      </w:rPr>
+    </w:lvl>
+  </w:abstractNum>
+  <w:abstractNum w:abstractNumId="24" w15:restartNumberingAfterBreak="0">
     <w:nsid w:val="564A0A00"/>
     <w:multiLevelType w:val="multilevel"/>
     <w:tmpl w:val="9E604092"/>
@@ -15932,7 +18149,7 @@
       </w:rPr>
     </w:lvl>
   </w:abstractNum>
-  <w:abstractNum w:abstractNumId="15" w15:restartNumberingAfterBreak="0">
+  <w:abstractNum w:abstractNumId="25" w15:restartNumberingAfterBreak="0">
     <w:nsid w:val="56C8718B"/>
     <w:multiLevelType w:val="multilevel"/>
     <w:tmpl w:val="71809B36"/>
@@ -16081,7 +18298,454 @@
       </w:rPr>
     </w:lvl>
   </w:abstractNum>
-  <w:abstractNum w:abstractNumId="16" w15:restartNumberingAfterBreak="0">
+  <w:abstractNum w:abstractNumId="26" w15:restartNumberingAfterBreak="0">
+    <w:nsid w:val="57B212FF"/>
+    <w:multiLevelType w:val="multilevel"/>
+    <w:tmpl w:val="ED50C6B2"/>
+    <w:lvl w:ilvl="0">
+      <w:start w:val="1"/>
+      <w:numFmt w:val="bullet"/>
+      <w:lvlText w:val=""/>
+      <w:lvlJc w:val="left"/>
+      <w:pPr>
+        <w:tabs>
+          <w:tab w:val="num" w:pos="720"/>
+        </w:tabs>
+        <w:ind w:left="720" w:hanging="360"/>
+      </w:pPr>
+      <w:rPr>
+        <w:rFonts w:ascii="Symbol" w:hAnsi="Symbol" w:hint="default"/>
+        <w:sz w:val="20"/>
+      </w:rPr>
+    </w:lvl>
+    <w:lvl w:ilvl="1" w:tentative="1">
+      <w:start w:val="1"/>
+      <w:numFmt w:val="bullet"/>
+      <w:lvlText w:val="o"/>
+      <w:lvlJc w:val="left"/>
+      <w:pPr>
+        <w:tabs>
+          <w:tab w:val="num" w:pos="1440"/>
+        </w:tabs>
+        <w:ind w:left="1440" w:hanging="360"/>
+      </w:pPr>
+      <w:rPr>
+        <w:rFonts w:ascii="Courier New" w:hAnsi="Courier New" w:hint="default"/>
+        <w:sz w:val="20"/>
+      </w:rPr>
+    </w:lvl>
+    <w:lvl w:ilvl="2" w:tentative="1">
+      <w:start w:val="1"/>
+      <w:numFmt w:val="bullet"/>
+      <w:lvlText w:val=""/>
+      <w:lvlJc w:val="left"/>
+      <w:pPr>
+        <w:tabs>
+          <w:tab w:val="num" w:pos="2160"/>
+        </w:tabs>
+        <w:ind w:left="2160" w:hanging="360"/>
+      </w:pPr>
+      <w:rPr>
+        <w:rFonts w:ascii="Wingdings" w:hAnsi="Wingdings" w:hint="default"/>
+        <w:sz w:val="20"/>
+      </w:rPr>
+    </w:lvl>
+    <w:lvl w:ilvl="3" w:tentative="1">
+      <w:start w:val="1"/>
+      <w:numFmt w:val="bullet"/>
+      <w:lvlText w:val=""/>
+      <w:lvlJc w:val="left"/>
+      <w:pPr>
+        <w:tabs>
+          <w:tab w:val="num" w:pos="2880"/>
+        </w:tabs>
+        <w:ind w:left="2880" w:hanging="360"/>
+      </w:pPr>
+      <w:rPr>
+        <w:rFonts w:ascii="Wingdings" w:hAnsi="Wingdings" w:hint="default"/>
+        <w:sz w:val="20"/>
+      </w:rPr>
+    </w:lvl>
+    <w:lvl w:ilvl="4" w:tentative="1">
+      <w:start w:val="1"/>
+      <w:numFmt w:val="bullet"/>
+      <w:lvlText w:val=""/>
+      <w:lvlJc w:val="left"/>
+      <w:pPr>
+        <w:tabs>
+          <w:tab w:val="num" w:pos="3600"/>
+        </w:tabs>
+        <w:ind w:left="3600" w:hanging="360"/>
+      </w:pPr>
+      <w:rPr>
+        <w:rFonts w:ascii="Wingdings" w:hAnsi="Wingdings" w:hint="default"/>
+        <w:sz w:val="20"/>
+      </w:rPr>
+    </w:lvl>
+    <w:lvl w:ilvl="5" w:tentative="1">
+      <w:start w:val="1"/>
+      <w:numFmt w:val="bullet"/>
+      <w:lvlText w:val=""/>
+      <w:lvlJc w:val="left"/>
+      <w:pPr>
+        <w:tabs>
+          <w:tab w:val="num" w:pos="4320"/>
+        </w:tabs>
+        <w:ind w:left="4320" w:hanging="360"/>
+      </w:pPr>
+      <w:rPr>
+        <w:rFonts w:ascii="Wingdings" w:hAnsi="Wingdings" w:hint="default"/>
+        <w:sz w:val="20"/>
+      </w:rPr>
+    </w:lvl>
+    <w:lvl w:ilvl="6" w:tentative="1">
+      <w:start w:val="1"/>
+      <w:numFmt w:val="bullet"/>
+      <w:lvlText w:val=""/>
+      <w:lvlJc w:val="left"/>
+      <w:pPr>
+        <w:tabs>
+          <w:tab w:val="num" w:pos="5040"/>
+        </w:tabs>
+        <w:ind w:left="5040" w:hanging="360"/>
+      </w:pPr>
+      <w:rPr>
+        <w:rFonts w:ascii="Wingdings" w:hAnsi="Wingdings" w:hint="default"/>
+        <w:sz w:val="20"/>
+      </w:rPr>
+    </w:lvl>
+    <w:lvl w:ilvl="7" w:tentative="1">
+      <w:start w:val="1"/>
+      <w:numFmt w:val="bullet"/>
+      <w:lvlText w:val=""/>
+      <w:lvlJc w:val="left"/>
+      <w:pPr>
+        <w:tabs>
+          <w:tab w:val="num" w:pos="5760"/>
+        </w:tabs>
+        <w:ind w:left="5760" w:hanging="360"/>
+      </w:pPr>
+      <w:rPr>
+        <w:rFonts w:ascii="Wingdings" w:hAnsi="Wingdings" w:hint="default"/>
+        <w:sz w:val="20"/>
+      </w:rPr>
+    </w:lvl>
+    <w:lvl w:ilvl="8" w:tentative="1">
+      <w:start w:val="1"/>
+      <w:numFmt w:val="bullet"/>
+      <w:lvlText w:val=""/>
+      <w:lvlJc w:val="left"/>
+      <w:pPr>
+        <w:tabs>
+          <w:tab w:val="num" w:pos="6480"/>
+        </w:tabs>
+        <w:ind w:left="6480" w:hanging="360"/>
+      </w:pPr>
+      <w:rPr>
+        <w:rFonts w:ascii="Wingdings" w:hAnsi="Wingdings" w:hint="default"/>
+        <w:sz w:val="20"/>
+      </w:rPr>
+    </w:lvl>
+  </w:abstractNum>
+  <w:abstractNum w:abstractNumId="27" w15:restartNumberingAfterBreak="0">
+    <w:nsid w:val="598916DE"/>
+    <w:multiLevelType w:val="multilevel"/>
+    <w:tmpl w:val="E2B02E18"/>
+    <w:lvl w:ilvl="0">
+      <w:start w:val="1"/>
+      <w:numFmt w:val="bullet"/>
+      <w:lvlText w:val=""/>
+      <w:lvlJc w:val="left"/>
+      <w:pPr>
+        <w:tabs>
+          <w:tab w:val="num" w:pos="720"/>
+        </w:tabs>
+        <w:ind w:left="720" w:hanging="360"/>
+      </w:pPr>
+      <w:rPr>
+        <w:rFonts w:ascii="Symbol" w:hAnsi="Symbol" w:hint="default"/>
+        <w:sz w:val="20"/>
+      </w:rPr>
+    </w:lvl>
+    <w:lvl w:ilvl="1" w:tentative="1">
+      <w:start w:val="1"/>
+      <w:numFmt w:val="bullet"/>
+      <w:lvlText w:val="o"/>
+      <w:lvlJc w:val="left"/>
+      <w:pPr>
+        <w:tabs>
+          <w:tab w:val="num" w:pos="1440"/>
+        </w:tabs>
+        <w:ind w:left="1440" w:hanging="360"/>
+      </w:pPr>
+      <w:rPr>
+        <w:rFonts w:ascii="Courier New" w:hAnsi="Courier New" w:hint="default"/>
+        <w:sz w:val="20"/>
+      </w:rPr>
+    </w:lvl>
+    <w:lvl w:ilvl="2" w:tentative="1">
+      <w:start w:val="1"/>
+      <w:numFmt w:val="bullet"/>
+      <w:lvlText w:val=""/>
+      <w:lvlJc w:val="left"/>
+      <w:pPr>
+        <w:tabs>
+          <w:tab w:val="num" w:pos="2160"/>
+        </w:tabs>
+        <w:ind w:left="2160" w:hanging="360"/>
+      </w:pPr>
+      <w:rPr>
+        <w:rFonts w:ascii="Wingdings" w:hAnsi="Wingdings" w:hint="default"/>
+        <w:sz w:val="20"/>
+      </w:rPr>
+    </w:lvl>
+    <w:lvl w:ilvl="3" w:tentative="1">
+      <w:start w:val="1"/>
+      <w:numFmt w:val="bullet"/>
+      <w:lvlText w:val=""/>
+      <w:lvlJc w:val="left"/>
+      <w:pPr>
+        <w:tabs>
+          <w:tab w:val="num" w:pos="2880"/>
+        </w:tabs>
+        <w:ind w:left="2880" w:hanging="360"/>
+      </w:pPr>
+      <w:rPr>
+        <w:rFonts w:ascii="Wingdings" w:hAnsi="Wingdings" w:hint="default"/>
+        <w:sz w:val="20"/>
+      </w:rPr>
+    </w:lvl>
+    <w:lvl w:ilvl="4" w:tentative="1">
+      <w:start w:val="1"/>
+      <w:numFmt w:val="bullet"/>
+      <w:lvlText w:val=""/>
+      <w:lvlJc w:val="left"/>
+      <w:pPr>
+        <w:tabs>
+          <w:tab w:val="num" w:pos="3600"/>
+        </w:tabs>
+        <w:ind w:left="3600" w:hanging="360"/>
+      </w:pPr>
+      <w:rPr>
+        <w:rFonts w:ascii="Wingdings" w:hAnsi="Wingdings" w:hint="default"/>
+        <w:sz w:val="20"/>
+      </w:rPr>
+    </w:lvl>
+    <w:lvl w:ilvl="5" w:tentative="1">
+      <w:start w:val="1"/>
+      <w:numFmt w:val="bullet"/>
+      <w:lvlText w:val=""/>
+      <w:lvlJc w:val="left"/>
+      <w:pPr>
+        <w:tabs>
+          <w:tab w:val="num" w:pos="4320"/>
+        </w:tabs>
+        <w:ind w:left="4320" w:hanging="360"/>
+      </w:pPr>
+      <w:rPr>
+        <w:rFonts w:ascii="Wingdings" w:hAnsi="Wingdings" w:hint="default"/>
+        <w:sz w:val="20"/>
+      </w:rPr>
+    </w:lvl>
+    <w:lvl w:ilvl="6" w:tentative="1">
+      <w:start w:val="1"/>
+      <w:numFmt w:val="bullet"/>
+      <w:lvlText w:val=""/>
+      <w:lvlJc w:val="left"/>
+      <w:pPr>
+        <w:tabs>
+          <w:tab w:val="num" w:pos="5040"/>
+        </w:tabs>
+        <w:ind w:left="5040" w:hanging="360"/>
+      </w:pPr>
+      <w:rPr>
+        <w:rFonts w:ascii="Wingdings" w:hAnsi="Wingdings" w:hint="default"/>
+        <w:sz w:val="20"/>
+      </w:rPr>
+    </w:lvl>
+    <w:lvl w:ilvl="7" w:tentative="1">
+      <w:start w:val="1"/>
+      <w:numFmt w:val="bullet"/>
+      <w:lvlText w:val=""/>
+      <w:lvlJc w:val="left"/>
+      <w:pPr>
+        <w:tabs>
+          <w:tab w:val="num" w:pos="5760"/>
+        </w:tabs>
+        <w:ind w:left="5760" w:hanging="360"/>
+      </w:pPr>
+      <w:rPr>
+        <w:rFonts w:ascii="Wingdings" w:hAnsi="Wingdings" w:hint="default"/>
+        <w:sz w:val="20"/>
+      </w:rPr>
+    </w:lvl>
+    <w:lvl w:ilvl="8" w:tentative="1">
+      <w:start w:val="1"/>
+      <w:numFmt w:val="bullet"/>
+      <w:lvlText w:val=""/>
+      <w:lvlJc w:val="left"/>
+      <w:pPr>
+        <w:tabs>
+          <w:tab w:val="num" w:pos="6480"/>
+        </w:tabs>
+        <w:ind w:left="6480" w:hanging="360"/>
+      </w:pPr>
+      <w:rPr>
+        <w:rFonts w:ascii="Wingdings" w:hAnsi="Wingdings" w:hint="default"/>
+        <w:sz w:val="20"/>
+      </w:rPr>
+    </w:lvl>
+  </w:abstractNum>
+  <w:abstractNum w:abstractNumId="28" w15:restartNumberingAfterBreak="0">
+    <w:nsid w:val="5AE95756"/>
+    <w:multiLevelType w:val="multilevel"/>
+    <w:tmpl w:val="8FAE98DE"/>
+    <w:lvl w:ilvl="0">
+      <w:start w:val="1"/>
+      <w:numFmt w:val="bullet"/>
+      <w:lvlText w:val=""/>
+      <w:lvlJc w:val="left"/>
+      <w:pPr>
+        <w:tabs>
+          <w:tab w:val="num" w:pos="720"/>
+        </w:tabs>
+        <w:ind w:left="720" w:hanging="360"/>
+      </w:pPr>
+      <w:rPr>
+        <w:rFonts w:ascii="Symbol" w:hAnsi="Symbol" w:hint="default"/>
+        <w:sz w:val="20"/>
+      </w:rPr>
+    </w:lvl>
+    <w:lvl w:ilvl="1" w:tentative="1">
+      <w:start w:val="1"/>
+      <w:numFmt w:val="bullet"/>
+      <w:lvlText w:val="o"/>
+      <w:lvlJc w:val="left"/>
+      <w:pPr>
+        <w:tabs>
+          <w:tab w:val="num" w:pos="1440"/>
+        </w:tabs>
+        <w:ind w:left="1440" w:hanging="360"/>
+      </w:pPr>
+      <w:rPr>
+        <w:rFonts w:ascii="Courier New" w:hAnsi="Courier New" w:hint="default"/>
+        <w:sz w:val="20"/>
+      </w:rPr>
+    </w:lvl>
+    <w:lvl w:ilvl="2" w:tentative="1">
+      <w:start w:val="1"/>
+      <w:numFmt w:val="bullet"/>
+      <w:lvlText w:val=""/>
+      <w:lvlJc w:val="left"/>
+      <w:pPr>
+        <w:tabs>
+          <w:tab w:val="num" w:pos="2160"/>
+        </w:tabs>
+        <w:ind w:left="2160" w:hanging="360"/>
+      </w:pPr>
+      <w:rPr>
+        <w:rFonts w:ascii="Wingdings" w:hAnsi="Wingdings" w:hint="default"/>
+        <w:sz w:val="20"/>
+      </w:rPr>
+    </w:lvl>
+    <w:lvl w:ilvl="3" w:tentative="1">
+      <w:start w:val="1"/>
+      <w:numFmt w:val="bullet"/>
+      <w:lvlText w:val=""/>
+      <w:lvlJc w:val="left"/>
+      <w:pPr>
+        <w:tabs>
+          <w:tab w:val="num" w:pos="2880"/>
+        </w:tabs>
+        <w:ind w:left="2880" w:hanging="360"/>
+      </w:pPr>
+      <w:rPr>
+        <w:rFonts w:ascii="Wingdings" w:hAnsi="Wingdings" w:hint="default"/>
+        <w:sz w:val="20"/>
+      </w:rPr>
+    </w:lvl>
+    <w:lvl w:ilvl="4" w:tentative="1">
+      <w:start w:val="1"/>
+      <w:numFmt w:val="bullet"/>
+      <w:lvlText w:val=""/>
+      <w:lvlJc w:val="left"/>
+      <w:pPr>
+        <w:tabs>
+          <w:tab w:val="num" w:pos="3600"/>
+        </w:tabs>
+        <w:ind w:left="3600" w:hanging="360"/>
+      </w:pPr>
+      <w:rPr>
+        <w:rFonts w:ascii="Wingdings" w:hAnsi="Wingdings" w:hint="default"/>
+        <w:sz w:val="20"/>
+      </w:rPr>
+    </w:lvl>
+    <w:lvl w:ilvl="5" w:tentative="1">
+      <w:start w:val="1"/>
+      <w:numFmt w:val="bullet"/>
+      <w:lvlText w:val=""/>
+      <w:lvlJc w:val="left"/>
+      <w:pPr>
+        <w:tabs>
+          <w:tab w:val="num" w:pos="4320"/>
+        </w:tabs>
+        <w:ind w:left="4320" w:hanging="360"/>
+      </w:pPr>
+      <w:rPr>
+        <w:rFonts w:ascii="Wingdings" w:hAnsi="Wingdings" w:hint="default"/>
+        <w:sz w:val="20"/>
+      </w:rPr>
+    </w:lvl>
+    <w:lvl w:ilvl="6" w:tentative="1">
+      <w:start w:val="1"/>
+      <w:numFmt w:val="bullet"/>
+      <w:lvlText w:val=""/>
+      <w:lvlJc w:val="left"/>
+      <w:pPr>
+        <w:tabs>
+          <w:tab w:val="num" w:pos="5040"/>
+        </w:tabs>
+        <w:ind w:left="5040" w:hanging="360"/>
+      </w:pPr>
+      <w:rPr>
+        <w:rFonts w:ascii="Wingdings" w:hAnsi="Wingdings" w:hint="default"/>
+        <w:sz w:val="20"/>
+      </w:rPr>
+    </w:lvl>
+    <w:lvl w:ilvl="7" w:tentative="1">
+      <w:start w:val="1"/>
+      <w:numFmt w:val="bullet"/>
+      <w:lvlText w:val=""/>
+      <w:lvlJc w:val="left"/>
+      <w:pPr>
+        <w:tabs>
+          <w:tab w:val="num" w:pos="5760"/>
+        </w:tabs>
+        <w:ind w:left="5760" w:hanging="360"/>
+      </w:pPr>
+      <w:rPr>
+        <w:rFonts w:ascii="Wingdings" w:hAnsi="Wingdings" w:hint="default"/>
+        <w:sz w:val="20"/>
+      </w:rPr>
+    </w:lvl>
+    <w:lvl w:ilvl="8" w:tentative="1">
+      <w:start w:val="1"/>
+      <w:numFmt w:val="bullet"/>
+      <w:lvlText w:val=""/>
+      <w:lvlJc w:val="left"/>
+      <w:pPr>
+        <w:tabs>
+          <w:tab w:val="num" w:pos="6480"/>
+        </w:tabs>
+        <w:ind w:left="6480" w:hanging="360"/>
+      </w:pPr>
+      <w:rPr>
+        <w:rFonts w:ascii="Wingdings" w:hAnsi="Wingdings" w:hint="default"/>
+        <w:sz w:val="20"/>
+      </w:rPr>
+    </w:lvl>
+  </w:abstractNum>
+  <w:abstractNum w:abstractNumId="29" w15:restartNumberingAfterBreak="0">
     <w:nsid w:val="5C782CA4"/>
     <w:multiLevelType w:val="hybridMultilevel"/>
     <w:tmpl w:val="76C4A7BA"/>
@@ -16293,7 +18957,7 @@
       </w:rPr>
     </w:lvl>
   </w:abstractNum>
-  <w:abstractNum w:abstractNumId="17" w15:restartNumberingAfterBreak="0">
+  <w:abstractNum w:abstractNumId="30" w15:restartNumberingAfterBreak="0">
     <w:nsid w:val="5D1B1603"/>
     <w:multiLevelType w:val="hybridMultilevel"/>
     <w:tmpl w:val="581A3A5C"/>
@@ -16505,59 +19169,214 @@
       </w:rPr>
     </w:lvl>
   </w:abstractNum>
+  <w:abstractNum w:abstractNumId="31" w15:restartNumberingAfterBreak="0">
+    <w:nsid w:val="63F27F5B"/>
+    <w:multiLevelType w:val="multilevel"/>
+    <w:tmpl w:val="34D2C35C"/>
+    <w:lvl w:ilvl="0">
+      <w:start w:val="15"/>
+      <w:numFmt w:val="decimal"/>
+      <w:lvlText w:val="%1."/>
+      <w:lvlJc w:val="left"/>
+      <w:pPr>
+        <w:tabs>
+          <w:tab w:val="num" w:pos="720"/>
+        </w:tabs>
+        <w:ind w:left="720" w:hanging="360"/>
+      </w:pPr>
+    </w:lvl>
+    <w:lvl w:ilvl="1" w:tentative="1">
+      <w:start w:val="1"/>
+      <w:numFmt w:val="decimal"/>
+      <w:lvlText w:val="%2."/>
+      <w:lvlJc w:val="left"/>
+      <w:pPr>
+        <w:tabs>
+          <w:tab w:val="num" w:pos="1440"/>
+        </w:tabs>
+        <w:ind w:left="1440" w:hanging="360"/>
+      </w:pPr>
+    </w:lvl>
+    <w:lvl w:ilvl="2" w:tentative="1">
+      <w:start w:val="1"/>
+      <w:numFmt w:val="decimal"/>
+      <w:lvlText w:val="%3."/>
+      <w:lvlJc w:val="left"/>
+      <w:pPr>
+        <w:tabs>
+          <w:tab w:val="num" w:pos="2160"/>
+        </w:tabs>
+        <w:ind w:left="2160" w:hanging="360"/>
+      </w:pPr>
+    </w:lvl>
+    <w:lvl w:ilvl="3" w:tentative="1">
+      <w:start w:val="1"/>
+      <w:numFmt w:val="decimal"/>
+      <w:lvlText w:val="%4."/>
+      <w:lvlJc w:val="left"/>
+      <w:pPr>
+        <w:tabs>
+          <w:tab w:val="num" w:pos="2880"/>
+        </w:tabs>
+        <w:ind w:left="2880" w:hanging="360"/>
+      </w:pPr>
+    </w:lvl>
+    <w:lvl w:ilvl="4" w:tentative="1">
+      <w:start w:val="1"/>
+      <w:numFmt w:val="decimal"/>
+      <w:lvlText w:val="%5."/>
+      <w:lvlJc w:val="left"/>
+      <w:pPr>
+        <w:tabs>
+          <w:tab w:val="num" w:pos="3600"/>
+        </w:tabs>
+        <w:ind w:left="3600" w:hanging="360"/>
+      </w:pPr>
+    </w:lvl>
+    <w:lvl w:ilvl="5" w:tentative="1">
+      <w:start w:val="1"/>
+      <w:numFmt w:val="decimal"/>
+      <w:lvlText w:val="%6."/>
+      <w:lvlJc w:val="left"/>
+      <w:pPr>
+        <w:tabs>
+          <w:tab w:val="num" w:pos="4320"/>
+        </w:tabs>
+        <w:ind w:left="4320" w:hanging="360"/>
+      </w:pPr>
+    </w:lvl>
+    <w:lvl w:ilvl="6" w:tentative="1">
+      <w:start w:val="1"/>
+      <w:numFmt w:val="decimal"/>
+      <w:lvlText w:val="%7."/>
+      <w:lvlJc w:val="left"/>
+      <w:pPr>
+        <w:tabs>
+          <w:tab w:val="num" w:pos="5040"/>
+        </w:tabs>
+        <w:ind w:left="5040" w:hanging="360"/>
+      </w:pPr>
+    </w:lvl>
+    <w:lvl w:ilvl="7" w:tentative="1">
+      <w:start w:val="1"/>
+      <w:numFmt w:val="decimal"/>
+      <w:lvlText w:val="%8."/>
+      <w:lvlJc w:val="left"/>
+      <w:pPr>
+        <w:tabs>
+          <w:tab w:val="num" w:pos="5760"/>
+        </w:tabs>
+        <w:ind w:left="5760" w:hanging="360"/>
+      </w:pPr>
+    </w:lvl>
+    <w:lvl w:ilvl="8" w:tentative="1">
+      <w:start w:val="1"/>
+      <w:numFmt w:val="decimal"/>
+      <w:lvlText w:val="%9."/>
+      <w:lvlJc w:val="left"/>
+      <w:pPr>
+        <w:tabs>
+          <w:tab w:val="num" w:pos="6480"/>
+        </w:tabs>
+        <w:ind w:left="6480" w:hanging="360"/>
+      </w:pPr>
+    </w:lvl>
+  </w:abstractNum>
   <w:num w:numId="1" w16cid:durableId="1347369810">
+    <w:abstractNumId w:val="16"/>
+  </w:num>
+  <w:num w:numId="2" w16cid:durableId="1906064421">
+    <w:abstractNumId w:val="6"/>
+  </w:num>
+  <w:num w:numId="3" w16cid:durableId="979336980">
+    <w:abstractNumId w:val="22"/>
+  </w:num>
+  <w:num w:numId="4" w16cid:durableId="330105028">
+    <w:abstractNumId w:val="29"/>
+  </w:num>
+  <w:num w:numId="5" w16cid:durableId="589319789">
+    <w:abstractNumId w:val="3"/>
+  </w:num>
+  <w:num w:numId="6" w16cid:durableId="369500150">
+    <w:abstractNumId w:val="30"/>
+  </w:num>
+  <w:num w:numId="7" w16cid:durableId="2018580969">
+    <w:abstractNumId w:val="9"/>
+  </w:num>
+  <w:num w:numId="8" w16cid:durableId="1500998037">
+    <w:abstractNumId w:val="18"/>
+  </w:num>
+  <w:num w:numId="9" w16cid:durableId="990674264">
+    <w:abstractNumId w:val="19"/>
+  </w:num>
+  <w:num w:numId="10" w16cid:durableId="1613826146">
+    <w:abstractNumId w:val="4"/>
+  </w:num>
+  <w:num w:numId="11" w16cid:durableId="101808794">
+    <w:abstractNumId w:val="12"/>
+  </w:num>
+  <w:num w:numId="12" w16cid:durableId="188448382">
+    <w:abstractNumId w:val="14"/>
+  </w:num>
+  <w:num w:numId="13" w16cid:durableId="147865163">
+    <w:abstractNumId w:val="13"/>
+  </w:num>
+  <w:num w:numId="14" w16cid:durableId="1406612394">
+    <w:abstractNumId w:val="17"/>
+  </w:num>
+  <w:num w:numId="15" w16cid:durableId="1265965285">
+    <w:abstractNumId w:val="21"/>
+  </w:num>
+  <w:num w:numId="16" w16cid:durableId="1433017803">
+    <w:abstractNumId w:val="24"/>
+  </w:num>
+  <w:num w:numId="17" w16cid:durableId="348723429">
+    <w:abstractNumId w:val="20"/>
+  </w:num>
+  <w:num w:numId="18" w16cid:durableId="1805349757">
+    <w:abstractNumId w:val="25"/>
+  </w:num>
+  <w:num w:numId="19" w16cid:durableId="1156726392">
+    <w:abstractNumId w:val="11"/>
+  </w:num>
+  <w:num w:numId="20" w16cid:durableId="233705641">
+    <w:abstractNumId w:val="8"/>
+  </w:num>
+  <w:num w:numId="21" w16cid:durableId="804929338">
+    <w:abstractNumId w:val="2"/>
+  </w:num>
+  <w:num w:numId="22" w16cid:durableId="1504928162">
+    <w:abstractNumId w:val="23"/>
+  </w:num>
+  <w:num w:numId="23" w16cid:durableId="1291789814">
     <w:abstractNumId w:val="7"/>
   </w:num>
-  <w:num w:numId="2" w16cid:durableId="1906064421">
-    <w:abstractNumId w:val="2"/>
+  <w:num w:numId="24" w16cid:durableId="785274777">
+    <w:abstractNumId w:val="31"/>
   </w:num>
-  <w:num w:numId="3" w16cid:durableId="979336980">
-    <w:abstractNumId w:val="13"/>
-  </w:num>
-  <w:num w:numId="4" w16cid:durableId="330105028">
-    <w:abstractNumId w:val="16"/>
-  </w:num>
-  <w:num w:numId="5" w16cid:durableId="589319789">
+  <w:num w:numId="25" w16cid:durableId="771702144">
     <w:abstractNumId w:val="0"/>
   </w:num>
-  <w:num w:numId="6" w16cid:durableId="369500150">
-    <w:abstractNumId w:val="17"/>
+  <w:num w:numId="26" w16cid:durableId="489567272">
+    <w:abstractNumId w:val="5"/>
   </w:num>
-  <w:num w:numId="7" w16cid:durableId="2018580969">
-    <w:abstractNumId w:val="3"/>
-  </w:num>
-  <w:num w:numId="8" w16cid:durableId="1500998037">
-    <w:abstractNumId w:val="9"/>
-  </w:num>
-  <w:num w:numId="9" w16cid:durableId="990674264">
+  <w:num w:numId="27" w16cid:durableId="1788885117">
     <w:abstractNumId w:val="10"/>
   </w:num>
-  <w:num w:numId="10" w16cid:durableId="1613826146">
+  <w:num w:numId="28" w16cid:durableId="282268507">
+    <w:abstractNumId w:val="28"/>
+  </w:num>
+  <w:num w:numId="29" w16cid:durableId="1953128456">
+    <w:abstractNumId w:val="15"/>
+  </w:num>
+  <w:num w:numId="30" w16cid:durableId="1755584152">
+    <w:abstractNumId w:val="27"/>
+  </w:num>
+  <w:num w:numId="31" w16cid:durableId="984354681">
     <w:abstractNumId w:val="1"/>
   </w:num>
-  <w:num w:numId="11" w16cid:durableId="101808794">
-    <w:abstractNumId w:val="4"/>
-  </w:num>
-  <w:num w:numId="12" w16cid:durableId="188448382">
-    <w:abstractNumId w:val="6"/>
-  </w:num>
-  <w:num w:numId="13" w16cid:durableId="147865163">
-    <w:abstractNumId w:val="5"/>
-  </w:num>
-  <w:num w:numId="14" w16cid:durableId="1406612394">
-    <w:abstractNumId w:val="8"/>
-  </w:num>
-  <w:num w:numId="15" w16cid:durableId="1265965285">
-    <w:abstractNumId w:val="12"/>
-  </w:num>
-  <w:num w:numId="16" w16cid:durableId="1433017803">
-    <w:abstractNumId w:val="14"/>
-  </w:num>
-  <w:num w:numId="17" w16cid:durableId="348723429">
-    <w:abstractNumId w:val="11"/>
-  </w:num>
-  <w:num w:numId="18" w16cid:durableId="1805349757">
-    <w:abstractNumId w:val="15"/>
+  <w:num w:numId="32" w16cid:durableId="704058163">
+    <w:abstractNumId w:val="26"/>
   </w:num>
 </w:numbering>
 </file>
@@ -17057,6 +19876,7 @@
   <w:style w:type="character" w:default="1" w:styleId="Fuentedeprrafopredeter">
     <w:name w:val="Default Paragraph Font"/>
     <w:uiPriority w:val="1"/>
+    <w:semiHidden/>
     <w:unhideWhenUsed/>
   </w:style>
   <w:style w:type="table" w:default="1" w:styleId="Tablanormal">

</xml_diff>

<commit_message>
Demo de analisis de el sistema final
</commit_message>
<xml_diff>
--- a/Documentacion/Documentacion completa/Sistema gestor de ventas Salud y Armonia.docx
+++ b/Documentacion/Documentacion completa/Sistema gestor de ventas Salud y Armonia.docx
@@ -4207,7 +4207,21 @@
               <w:rPr>
                 <w:sz w:val="22"/>
               </w:rPr>
-              <w:t xml:space="preserve">-El usuario no este logeado </w:t>
+              <w:t xml:space="preserve">-El usuario no este </w:t>
+            </w:r>
+            <w:proofErr w:type="spellStart"/>
+            <w:r>
+              <w:rPr>
+                <w:sz w:val="22"/>
+              </w:rPr>
+              <w:t>logeado</w:t>
+            </w:r>
+            <w:proofErr w:type="spellEnd"/>
+            <w:r>
+              <w:rPr>
+                <w:sz w:val="22"/>
+              </w:rPr>
+              <w:t xml:space="preserve"> </w:t>
             </w:r>
           </w:p>
         </w:tc>
@@ -4625,7 +4639,21 @@
                 <w:sz w:val="22"/>
               </w:rPr>
               <w:tab/>
-              <w:t xml:space="preserve">si esta completa y es valida </w:t>
+              <w:t xml:space="preserve">si </w:t>
+            </w:r>
+            <w:proofErr w:type="spellStart"/>
+            <w:r>
+              <w:rPr>
+                <w:sz w:val="22"/>
+              </w:rPr>
+              <w:t>esta</w:t>
+            </w:r>
+            <w:proofErr w:type="spellEnd"/>
+            <w:r>
+              <w:rPr>
+                <w:sz w:val="22"/>
+              </w:rPr>
+              <w:t xml:space="preserve"> completa y es valida </w:t>
             </w:r>
           </w:p>
         </w:tc>
@@ -8332,7 +8360,15 @@
               <w:ind w:left="107" w:right="0" w:firstLine="0"/>
             </w:pPr>
             <w:r>
-              <w:t xml:space="preserve">El sistema debe adaptarse correctamente a dispositivos móviles, tablets y computadoras. </w:t>
+              <w:t xml:space="preserve">El sistema debe adaptarse correctamente a dispositivos móviles, </w:t>
+            </w:r>
+            <w:proofErr w:type="spellStart"/>
+            <w:r>
+              <w:t>tablets</w:t>
+            </w:r>
+            <w:proofErr w:type="spellEnd"/>
+            <w:r>
+              <w:t xml:space="preserve"> y computadoras. </w:t>
             </w:r>
           </w:p>
         </w:tc>
@@ -9089,13 +9125,7 @@
     <w:p>
       <w:pPr>
         <w:spacing w:after="0" w:line="494" w:lineRule="auto"/>
-        <w:ind w:left="705" w:right="425" w:firstLine="0"/>
-      </w:pPr>
-    </w:p>
-    <w:p>
-      <w:pPr>
-        <w:spacing w:after="0" w:line="494" w:lineRule="auto"/>
-        <w:ind w:left="705" w:right="425" w:firstLine="0"/>
+        <w:ind w:left="0" w:right="425" w:firstLine="0"/>
       </w:pPr>
     </w:p>
     <w:p>
@@ -9107,6 +9137,7 @@
         <w:rPr>
           <w:b/>
         </w:rPr>
+        <w:lastRenderedPageBreak/>
         <w:t xml:space="preserve">Diagrama de uso: </w:t>
       </w:r>
     </w:p>
@@ -9192,7 +9223,15 @@
         <w:t>más</w:t>
       </w:r>
       <w:r>
-        <w:t xml:space="preserve"> que bajar en la página, excepto por navegar por menú que es el resultado de una función que se ejecuta directamente al cargar la página el &lt;&lt;include&gt;&gt; de refiere a funciones que son incluidas directamente a consecuencia de otras. </w:t>
+        <w:t xml:space="preserve"> que bajar en la página, excepto por navegar por menú que es el resultado de una función que se ejecuta directamente al cargar la página el &lt;&lt;</w:t>
+      </w:r>
+      <w:proofErr w:type="spellStart"/>
+      <w:r>
+        <w:t>include</w:t>
+      </w:r>
+      <w:proofErr w:type="spellEnd"/>
+      <w:r>
+        <w:t xml:space="preserve">&gt;&gt; de refiere a funciones que son incluidas directamente a consecuencia de otras. </w:t>
       </w:r>
     </w:p>
     <w:p>
@@ -9272,6 +9311,7 @@
           <w:b/>
           <w:sz w:val="22"/>
         </w:rPr>
+        <w:lastRenderedPageBreak/>
         <w:t xml:space="preserve"> </w:t>
       </w:r>
     </w:p>
@@ -9525,7 +9565,6 @@
         <w:rPr>
           <w:b/>
         </w:rPr>
-        <w:lastRenderedPageBreak/>
         <w:t xml:space="preserve">Diagrama de uso:  </w:t>
       </w:r>
     </w:p>
@@ -9539,6 +9578,7 @@
         <w:rPr>
           <w:b/>
         </w:rPr>
+        <w:lastRenderedPageBreak/>
         <w:t xml:space="preserve"> </w:t>
       </w:r>
     </w:p>
@@ -9684,7 +9724,6 @@
         <w:rPr>
           <w:rFonts w:ascii="Times New Roman" w:hAnsi="Times New Roman" w:cs="Times New Roman"/>
         </w:rPr>
-        <w:lastRenderedPageBreak/>
         <w:t>MÓDULO 3: CARRITO Y COMPRAS</w:t>
       </w:r>
       <w:r>
@@ -9711,6 +9750,7 @@
         <w:ind w:right="425"/>
       </w:pPr>
       <w:r>
+        <w:lastRenderedPageBreak/>
         <w:t xml:space="preserve">RF: </w:t>
       </w:r>
     </w:p>
@@ -9965,7 +10005,6 @@
         <w:rPr>
           <w:b/>
         </w:rPr>
-        <w:lastRenderedPageBreak/>
         <w:t xml:space="preserve">Diagrama de uso: </w:t>
       </w:r>
     </w:p>
@@ -9979,6 +10018,7 @@
         <w:rPr>
           <w:noProof/>
         </w:rPr>
+        <w:lastRenderedPageBreak/>
         <w:drawing>
           <wp:inline distT="0" distB="0" distL="0" distR="0" wp14:anchorId="10D5D61A" wp14:editId="76834CBA">
             <wp:extent cx="5612131" cy="5023485"/>
@@ -10041,7 +10081,15 @@
         <w:t xml:space="preserve"> y </w:t>
       </w:r>
       <w:r>
-        <w:t>elige si desea comprar algo más o continuar, también puede elegir borrar algún articulo de su compra, si desea realizar la compra, debe ingresar los datos, procesar el pago y confirmar pedido.</w:t>
+        <w:t xml:space="preserve">elige si desea comprar algo más o continuar, también puede elegir borrar algún </w:t>
+      </w:r>
+      <w:proofErr w:type="spellStart"/>
+      <w:r>
+        <w:t>articulo</w:t>
+      </w:r>
+      <w:proofErr w:type="spellEnd"/>
+      <w:r>
+        <w:t xml:space="preserve"> de su compra, si desea realizar la compra, debe ingresar los datos, procesar el pago y confirmar pedido.</w:t>
       </w:r>
       <w:r>
         <w:rPr>
@@ -10150,6 +10198,7 @@
         <w:rPr>
           <w:rFonts w:ascii="Times New Roman" w:hAnsi="Times New Roman" w:cs="Times New Roman"/>
         </w:rPr>
+        <w:lastRenderedPageBreak/>
         <w:t>MÓDULO 4: USUARIOS Y AUTENTICACIÓN</w:t>
       </w:r>
       <w:r>
@@ -10432,13 +10481,23 @@
         <w:spacing w:after="265"/>
         <w:ind w:left="360" w:right="0" w:firstLine="0"/>
         <w:jc w:val="left"/>
-      </w:pPr>
-      <w:r>
         <w:rPr>
           <w:sz w:val="22"/>
         </w:rPr>
+      </w:pPr>
+      <w:r>
+        <w:rPr>
+          <w:sz w:val="22"/>
+        </w:rPr>
         <w:t xml:space="preserve"> </w:t>
       </w:r>
+    </w:p>
+    <w:p>
+      <w:pPr>
+        <w:spacing w:after="265"/>
+        <w:ind w:left="360" w:right="0" w:firstLine="0"/>
+        <w:jc w:val="left"/>
+      </w:pPr>
     </w:p>
     <w:p>
       <w:pPr>
@@ -10747,7 +10806,15 @@
         <w:t xml:space="preserve">Explicación: </w:t>
       </w:r>
       <w:r>
-        <w:t>El usuario puede realizar reporte de errores, rellenar el formulario de contacto y enviar comentarios, todo esto será validado antes de ir por eso el &lt;&lt;include&gt;&gt;</w:t>
+        <w:t>El usuario puede realizar reporte de errores, rellenar el formulario de contacto y enviar comentarios, todo esto será validado antes de ir por eso el &lt;&lt;</w:t>
+      </w:r>
+      <w:proofErr w:type="spellStart"/>
+      <w:r>
+        <w:t>include</w:t>
+      </w:r>
+      <w:proofErr w:type="spellEnd"/>
+      <w:r>
+        <w:t>&gt;&gt;</w:t>
       </w:r>
       <w:r>
         <w:rPr>
@@ -10851,7 +10918,15 @@
         <w:ind w:right="425" w:hanging="360"/>
       </w:pPr>
       <w:r>
-        <w:t xml:space="preserve">RF-030 (Panel admin)  </w:t>
+        <w:t xml:space="preserve">RF-030 (Panel </w:t>
+      </w:r>
+      <w:proofErr w:type="spellStart"/>
+      <w:r>
+        <w:t>admin</w:t>
+      </w:r>
+      <w:proofErr w:type="spellEnd"/>
+      <w:r>
+        <w:t xml:space="preserve">)  </w:t>
       </w:r>
     </w:p>
     <w:p>
@@ -11303,7 +11378,15 @@
         <w:ind w:right="425" w:hanging="360"/>
       </w:pPr>
       <w:r>
-        <w:t xml:space="preserve">RNF-014 (Backups) </w:t>
+        <w:t>RNF-014 (</w:t>
+      </w:r>
+      <w:proofErr w:type="spellStart"/>
+      <w:r>
+        <w:t>Backups</w:t>
+      </w:r>
+      <w:proofErr w:type="spellEnd"/>
+      <w:r>
+        <w:t xml:space="preserve">) </w:t>
       </w:r>
     </w:p>
     <w:p>
@@ -11639,8 +11722,13 @@
         <w:ind w:left="708" w:firstLine="0"/>
       </w:pPr>
       <w:r>
-        <w:t> Frontend</w:t>
-      </w:r>
+        <w:t xml:space="preserve"> </w:t>
+      </w:r>
+      <w:proofErr w:type="spellStart"/>
+      <w:r>
+        <w:t>Frontend</w:t>
+      </w:r>
+      <w:proofErr w:type="spellEnd"/>
       <w:r>
         <w:rPr>
           <w:b/>
@@ -11649,7 +11737,15 @@
         <w:t xml:space="preserve"> (Cliente):</w:t>
       </w:r>
       <w:r>
-        <w:t xml:space="preserve"> desarrollado con React, encargado de la interacción con el usuario.</w:t>
+        <w:t xml:space="preserve"> desarrollado con </w:t>
+      </w:r>
+      <w:proofErr w:type="spellStart"/>
+      <w:r>
+        <w:t>React</w:t>
+      </w:r>
+      <w:proofErr w:type="spellEnd"/>
+      <w:r>
+        <w:t>, encargado de la interacción con el usuario.</w:t>
       </w:r>
     </w:p>
     <w:p>
@@ -11720,7 +11816,21 @@
           <w:rFonts w:ascii="Times New Roman" w:hAnsi="Times New Roman" w:cs="Times New Roman"/>
         </w:rPr>
         <w:tab/>
-        <w:t>Capa de presentacion (Frontend)</w:t>
+        <w:t>Capa de presentacion (</w:t>
+      </w:r>
+      <w:proofErr w:type="spellStart"/>
+      <w:r>
+        <w:rPr>
+          <w:rFonts w:ascii="Times New Roman" w:hAnsi="Times New Roman" w:cs="Times New Roman"/>
+        </w:rPr>
+        <w:t>Frontend</w:t>
+      </w:r>
+      <w:proofErr w:type="spellEnd"/>
+      <w:r>
+        <w:rPr>
+          <w:rFonts w:ascii="Times New Roman" w:hAnsi="Times New Roman" w:cs="Times New Roman"/>
+        </w:rPr>
+        <w:t>)</w:t>
       </w:r>
       <w:r>
         <w:rPr>
@@ -11735,7 +11845,39 @@
         <w:ind w:left="708" w:firstLine="702"/>
       </w:pPr>
       <w:r>
-        <w:t>Esta capa se desarrollará principalmente con React un framework para modular código que es destacado por su uso alrededor del mundo, aquí se usara para darle vida al diseño estético del sistema. React permitirá que todo el background del sistema se presente de manera correcta, y limpia para si cumplir con las expectativas previstas.</w:t>
+        <w:t xml:space="preserve">Esta capa se desarrollará principalmente con </w:t>
+      </w:r>
+      <w:proofErr w:type="spellStart"/>
+      <w:r>
+        <w:t>React</w:t>
+      </w:r>
+      <w:proofErr w:type="spellEnd"/>
+      <w:r>
+        <w:t xml:space="preserve"> un </w:t>
+      </w:r>
+      <w:proofErr w:type="spellStart"/>
+      <w:r>
+        <w:t>framework</w:t>
+      </w:r>
+      <w:proofErr w:type="spellEnd"/>
+      <w:r>
+        <w:t xml:space="preserve"> para modular código que es destacado por su uso alrededor del mundo, aquí se usara para darle vida al diseño estético del sistema. </w:t>
+      </w:r>
+      <w:proofErr w:type="spellStart"/>
+      <w:r>
+        <w:t>React</w:t>
+      </w:r>
+      <w:proofErr w:type="spellEnd"/>
+      <w:r>
+        <w:t xml:space="preserve"> permitirá que todo el </w:t>
+      </w:r>
+      <w:proofErr w:type="spellStart"/>
+      <w:r>
+        <w:t>background</w:t>
+      </w:r>
+      <w:proofErr w:type="spellEnd"/>
+      <w:r>
+        <w:t xml:space="preserve"> del sistema se presente de manera correcta, y limpia para si cumplir con las expectativas previstas.</w:t>
       </w:r>
     </w:p>
     <w:p>
@@ -11769,7 +11911,15 @@
       </w:r>
       <w:r>
         <w:tab/>
-        <w:t xml:space="preserve">La capa de lógica es la que define como se moverá el sistema, es lo que hará que un botón, un comentario de verdad llege a algo, dicha capa de lógica se implementara utilizando JavaScript, un conocido lenguaje de programación específicamente usando el framework de Node.js el cual permite trabajarlo de manera </w:t>
+        <w:t xml:space="preserve">La capa de lógica es la que define como se moverá el sistema, es lo que hará que un botón, un comentario de verdad llege a algo, dicha capa de lógica se implementara utilizando JavaScript, un conocido lenguaje de programación específicamente usando el </w:t>
+      </w:r>
+      <w:proofErr w:type="spellStart"/>
+      <w:r>
+        <w:t>framework</w:t>
+      </w:r>
+      <w:proofErr w:type="spellEnd"/>
+      <w:r>
+        <w:t xml:space="preserve"> de Node.js el cual permite trabajarlo de manera </w:t>
       </w:r>
       <w:r>
         <w:lastRenderedPageBreak/>
@@ -11882,7 +12032,15 @@
         <w:spacing w:line="360" w:lineRule="auto"/>
       </w:pPr>
       <w:r>
-        <w:t>El usuario interactúa con la interfaz desarrollada en React.</w:t>
+        <w:t xml:space="preserve">El usuario interactúa con la interfaz desarrollada en </w:t>
+      </w:r>
+      <w:proofErr w:type="spellStart"/>
+      <w:r>
+        <w:t>React</w:t>
+      </w:r>
+      <w:proofErr w:type="spellEnd"/>
+      <w:r>
+        <w:t>.</w:t>
       </w:r>
     </w:p>
     <w:p>
@@ -11894,7 +12052,15 @@
         <w:spacing w:line="360" w:lineRule="auto"/>
       </w:pPr>
       <w:r>
-        <w:t>El frontend envía una solicitud HTTP al backend.</w:t>
+        <w:t xml:space="preserve">El </w:t>
+      </w:r>
+      <w:proofErr w:type="spellStart"/>
+      <w:r>
+        <w:t>frontend</w:t>
+      </w:r>
+      <w:proofErr w:type="spellEnd"/>
+      <w:r>
+        <w:t xml:space="preserve"> envía una solicitud HTTP al backend.</w:t>
       </w:r>
     </w:p>
     <w:p>
@@ -11930,7 +12096,15 @@
         <w:spacing w:line="360" w:lineRule="auto"/>
       </w:pPr>
       <w:r>
-        <w:t>El backend devuelve una respuesta al frontend.</w:t>
+        <w:t xml:space="preserve">El backend devuelve una respuesta al </w:t>
+      </w:r>
+      <w:proofErr w:type="spellStart"/>
+      <w:r>
+        <w:t>frontend</w:t>
+      </w:r>
+      <w:proofErr w:type="spellEnd"/>
+      <w:r>
+        <w:t>.</w:t>
       </w:r>
     </w:p>
     <w:p>
@@ -11942,7 +12116,15 @@
         <w:spacing w:line="360" w:lineRule="auto"/>
       </w:pPr>
       <w:r>
-        <w:t>El frontend actualiza la interfaz con la información recibida.</w:t>
+        <w:t xml:space="preserve">El </w:t>
+      </w:r>
+      <w:proofErr w:type="spellStart"/>
+      <w:r>
+        <w:t>frontend</w:t>
+      </w:r>
+      <w:proofErr w:type="spellEnd"/>
+      <w:r>
+        <w:t xml:space="preserve"> actualiza la interfaz con la información recibida.</w:t>
       </w:r>
     </w:p>
     <w:p/>
@@ -12068,15 +12250,32 @@
           <w:numId w:val="9"/>
         </w:numPr>
       </w:pPr>
+      <w:proofErr w:type="spellStart"/>
       <w:r>
         <w:rPr>
           <w:b/>
           <w:bCs/>
         </w:rPr>
-        <w:t>Frontend:</w:t>
-      </w:r>
-      <w:r>
-        <w:t xml:space="preserve"> React (JavaScript)</w:t>
+        <w:t>Frontend</w:t>
+      </w:r>
+      <w:proofErr w:type="spellEnd"/>
+      <w:r>
+        <w:rPr>
+          <w:b/>
+          <w:bCs/>
+        </w:rPr>
+        <w:t>:</w:t>
+      </w:r>
+      <w:r>
+        <w:t xml:space="preserve"> </w:t>
+      </w:r>
+      <w:proofErr w:type="spellStart"/>
+      <w:r>
+        <w:t>React</w:t>
+      </w:r>
+      <w:proofErr w:type="spellEnd"/>
+      <w:r>
+        <w:t xml:space="preserve"> (JavaScript)</w:t>
       </w:r>
     </w:p>
     <w:p>
@@ -12143,13 +12342,23 @@
           <w:lang w:val="en-US"/>
         </w:rPr>
       </w:pPr>
+      <w:proofErr w:type="spellStart"/>
       <w:r>
         <w:rPr>
           <w:b/>
           <w:bCs/>
           <w:lang w:val="en-US"/>
         </w:rPr>
-        <w:t>Autenticación:</w:t>
+        <w:t>Autenticación</w:t>
+      </w:r>
+      <w:proofErr w:type="spellEnd"/>
+      <w:r>
+        <w:rPr>
+          <w:b/>
+          <w:bCs/>
+          <w:lang w:val="en-US"/>
+        </w:rPr>
+        <w:t>:</w:t>
       </w:r>
       <w:r>
         <w:rPr>
@@ -12368,8 +12577,13 @@
         </w:numPr>
         <w:spacing w:line="360" w:lineRule="auto"/>
       </w:pPr>
-      <w:r>
-        <w:t>id_usuario (PK)</w:t>
+      <w:proofErr w:type="spellStart"/>
+      <w:r>
+        <w:t>id_usuario</w:t>
+      </w:r>
+      <w:proofErr w:type="spellEnd"/>
+      <w:r>
+        <w:t xml:space="preserve"> (PK)</w:t>
       </w:r>
     </w:p>
     <w:p>
@@ -12416,8 +12630,13 @@
         </w:numPr>
         <w:spacing w:line="360" w:lineRule="auto"/>
       </w:pPr>
-      <w:r>
-        <w:t>direccion(opcional)</w:t>
+      <w:proofErr w:type="spellStart"/>
+      <w:r>
+        <w:t>direccion</w:t>
+      </w:r>
+      <w:proofErr w:type="spellEnd"/>
+      <w:r>
+        <w:t>(opcional)</w:t>
       </w:r>
     </w:p>
     <w:p>
@@ -12429,7 +12648,15 @@
         <w:spacing w:line="360" w:lineRule="auto"/>
       </w:pPr>
       <w:r>
-        <w:t>rol (cliente/admin)</w:t>
+        <w:t>rol (cliente/</w:t>
+      </w:r>
+      <w:proofErr w:type="spellStart"/>
+      <w:r>
+        <w:t>admin</w:t>
+      </w:r>
+      <w:proofErr w:type="spellEnd"/>
+      <w:r>
+        <w:t>)</w:t>
       </w:r>
     </w:p>
     <w:p>
@@ -12440,10 +12667,12 @@
         </w:numPr>
         <w:spacing w:line="360" w:lineRule="auto"/>
       </w:pPr>
+      <w:proofErr w:type="spellStart"/>
       <w:r>
         <w:lastRenderedPageBreak/>
         <w:t>fecha_registro</w:t>
       </w:r>
+      <w:proofErr w:type="spellEnd"/>
     </w:p>
     <w:p>
       <w:pPr>
@@ -12482,8 +12711,13 @@
         </w:numPr>
         <w:spacing w:line="360" w:lineRule="auto"/>
       </w:pPr>
-      <w:r>
-        <w:t>id_producto (PK)</w:t>
+      <w:proofErr w:type="spellStart"/>
+      <w:r>
+        <w:t>id_producto</w:t>
+      </w:r>
+      <w:proofErr w:type="spellEnd"/>
+      <w:r>
+        <w:t xml:space="preserve"> (PK)</w:t>
       </w:r>
     </w:p>
     <w:p>
@@ -12506,9 +12740,11 @@
         </w:numPr>
         <w:spacing w:line="360" w:lineRule="auto"/>
       </w:pPr>
+      <w:proofErr w:type="spellStart"/>
       <w:r>
         <w:t>descripcion</w:t>
       </w:r>
+      <w:proofErr w:type="spellEnd"/>
     </w:p>
     <w:p>
       <w:pPr>
@@ -12542,6 +12778,7 @@
         </w:numPr>
         <w:spacing w:line="360" w:lineRule="auto"/>
       </w:pPr>
+      <w:proofErr w:type="spellStart"/>
       <w:r>
         <w:t>categor</w:t>
       </w:r>
@@ -12551,6 +12788,7 @@
       <w:r>
         <w:t>a</w:t>
       </w:r>
+      <w:proofErr w:type="spellEnd"/>
     </w:p>
     <w:p>
       <w:pPr>
@@ -12584,8 +12822,13 @@
         </w:numPr>
         <w:spacing w:line="360" w:lineRule="auto"/>
       </w:pPr>
-      <w:r>
-        <w:t>id_pedido (PK)</w:t>
+      <w:proofErr w:type="spellStart"/>
+      <w:r>
+        <w:t>id_pedido</w:t>
+      </w:r>
+      <w:proofErr w:type="spellEnd"/>
+      <w:r>
+        <w:t xml:space="preserve"> (PK)</w:t>
       </w:r>
     </w:p>
     <w:p>
@@ -12596,8 +12839,13 @@
         </w:numPr>
         <w:spacing w:line="360" w:lineRule="auto"/>
       </w:pPr>
-      <w:r>
-        <w:t>id_usuario (FK)</w:t>
+      <w:proofErr w:type="spellStart"/>
+      <w:r>
+        <w:t>id_usuario</w:t>
+      </w:r>
+      <w:proofErr w:type="spellEnd"/>
+      <w:r>
+        <w:t xml:space="preserve"> (FK)</w:t>
       </w:r>
     </w:p>
     <w:p>
@@ -12664,6 +12912,7 @@
           <w:bCs/>
         </w:rPr>
       </w:pPr>
+      <w:proofErr w:type="spellStart"/>
       <w:r>
         <w:rPr>
           <w:b/>
@@ -12671,6 +12920,7 @@
         </w:rPr>
         <w:t>Detalle_Pedido</w:t>
       </w:r>
+      <w:proofErr w:type="spellEnd"/>
     </w:p>
     <w:p>
       <w:pPr>
@@ -12688,8 +12938,13 @@
         </w:numPr>
         <w:spacing w:line="360" w:lineRule="auto"/>
       </w:pPr>
-      <w:r>
-        <w:t>id_detalle (PK)</w:t>
+      <w:proofErr w:type="spellStart"/>
+      <w:r>
+        <w:t>id_detalle</w:t>
+      </w:r>
+      <w:proofErr w:type="spellEnd"/>
+      <w:r>
+        <w:t xml:space="preserve"> (PK)</w:t>
       </w:r>
     </w:p>
     <w:p>
@@ -12700,8 +12955,13 @@
         </w:numPr>
         <w:spacing w:line="360" w:lineRule="auto"/>
       </w:pPr>
-      <w:r>
-        <w:t>id_pedido (FK)</w:t>
+      <w:proofErr w:type="spellStart"/>
+      <w:r>
+        <w:t>id_pedido</w:t>
+      </w:r>
+      <w:proofErr w:type="spellEnd"/>
+      <w:r>
+        <w:t xml:space="preserve"> (FK)</w:t>
       </w:r>
     </w:p>
     <w:p>
@@ -12712,8 +12972,13 @@
         </w:numPr>
         <w:spacing w:line="360" w:lineRule="auto"/>
       </w:pPr>
-      <w:r>
-        <w:t>id_producto (FK)</w:t>
+      <w:proofErr w:type="spellStart"/>
+      <w:r>
+        <w:t>id_producto</w:t>
+      </w:r>
+      <w:proofErr w:type="spellEnd"/>
+      <w:r>
+        <w:t xml:space="preserve"> (FK)</w:t>
       </w:r>
     </w:p>
     <w:p>
@@ -12736,9 +13001,11 @@
         </w:numPr>
         <w:spacing w:line="360" w:lineRule="auto"/>
       </w:pPr>
+      <w:proofErr w:type="spellStart"/>
       <w:r>
         <w:t>precio_unitario</w:t>
       </w:r>
+      <w:proofErr w:type="spellEnd"/>
     </w:p>
     <w:p>
       <w:pPr>
@@ -12772,8 +13039,13 @@
         </w:numPr>
         <w:spacing w:line="360" w:lineRule="auto"/>
       </w:pPr>
-      <w:r>
-        <w:t>id_carrito (PK)</w:t>
+      <w:proofErr w:type="spellStart"/>
+      <w:r>
+        <w:t>id_carrito</w:t>
+      </w:r>
+      <w:proofErr w:type="spellEnd"/>
+      <w:r>
+        <w:t xml:space="preserve"> (PK)</w:t>
       </w:r>
     </w:p>
     <w:p>
@@ -12784,8 +13056,13 @@
         </w:numPr>
         <w:spacing w:line="360" w:lineRule="auto"/>
       </w:pPr>
-      <w:r>
-        <w:t>id_usuario (FK)</w:t>
+      <w:proofErr w:type="spellStart"/>
+      <w:r>
+        <w:t>id_usuario</w:t>
+      </w:r>
+      <w:proofErr w:type="spellEnd"/>
+      <w:r>
+        <w:t xml:space="preserve"> (FK)</w:t>
       </w:r>
     </w:p>
     <w:p>
@@ -12796,8 +13073,13 @@
         </w:numPr>
         <w:spacing w:line="360" w:lineRule="auto"/>
       </w:pPr>
-      <w:r>
-        <w:t>id_producto (FK)</w:t>
+      <w:proofErr w:type="spellStart"/>
+      <w:r>
+        <w:t>id_producto</w:t>
+      </w:r>
+      <w:proofErr w:type="spellEnd"/>
+      <w:r>
+        <w:t xml:space="preserve"> (FK)</w:t>
       </w:r>
     </w:p>
     <w:p>
@@ -12869,8 +13151,13 @@
         </w:numPr>
         <w:spacing w:line="360" w:lineRule="auto"/>
       </w:pPr>
-      <w:r>
-        <w:t>id_mensaje (PK)</w:t>
+      <w:proofErr w:type="spellStart"/>
+      <w:r>
+        <w:t>id_mensaje</w:t>
+      </w:r>
+      <w:proofErr w:type="spellEnd"/>
+      <w:r>
+        <w:t xml:space="preserve"> (PK)</w:t>
       </w:r>
     </w:p>
     <w:p>
@@ -12881,12 +13168,17 @@
         </w:numPr>
         <w:spacing w:line="360" w:lineRule="auto"/>
       </w:pPr>
+      <w:proofErr w:type="spellStart"/>
       <w:r>
         <w:t>id_</w:t>
       </w:r>
       <w:proofErr w:type="gramStart"/>
       <w:r>
-        <w:t>usuario(</w:t>
+        <w:t>usuario</w:t>
+      </w:r>
+      <w:proofErr w:type="spellEnd"/>
+      <w:r>
+        <w:t>(</w:t>
       </w:r>
       <w:proofErr w:type="gramEnd"/>
       <w:r>
@@ -12965,7 +13257,15 @@
         <w:spacing w:line="360" w:lineRule="auto"/>
       </w:pPr>
       <w:r>
-        <w:t>Un pedido puede contener múltiples productos (1 a través de detalle_pedido).</w:t>
+        <w:t xml:space="preserve">Un pedido puede contener múltiples productos (1 a través de </w:t>
+      </w:r>
+      <w:proofErr w:type="spellStart"/>
+      <w:r>
+        <w:t>detalle_pedido</w:t>
+      </w:r>
+      <w:proofErr w:type="spellEnd"/>
+      <w:r>
+        <w:t>).</w:t>
       </w:r>
     </w:p>
     <w:p>
@@ -13305,7 +13605,15 @@
       </w:r>
       <w:r>
         <w:tab/>
-        <w:t>En el siguiente diagrama de entidad relación podemos observar las relaciones que hay con todas las entidades, aquí carrito esta conectado a productos porque carrito puede tener muchos productos dentro, además carrito le pertenece a un usuario y lo vemos reflejado en el diagrama, además pedidos le pertenecen a un usuario, y todos los pedidos tienen un detalle pedido el cual es que define cosas como cantidad, precio etc. Mensajes se relaciona con usuario porque los usuarios son quienes dejan los mensajes</w:t>
+        <w:t xml:space="preserve">En el siguiente diagrama de entidad relación podemos observar las relaciones que hay con todas las entidades, aquí carrito </w:t>
+      </w:r>
+      <w:proofErr w:type="spellStart"/>
+      <w:r>
+        <w:t>esta</w:t>
+      </w:r>
+      <w:proofErr w:type="spellEnd"/>
+      <w:r>
+        <w:t xml:space="preserve"> conectado a productos porque carrito puede tener muchos productos dentro, además carrito le pertenece a un usuario y lo vemos reflejado en el diagrama, además pedidos le pertenecen a un usuario, y todos los pedidos tienen un detalle pedido el cual es que define cosas como cantidad, precio etc. Mensajes se relaciona con usuario porque los usuarios son quienes dejan los mensajes</w:t>
       </w:r>
     </w:p>
     <w:p>
@@ -13407,6 +13715,133 @@
       <w:r>
         <w:t xml:space="preserve">Banner principal </w:t>
       </w:r>
+      <w:r>
+        <w:t xml:space="preserve">y </w:t>
+      </w:r>
+      <w:r>
+        <w:t>Acceso a menú</w:t>
+      </w:r>
+      <w:r>
+        <w:t>:</w:t>
+      </w:r>
+    </w:p>
+    <w:p>
+      <w:pPr>
+        <w:ind w:left="720" w:firstLine="0"/>
+      </w:pPr>
+      <w:r>
+        <w:rPr>
+          <w:b/>
+          <w:bCs/>
+        </w:rPr>
+        <w:t>Menú / Navegación</w:t>
+      </w:r>
+      <w:r>
+        <w:t xml:space="preserve"> </w:t>
+      </w:r>
+    </w:p>
+    <w:p>
+      <w:pPr>
+        <w:numPr>
+          <w:ilvl w:val="2"/>
+          <w:numId w:val="19"/>
+        </w:numPr>
+      </w:pPr>
+      <w:r>
+        <w:t xml:space="preserve">Inicio </w:t>
+      </w:r>
+    </w:p>
+    <w:p>
+      <w:pPr>
+        <w:numPr>
+          <w:ilvl w:val="2"/>
+          <w:numId w:val="19"/>
+        </w:numPr>
+      </w:pPr>
+      <w:r>
+        <w:t xml:space="preserve">Productos </w:t>
+      </w:r>
+    </w:p>
+    <w:p>
+      <w:pPr>
+        <w:numPr>
+          <w:ilvl w:val="2"/>
+          <w:numId w:val="19"/>
+        </w:numPr>
+      </w:pPr>
+      <w:r>
+        <w:t xml:space="preserve">Contacto </w:t>
+      </w:r>
+    </w:p>
+    <w:p>
+      <w:pPr>
+        <w:numPr>
+          <w:ilvl w:val="2"/>
+          <w:numId w:val="19"/>
+        </w:numPr>
+      </w:pPr>
+      <w:r>
+        <w:rPr>
+          <w:noProof/>
+        </w:rPr>
+        <w:drawing>
+          <wp:anchor distT="0" distB="0" distL="114300" distR="114300" simplePos="0" relativeHeight="251667456" behindDoc="0" locked="0" layoutInCell="1" allowOverlap="1" wp14:anchorId="295FF31D" wp14:editId="2E24F827">
+            <wp:simplePos x="0" y="0"/>
+            <wp:positionH relativeFrom="page">
+              <wp:posOffset>866775</wp:posOffset>
+            </wp:positionH>
+            <wp:positionV relativeFrom="paragraph">
+              <wp:posOffset>330835</wp:posOffset>
+            </wp:positionV>
+            <wp:extent cx="5883910" cy="3796030"/>
+            <wp:effectExtent l="0" t="0" r="2540" b="0"/>
+            <wp:wrapTopAndBottom/>
+            <wp:docPr id="1118538812" name="Imagen 1"/>
+            <wp:cNvGraphicFramePr>
+              <a:graphicFrameLocks xmlns:a="http://schemas.openxmlformats.org/drawingml/2006/main" noChangeAspect="1"/>
+            </wp:cNvGraphicFramePr>
+            <a:graphic xmlns:a="http://schemas.openxmlformats.org/drawingml/2006/main">
+              <a:graphicData uri="http://schemas.openxmlformats.org/drawingml/2006/picture">
+                <pic:pic xmlns:pic="http://schemas.openxmlformats.org/drawingml/2006/picture">
+                  <pic:nvPicPr>
+                    <pic:cNvPr id="1118538812" name=""/>
+                    <pic:cNvPicPr/>
+                  </pic:nvPicPr>
+                  <pic:blipFill>
+                    <a:blip r:embed="rId14">
+                      <a:extLst>
+                        <a:ext uri="{28A0092B-C50C-407E-A947-70E740481C1C}">
+                          <a14:useLocalDpi xmlns:a14="http://schemas.microsoft.com/office/drawing/2010/main" val="0"/>
+                        </a:ext>
+                      </a:extLst>
+                    </a:blip>
+                    <a:stretch>
+                      <a:fillRect/>
+                    </a:stretch>
+                  </pic:blipFill>
+                  <pic:spPr>
+                    <a:xfrm>
+                      <a:off x="0" y="0"/>
+                      <a:ext cx="5883910" cy="3796030"/>
+                    </a:xfrm>
+                    <a:prstGeom prst="rect">
+                      <a:avLst/>
+                    </a:prstGeom>
+                  </pic:spPr>
+                </pic:pic>
+              </a:graphicData>
+            </a:graphic>
+          </wp:anchor>
+        </w:drawing>
+      </w:r>
+      <w:r>
+        <w:t>Login</w:t>
+      </w:r>
+    </w:p>
+    <w:p>
+      <w:pPr>
+        <w:ind w:left="1440" w:firstLine="0"/>
+      </w:pPr>
     </w:p>
     <w:p>
       <w:pPr>
@@ -13416,8 +13851,117 @@
         </w:numPr>
       </w:pPr>
       <w:r>
+        <w:rPr>
+          <w:noProof/>
+        </w:rPr>
+        <w:drawing>
+          <wp:anchor distT="0" distB="0" distL="114300" distR="114300" simplePos="0" relativeHeight="251668480" behindDoc="0" locked="0" layoutInCell="1" allowOverlap="1" wp14:anchorId="2A6BB4F8" wp14:editId="4377F062">
+            <wp:simplePos x="0" y="0"/>
+            <wp:positionH relativeFrom="column">
+              <wp:posOffset>375920</wp:posOffset>
+            </wp:positionH>
+            <wp:positionV relativeFrom="paragraph">
+              <wp:posOffset>442595</wp:posOffset>
+            </wp:positionV>
+            <wp:extent cx="5883910" cy="4192270"/>
+            <wp:effectExtent l="0" t="0" r="2540" b="0"/>
+            <wp:wrapTopAndBottom/>
+            <wp:docPr id="1669415029" name="Imagen 1"/>
+            <wp:cNvGraphicFramePr>
+              <a:graphicFrameLocks xmlns:a="http://schemas.openxmlformats.org/drawingml/2006/main" noChangeAspect="1"/>
+            </wp:cNvGraphicFramePr>
+            <a:graphic xmlns:a="http://schemas.openxmlformats.org/drawingml/2006/main">
+              <a:graphicData uri="http://schemas.openxmlformats.org/drawingml/2006/picture">
+                <pic:pic xmlns:pic="http://schemas.openxmlformats.org/drawingml/2006/picture">
+                  <pic:nvPicPr>
+                    <pic:cNvPr id="1669415029" name=""/>
+                    <pic:cNvPicPr/>
+                  </pic:nvPicPr>
+                  <pic:blipFill>
+                    <a:blip r:embed="rId15">
+                      <a:extLst>
+                        <a:ext uri="{28A0092B-C50C-407E-A947-70E740481C1C}">
+                          <a14:useLocalDpi xmlns:a14="http://schemas.microsoft.com/office/drawing/2010/main" val="0"/>
+                        </a:ext>
+                      </a:extLst>
+                    </a:blip>
+                    <a:stretch>
+                      <a:fillRect/>
+                    </a:stretch>
+                  </pic:blipFill>
+                  <pic:spPr>
+                    <a:xfrm>
+                      <a:off x="0" y="0"/>
+                      <a:ext cx="5883910" cy="4192270"/>
+                    </a:xfrm>
+                    <a:prstGeom prst="rect">
+                      <a:avLst/>
+                    </a:prstGeom>
+                  </pic:spPr>
+                </pic:pic>
+              </a:graphicData>
+            </a:graphic>
+          </wp:anchor>
+        </w:drawing>
+      </w:r>
+      <w:r>
         <w:t xml:space="preserve">Productos destacados </w:t>
       </w:r>
+    </w:p>
+    <w:p>
+      <w:pPr>
+        <w:ind w:left="1440" w:firstLine="0"/>
+      </w:pPr>
+    </w:p>
+    <w:p>
+      <w:pPr>
+        <w:ind w:left="1440" w:firstLine="0"/>
+      </w:pPr>
+    </w:p>
+    <w:p>
+      <w:pPr>
+        <w:ind w:left="1440" w:firstLine="0"/>
+      </w:pPr>
+    </w:p>
+    <w:p>
+      <w:pPr>
+        <w:ind w:left="1440" w:firstLine="0"/>
+      </w:pPr>
+    </w:p>
+    <w:p>
+      <w:pPr>
+        <w:ind w:left="1440" w:firstLine="0"/>
+      </w:pPr>
+    </w:p>
+    <w:p>
+      <w:pPr>
+        <w:ind w:left="1440" w:firstLine="0"/>
+      </w:pPr>
+    </w:p>
+    <w:p>
+      <w:pPr>
+        <w:ind w:left="1440" w:firstLine="0"/>
+      </w:pPr>
+    </w:p>
+    <w:p>
+      <w:pPr>
+        <w:ind w:left="1440" w:firstLine="0"/>
+      </w:pPr>
+    </w:p>
+    <w:p>
+      <w:pPr>
+        <w:ind w:left="1440" w:firstLine="0"/>
+      </w:pPr>
+    </w:p>
+    <w:p>
+      <w:pPr>
+        <w:ind w:left="1440" w:firstLine="0"/>
+      </w:pPr>
+    </w:p>
+    <w:p>
+      <w:pPr>
+        <w:ind w:left="1440" w:firstLine="0"/>
+      </w:pPr>
     </w:p>
     <w:p>
       <w:pPr>
@@ -13427,26 +13971,73 @@
         </w:numPr>
       </w:pPr>
       <w:r>
-        <w:t xml:space="preserve">Acceso a menú </w:t>
-      </w:r>
-    </w:p>
-    <w:p>
-      <w:pPr>
-        <w:numPr>
-          <w:ilvl w:val="0"/>
-          <w:numId w:val="19"/>
-        </w:numPr>
-      </w:pPr>
-      <w:r>
-        <w:rPr>
-          <w:b/>
-          <w:bCs/>
-        </w:rPr>
-        <w:t>Acerca de Nosotros</w:t>
-      </w:r>
-      <w:r>
-        <w:t xml:space="preserve"> </w:t>
-      </w:r>
+        <w:rPr>
+          <w:noProof/>
+        </w:rPr>
+        <w:drawing>
+          <wp:anchor distT="0" distB="0" distL="114300" distR="114300" simplePos="0" relativeHeight="251669504" behindDoc="0" locked="0" layoutInCell="1" allowOverlap="1" wp14:anchorId="39CE1BE4" wp14:editId="1AFFF413">
+            <wp:simplePos x="0" y="0"/>
+            <wp:positionH relativeFrom="margin">
+              <wp:align>right</wp:align>
+            </wp:positionH>
+            <wp:positionV relativeFrom="paragraph">
+              <wp:posOffset>393700</wp:posOffset>
+            </wp:positionV>
+            <wp:extent cx="5274310" cy="3100705"/>
+            <wp:effectExtent l="0" t="0" r="2540" b="4445"/>
+            <wp:wrapTopAndBottom/>
+            <wp:docPr id="1990399647" name="Imagen 1"/>
+            <wp:cNvGraphicFramePr>
+              <a:graphicFrameLocks xmlns:a="http://schemas.openxmlformats.org/drawingml/2006/main" noChangeAspect="1"/>
+            </wp:cNvGraphicFramePr>
+            <a:graphic xmlns:a="http://schemas.openxmlformats.org/drawingml/2006/main">
+              <a:graphicData uri="http://schemas.openxmlformats.org/drawingml/2006/picture">
+                <pic:pic xmlns:pic="http://schemas.openxmlformats.org/drawingml/2006/picture">
+                  <pic:nvPicPr>
+                    <pic:cNvPr id="1990399647" name=""/>
+                    <pic:cNvPicPr/>
+                  </pic:nvPicPr>
+                  <pic:blipFill>
+                    <a:blip r:embed="rId16">
+                      <a:extLst>
+                        <a:ext uri="{28A0092B-C50C-407E-A947-70E740481C1C}">
+                          <a14:useLocalDpi xmlns:a14="http://schemas.microsoft.com/office/drawing/2010/main" val="0"/>
+                        </a:ext>
+                      </a:extLst>
+                    </a:blip>
+                    <a:stretch>
+                      <a:fillRect/>
+                    </a:stretch>
+                  </pic:blipFill>
+                  <pic:spPr>
+                    <a:xfrm>
+                      <a:off x="0" y="0"/>
+                      <a:ext cx="5274310" cy="3100705"/>
+                    </a:xfrm>
+                    <a:prstGeom prst="rect">
+                      <a:avLst/>
+                    </a:prstGeom>
+                  </pic:spPr>
+                </pic:pic>
+              </a:graphicData>
+            </a:graphic>
+            <wp14:sizeRelH relativeFrom="margin">
+              <wp14:pctWidth>0</wp14:pctWidth>
+            </wp14:sizeRelH>
+            <wp14:sizeRelV relativeFrom="margin">
+              <wp14:pctHeight>0</wp14:pctHeight>
+            </wp14:sizeRelV>
+          </wp:anchor>
+        </w:drawing>
+      </w:r>
+      <w:r>
+        <w:t>Acerca de la empresa</w:t>
+      </w:r>
+    </w:p>
+    <w:p>
+      <w:pPr>
+        <w:pStyle w:val="Prrafodelista"/>
+      </w:pPr>
     </w:p>
     <w:p>
       <w:pPr>
@@ -13456,26 +14047,74 @@
         </w:numPr>
       </w:pPr>
       <w:r>
-        <w:t xml:space="preserve">Información del emprendimiento </w:t>
-      </w:r>
-    </w:p>
-    <w:p>
-      <w:pPr>
-        <w:numPr>
-          <w:ilvl w:val="0"/>
-          <w:numId w:val="19"/>
-        </w:numPr>
-      </w:pPr>
-      <w:r>
-        <w:rPr>
-          <w:b/>
-          <w:bCs/>
-        </w:rPr>
-        <w:t>Acerca de mí</w:t>
-      </w:r>
-      <w:r>
+        <w:rPr>
+          <w:noProof/>
+        </w:rPr>
+        <w:lastRenderedPageBreak/>
+        <w:drawing>
+          <wp:anchor distT="0" distB="0" distL="114300" distR="114300" simplePos="0" relativeHeight="251670528" behindDoc="0" locked="0" layoutInCell="1" allowOverlap="1" wp14:anchorId="56263237" wp14:editId="4B905FF2">
+            <wp:simplePos x="0" y="0"/>
+            <wp:positionH relativeFrom="column">
+              <wp:posOffset>366395</wp:posOffset>
+            </wp:positionH>
+            <wp:positionV relativeFrom="paragraph">
+              <wp:posOffset>353060</wp:posOffset>
+            </wp:positionV>
+            <wp:extent cx="5883910" cy="3310890"/>
+            <wp:effectExtent l="0" t="0" r="2540" b="3810"/>
+            <wp:wrapTopAndBottom/>
+            <wp:docPr id="715909072" name="Imagen 1"/>
+            <wp:cNvGraphicFramePr>
+              <a:graphicFrameLocks xmlns:a="http://schemas.openxmlformats.org/drawingml/2006/main" noChangeAspect="1"/>
+            </wp:cNvGraphicFramePr>
+            <a:graphic xmlns:a="http://schemas.openxmlformats.org/drawingml/2006/main">
+              <a:graphicData uri="http://schemas.openxmlformats.org/drawingml/2006/picture">
+                <pic:pic xmlns:pic="http://schemas.openxmlformats.org/drawingml/2006/picture">
+                  <pic:nvPicPr>
+                    <pic:cNvPr id="715909072" name=""/>
+                    <pic:cNvPicPr/>
+                  </pic:nvPicPr>
+                  <pic:blipFill>
+                    <a:blip r:embed="rId17">
+                      <a:extLst>
+                        <a:ext uri="{28A0092B-C50C-407E-A947-70E740481C1C}">
+                          <a14:useLocalDpi xmlns:a14="http://schemas.microsoft.com/office/drawing/2010/main" val="0"/>
+                        </a:ext>
+                      </a:extLst>
+                    </a:blip>
+                    <a:stretch>
+                      <a:fillRect/>
+                    </a:stretch>
+                  </pic:blipFill>
+                  <pic:spPr>
+                    <a:xfrm>
+                      <a:off x="0" y="0"/>
+                      <a:ext cx="5883910" cy="3310890"/>
+                    </a:xfrm>
+                    <a:prstGeom prst="rect">
+                      <a:avLst/>
+                    </a:prstGeom>
+                  </pic:spPr>
+                </pic:pic>
+              </a:graphicData>
+            </a:graphic>
+          </wp:anchor>
+        </w:drawing>
+      </w:r>
+      <w:r>
+        <w:t>Acerca del fundador</w:t>
+      </w:r>
+      <w:r>
+        <w:rPr>
+          <w:noProof/>
+        </w:rPr>
         <w:t xml:space="preserve"> </w:t>
       </w:r>
+    </w:p>
+    <w:p>
+      <w:pPr>
+        <w:pStyle w:val="Prrafodelista"/>
+      </w:pPr>
     </w:p>
     <w:p>
       <w:pPr>
@@ -13485,101 +14124,62 @@
         </w:numPr>
       </w:pPr>
       <w:r>
-        <w:t xml:space="preserve">Historia del negocio o de la dueña </w:t>
-      </w:r>
-    </w:p>
-    <w:p>
-      <w:pPr>
-        <w:numPr>
-          <w:ilvl w:val="0"/>
-          <w:numId w:val="19"/>
-        </w:numPr>
-      </w:pPr>
-      <w:r>
-        <w:rPr>
-          <w:b/>
-          <w:bCs/>
-        </w:rPr>
-        <w:t>Menú / Navegación</w:t>
-      </w:r>
-      <w:r>
-        <w:t xml:space="preserve"> </w:t>
-      </w:r>
-    </w:p>
-    <w:p>
-      <w:pPr>
-        <w:numPr>
-          <w:ilvl w:val="1"/>
-          <w:numId w:val="19"/>
-        </w:numPr>
-      </w:pPr>
-      <w:r>
-        <w:t xml:space="preserve">Acceso a: </w:t>
-      </w:r>
-    </w:p>
-    <w:p>
-      <w:pPr>
-        <w:numPr>
-          <w:ilvl w:val="2"/>
-          <w:numId w:val="19"/>
-        </w:numPr>
-      </w:pPr>
-      <w:r>
-        <w:t xml:space="preserve">Inicio </w:t>
-      </w:r>
-    </w:p>
-    <w:p>
-      <w:pPr>
-        <w:numPr>
-          <w:ilvl w:val="2"/>
-          <w:numId w:val="19"/>
-        </w:numPr>
-      </w:pPr>
-      <w:r>
-        <w:t xml:space="preserve">Productos </w:t>
-      </w:r>
-    </w:p>
-    <w:p>
-      <w:pPr>
-        <w:numPr>
-          <w:ilvl w:val="2"/>
-          <w:numId w:val="19"/>
-        </w:numPr>
-      </w:pPr>
-      <w:r>
-        <w:t xml:space="preserve">Contacto </w:t>
-      </w:r>
-    </w:p>
-    <w:p>
-      <w:pPr>
-        <w:numPr>
-          <w:ilvl w:val="2"/>
-          <w:numId w:val="19"/>
-        </w:numPr>
-      </w:pPr>
-      <w:r>
-        <w:t>Login</w:t>
-      </w:r>
-    </w:p>
-    <w:p>
-      <w:pPr>
-        <w:ind w:left="720" w:firstLine="0"/>
-      </w:pPr>
-    </w:p>
-    <w:p>
-      <w:pPr>
-        <w:ind w:left="720" w:firstLine="0"/>
-      </w:pPr>
-    </w:p>
-    <w:p>
-      <w:pPr>
-        <w:ind w:left="720" w:firstLine="0"/>
-      </w:pPr>
-    </w:p>
-    <w:p>
-      <w:pPr>
-        <w:ind w:left="720" w:firstLine="0"/>
-      </w:pPr>
+        <w:rPr>
+          <w:noProof/>
+        </w:rPr>
+        <w:drawing>
+          <wp:anchor distT="0" distB="0" distL="114300" distR="114300" simplePos="0" relativeHeight="251671552" behindDoc="0" locked="0" layoutInCell="1" allowOverlap="1" wp14:anchorId="77339539" wp14:editId="4DB1AF7E">
+            <wp:simplePos x="0" y="0"/>
+            <wp:positionH relativeFrom="column">
+              <wp:posOffset>99695</wp:posOffset>
+            </wp:positionH>
+            <wp:positionV relativeFrom="paragraph">
+              <wp:posOffset>512445</wp:posOffset>
+            </wp:positionV>
+            <wp:extent cx="5883910" cy="3689985"/>
+            <wp:effectExtent l="0" t="0" r="2540" b="5715"/>
+            <wp:wrapTopAndBottom/>
+            <wp:docPr id="1258987095" name="Imagen 1"/>
+            <wp:cNvGraphicFramePr>
+              <a:graphicFrameLocks xmlns:a="http://schemas.openxmlformats.org/drawingml/2006/main" noChangeAspect="1"/>
+            </wp:cNvGraphicFramePr>
+            <a:graphic xmlns:a="http://schemas.openxmlformats.org/drawingml/2006/main">
+              <a:graphicData uri="http://schemas.openxmlformats.org/drawingml/2006/picture">
+                <pic:pic xmlns:pic="http://schemas.openxmlformats.org/drawingml/2006/picture">
+                  <pic:nvPicPr>
+                    <pic:cNvPr id="1258987095" name=""/>
+                    <pic:cNvPicPr/>
+                  </pic:nvPicPr>
+                  <pic:blipFill>
+                    <a:blip r:embed="rId18">
+                      <a:extLst>
+                        <a:ext uri="{28A0092B-C50C-407E-A947-70E740481C1C}">
+                          <a14:useLocalDpi xmlns:a14="http://schemas.microsoft.com/office/drawing/2010/main" val="0"/>
+                        </a:ext>
+                      </a:extLst>
+                    </a:blip>
+                    <a:stretch>
+                      <a:fillRect/>
+                    </a:stretch>
+                  </pic:blipFill>
+                  <pic:spPr>
+                    <a:xfrm>
+                      <a:off x="0" y="0"/>
+                      <a:ext cx="5883910" cy="3689985"/>
+                    </a:xfrm>
+                    <a:prstGeom prst="rect">
+                      <a:avLst/>
+                    </a:prstGeom>
+                  </pic:spPr>
+                </pic:pic>
+              </a:graphicData>
+            </a:graphic>
+          </wp:anchor>
+        </w:drawing>
+      </w:r>
+      <w:r>
+        <w:t>Pantalla de marketing</w:t>
+      </w:r>
     </w:p>
     <w:p>
       <w:pPr>
@@ -13640,7 +14240,132 @@
         </w:numPr>
       </w:pPr>
       <w:r>
-        <w:t xml:space="preserve">Catálogo general </w:t>
+        <w:t>Catálogo general</w:t>
+      </w:r>
+      <w:r>
+        <w:t xml:space="preserve">, </w:t>
+      </w:r>
+      <w:r>
+        <w:t xml:space="preserve">Filtros </w:t>
+      </w:r>
+      <w:r>
+        <w:t xml:space="preserve">y </w:t>
+      </w:r>
+      <w:r>
+        <w:t>Buscador</w:t>
+      </w:r>
+    </w:p>
+    <w:p>
+      <w:pPr>
+        <w:ind w:left="1440" w:firstLine="0"/>
+      </w:pPr>
+      <w:r>
+        <w:rPr>
+          <w:noProof/>
+        </w:rPr>
+        <w:drawing>
+          <wp:anchor distT="0" distB="0" distL="114300" distR="114300" simplePos="0" relativeHeight="251672576" behindDoc="0" locked="0" layoutInCell="1" allowOverlap="1" wp14:anchorId="1B3D9F12" wp14:editId="1F3B30C5">
+            <wp:simplePos x="0" y="0"/>
+            <wp:positionH relativeFrom="column">
+              <wp:posOffset>204470</wp:posOffset>
+            </wp:positionH>
+            <wp:positionV relativeFrom="paragraph">
+              <wp:posOffset>170815</wp:posOffset>
+            </wp:positionV>
+            <wp:extent cx="5883910" cy="3302000"/>
+            <wp:effectExtent l="0" t="0" r="2540" b="0"/>
+            <wp:wrapTopAndBottom/>
+            <wp:docPr id="1499908863" name="Imagen 1"/>
+            <wp:cNvGraphicFramePr>
+              <a:graphicFrameLocks xmlns:a="http://schemas.openxmlformats.org/drawingml/2006/main" noChangeAspect="1"/>
+            </wp:cNvGraphicFramePr>
+            <a:graphic xmlns:a="http://schemas.openxmlformats.org/drawingml/2006/main">
+              <a:graphicData uri="http://schemas.openxmlformats.org/drawingml/2006/picture">
+                <pic:pic xmlns:pic="http://schemas.openxmlformats.org/drawingml/2006/picture">
+                  <pic:nvPicPr>
+                    <pic:cNvPr id="1499908863" name=""/>
+                    <pic:cNvPicPr/>
+                  </pic:nvPicPr>
+                  <pic:blipFill>
+                    <a:blip r:embed="rId19">
+                      <a:extLst>
+                        <a:ext uri="{28A0092B-C50C-407E-A947-70E740481C1C}">
+                          <a14:useLocalDpi xmlns:a14="http://schemas.microsoft.com/office/drawing/2010/main" val="0"/>
+                        </a:ext>
+                      </a:extLst>
+                    </a:blip>
+                    <a:stretch>
+                      <a:fillRect/>
+                    </a:stretch>
+                  </pic:blipFill>
+                  <pic:spPr>
+                    <a:xfrm>
+                      <a:off x="0" y="0"/>
+                      <a:ext cx="5883910" cy="3302000"/>
+                    </a:xfrm>
+                    <a:prstGeom prst="rect">
+                      <a:avLst/>
+                    </a:prstGeom>
+                  </pic:spPr>
+                </pic:pic>
+              </a:graphicData>
+            </a:graphic>
+          </wp:anchor>
+        </w:drawing>
+      </w:r>
+    </w:p>
+    <w:p>
+      <w:pPr>
+        <w:ind w:left="1440" w:firstLine="0"/>
+      </w:pPr>
+    </w:p>
+    <w:p>
+      <w:pPr>
+        <w:ind w:left="1440" w:firstLine="0"/>
+      </w:pPr>
+    </w:p>
+    <w:p>
+      <w:pPr>
+        <w:ind w:left="1440" w:firstLine="0"/>
+      </w:pPr>
+    </w:p>
+    <w:p>
+      <w:pPr>
+        <w:ind w:left="1440" w:firstLine="0"/>
+      </w:pPr>
+    </w:p>
+    <w:p>
+      <w:pPr>
+        <w:ind w:left="1440" w:firstLine="0"/>
+      </w:pPr>
+    </w:p>
+    <w:p>
+      <w:pPr>
+        <w:ind w:left="1440" w:firstLine="0"/>
+      </w:pPr>
+    </w:p>
+    <w:p>
+      <w:pPr>
+        <w:ind w:left="1440" w:firstLine="0"/>
+      </w:pPr>
+    </w:p>
+    <w:p>
+      <w:pPr>
+        <w:numPr>
+          <w:ilvl w:val="0"/>
+          <w:numId w:val="20"/>
+        </w:numPr>
+      </w:pPr>
+      <w:r>
+        <w:rPr>
+          <w:b/>
+          <w:bCs/>
+        </w:rPr>
+        <w:lastRenderedPageBreak/>
+        <w:t>Detalle del producto</w:t>
+      </w:r>
+      <w:r>
+        <w:t xml:space="preserve"> </w:t>
       </w:r>
     </w:p>
     <w:p>
@@ -13651,110 +14376,155 @@
         </w:numPr>
       </w:pPr>
       <w:r>
-        <w:t xml:space="preserve">Filtros </w:t>
-      </w:r>
-    </w:p>
-    <w:p>
-      <w:pPr>
-        <w:numPr>
-          <w:ilvl w:val="1"/>
-          <w:numId w:val="20"/>
-        </w:numPr>
-      </w:pPr>
-      <w:r>
-        <w:t xml:space="preserve">Buscador </w:t>
-      </w:r>
-    </w:p>
-    <w:p>
-      <w:pPr>
-        <w:numPr>
-          <w:ilvl w:val="0"/>
-          <w:numId w:val="20"/>
-        </w:numPr>
-      </w:pPr>
-      <w:r>
+        <w:t>Imagen</w:t>
+      </w:r>
+      <w:r>
+        <w:t xml:space="preserve">, </w:t>
+      </w:r>
+      <w:r>
+        <w:t>Descripción</w:t>
+      </w:r>
+      <w:r>
+        <w:t xml:space="preserve">, </w:t>
+      </w:r>
+      <w:r>
+        <w:t>Precio</w:t>
+      </w:r>
+      <w:r>
+        <w:t xml:space="preserve">, </w:t>
+      </w:r>
+      <w:r>
+        <w:t xml:space="preserve">Botón agregar al carrito </w:t>
+      </w:r>
+      <w:r>
+        <w:t xml:space="preserve">y </w:t>
+      </w:r>
+      <w:r>
+        <w:t>Botón WhatsApp</w:t>
+      </w:r>
+    </w:p>
+    <w:p>
+      <w:pPr>
+        <w:ind w:left="1440" w:firstLine="0"/>
+      </w:pPr>
+      <w:r>
+        <w:rPr>
+          <w:noProof/>
+        </w:rPr>
+        <w:drawing>
+          <wp:anchor distT="0" distB="0" distL="114300" distR="114300" simplePos="0" relativeHeight="251673600" behindDoc="0" locked="0" layoutInCell="1" allowOverlap="1" wp14:anchorId="568922D3" wp14:editId="78961D7E">
+            <wp:simplePos x="0" y="0"/>
+            <wp:positionH relativeFrom="margin">
+              <wp:align>left</wp:align>
+            </wp:positionH>
+            <wp:positionV relativeFrom="paragraph">
+              <wp:posOffset>266700</wp:posOffset>
+            </wp:positionV>
+            <wp:extent cx="5883910" cy="3579495"/>
+            <wp:effectExtent l="0" t="0" r="2540" b="1905"/>
+            <wp:wrapTopAndBottom/>
+            <wp:docPr id="802895143" name="Imagen 1"/>
+            <wp:cNvGraphicFramePr>
+              <a:graphicFrameLocks xmlns:a="http://schemas.openxmlformats.org/drawingml/2006/main" noChangeAspect="1"/>
+            </wp:cNvGraphicFramePr>
+            <a:graphic xmlns:a="http://schemas.openxmlformats.org/drawingml/2006/main">
+              <a:graphicData uri="http://schemas.openxmlformats.org/drawingml/2006/picture">
+                <pic:pic xmlns:pic="http://schemas.openxmlformats.org/drawingml/2006/picture">
+                  <pic:nvPicPr>
+                    <pic:cNvPr id="802895143" name=""/>
+                    <pic:cNvPicPr/>
+                  </pic:nvPicPr>
+                  <pic:blipFill>
+                    <a:blip r:embed="rId20">
+                      <a:extLst>
+                        <a:ext uri="{28A0092B-C50C-407E-A947-70E740481C1C}">
+                          <a14:useLocalDpi xmlns:a14="http://schemas.microsoft.com/office/drawing/2010/main" val="0"/>
+                        </a:ext>
+                      </a:extLst>
+                    </a:blip>
+                    <a:stretch>
+                      <a:fillRect/>
+                    </a:stretch>
+                  </pic:blipFill>
+                  <pic:spPr>
+                    <a:xfrm>
+                      <a:off x="0" y="0"/>
+                      <a:ext cx="5883910" cy="3579495"/>
+                    </a:xfrm>
+                    <a:prstGeom prst="rect">
+                      <a:avLst/>
+                    </a:prstGeom>
+                  </pic:spPr>
+                </pic:pic>
+              </a:graphicData>
+            </a:graphic>
+          </wp:anchor>
+        </w:drawing>
+      </w:r>
+    </w:p>
+    <w:p>
+      <w:pPr>
+        <w:ind w:left="1080" w:firstLine="0"/>
+      </w:pPr>
+    </w:p>
+    <w:p>
+      <w:pPr>
+        <w:ind w:left="1440" w:firstLine="0"/>
+      </w:pPr>
+    </w:p>
+    <w:p>
+      <w:pPr>
+        <w:ind w:left="720" w:firstLine="0"/>
+      </w:pPr>
+    </w:p>
+    <w:p>
+      <w:pPr>
+        <w:ind w:left="720" w:firstLine="0"/>
+      </w:pPr>
+    </w:p>
+    <w:p>
+      <w:pPr>
+        <w:ind w:left="720" w:firstLine="0"/>
+      </w:pPr>
+    </w:p>
+    <w:p>
+      <w:pPr>
+        <w:ind w:left="720" w:firstLine="0"/>
+      </w:pPr>
+    </w:p>
+    <w:p>
+      <w:pPr>
+        <w:ind w:left="720" w:firstLine="0"/>
+      </w:pPr>
+    </w:p>
+    <w:p>
+      <w:pPr>
+        <w:ind w:left="720" w:firstLine="0"/>
+      </w:pPr>
+    </w:p>
+    <w:p>
+      <w:pPr>
+        <w:ind w:left="720" w:firstLine="0"/>
+      </w:pPr>
+    </w:p>
+    <w:p>
+      <w:pPr>
+        <w:ind w:left="720" w:firstLine="0"/>
+      </w:pPr>
+    </w:p>
+    <w:p>
+      <w:pPr>
         <w:rPr>
           <w:b/>
           <w:bCs/>
         </w:rPr>
-        <w:t>Detalle del producto</w:t>
-      </w:r>
-      <w:r>
-        <w:t xml:space="preserve"> </w:t>
-      </w:r>
-    </w:p>
-    <w:p>
-      <w:pPr>
-        <w:numPr>
-          <w:ilvl w:val="1"/>
-          <w:numId w:val="20"/>
-        </w:numPr>
-      </w:pPr>
-      <w:r>
-        <w:t xml:space="preserve">Imagen </w:t>
-      </w:r>
-    </w:p>
-    <w:p>
-      <w:pPr>
-        <w:numPr>
-          <w:ilvl w:val="1"/>
-          <w:numId w:val="20"/>
-        </w:numPr>
-      </w:pPr>
-      <w:r>
-        <w:t xml:space="preserve">Descripción </w:t>
-      </w:r>
-    </w:p>
-    <w:p>
-      <w:pPr>
-        <w:numPr>
-          <w:ilvl w:val="1"/>
-          <w:numId w:val="20"/>
-        </w:numPr>
-      </w:pPr>
-      <w:r>
-        <w:t xml:space="preserve">Precio </w:t>
-      </w:r>
-    </w:p>
-    <w:p>
-      <w:pPr>
-        <w:numPr>
-          <w:ilvl w:val="1"/>
-          <w:numId w:val="20"/>
-        </w:numPr>
-      </w:pPr>
-      <w:r>
-        <w:t xml:space="preserve">Botón agregar al carrito </w:t>
-      </w:r>
-    </w:p>
-    <w:p>
-      <w:pPr>
-        <w:numPr>
-          <w:ilvl w:val="1"/>
-          <w:numId w:val="20"/>
-        </w:numPr>
-      </w:pPr>
-      <w:r>
-        <w:t>Botón WhatsApp</w:t>
-      </w:r>
-    </w:p>
-    <w:p>
-      <w:pPr>
-        <w:ind w:left="720" w:firstLine="0"/>
-      </w:pPr>
-    </w:p>
-    <w:p>
-      <w:pPr>
+      </w:pPr>
+      <w:r>
         <w:rPr>
           <w:b/>
           <w:bCs/>
         </w:rPr>
-      </w:pPr>
-      <w:r>
-        <w:rPr>
-          <w:b/>
-          <w:bCs/>
-        </w:rPr>
+        <w:lastRenderedPageBreak/>
         <w:t>Módulo: Carrito y compras</w:t>
       </w:r>
     </w:p>
@@ -13796,7 +14566,251 @@
         </w:numPr>
       </w:pPr>
       <w:r>
-        <w:t xml:space="preserve">Lista de productos </w:t>
+        <w:rPr>
+          <w:noProof/>
+        </w:rPr>
+        <w:drawing>
+          <wp:anchor distT="0" distB="0" distL="114300" distR="114300" simplePos="0" relativeHeight="251674624" behindDoc="0" locked="0" layoutInCell="1" allowOverlap="1" wp14:anchorId="6E648C6D" wp14:editId="5E2CB83D">
+            <wp:simplePos x="0" y="0"/>
+            <wp:positionH relativeFrom="column">
+              <wp:posOffset>147320</wp:posOffset>
+            </wp:positionH>
+            <wp:positionV relativeFrom="paragraph">
+              <wp:posOffset>373380</wp:posOffset>
+            </wp:positionV>
+            <wp:extent cx="5883910" cy="3681730"/>
+            <wp:effectExtent l="0" t="0" r="2540" b="0"/>
+            <wp:wrapTopAndBottom/>
+            <wp:docPr id="920904991" name="Imagen 1"/>
+            <wp:cNvGraphicFramePr>
+              <a:graphicFrameLocks xmlns:a="http://schemas.openxmlformats.org/drawingml/2006/main" noChangeAspect="1"/>
+            </wp:cNvGraphicFramePr>
+            <a:graphic xmlns:a="http://schemas.openxmlformats.org/drawingml/2006/main">
+              <a:graphicData uri="http://schemas.openxmlformats.org/drawingml/2006/picture">
+                <pic:pic xmlns:pic="http://schemas.openxmlformats.org/drawingml/2006/picture">
+                  <pic:nvPicPr>
+                    <pic:cNvPr id="920904991" name=""/>
+                    <pic:cNvPicPr/>
+                  </pic:nvPicPr>
+                  <pic:blipFill>
+                    <a:blip r:embed="rId21">
+                      <a:extLst>
+                        <a:ext uri="{28A0092B-C50C-407E-A947-70E740481C1C}">
+                          <a14:useLocalDpi xmlns:a14="http://schemas.microsoft.com/office/drawing/2010/main" val="0"/>
+                        </a:ext>
+                      </a:extLst>
+                    </a:blip>
+                    <a:stretch>
+                      <a:fillRect/>
+                    </a:stretch>
+                  </pic:blipFill>
+                  <pic:spPr>
+                    <a:xfrm>
+                      <a:off x="0" y="0"/>
+                      <a:ext cx="5883910" cy="3681730"/>
+                    </a:xfrm>
+                    <a:prstGeom prst="rect">
+                      <a:avLst/>
+                    </a:prstGeom>
+                  </pic:spPr>
+                </pic:pic>
+              </a:graphicData>
+            </a:graphic>
+          </wp:anchor>
+        </w:drawing>
+      </w:r>
+      <w:r>
+        <w:t>Lista de productos</w:t>
+      </w:r>
+      <w:r>
+        <w:t xml:space="preserve">, </w:t>
+      </w:r>
+      <w:r>
+        <w:t>Cantidad</w:t>
+      </w:r>
+      <w:r>
+        <w:t xml:space="preserve">, </w:t>
+      </w:r>
+      <w:r>
+        <w:t>Eliminar producto</w:t>
+      </w:r>
+      <w:r>
+        <w:t xml:space="preserve">, </w:t>
+      </w:r>
+      <w:r>
+        <w:t xml:space="preserve">Total </w:t>
+      </w:r>
+    </w:p>
+    <w:p>
+      <w:pPr>
+        <w:ind w:left="1440" w:firstLine="0"/>
+      </w:pPr>
+    </w:p>
+    <w:p>
+      <w:pPr>
+        <w:ind w:left="0" w:firstLine="0"/>
+      </w:pPr>
+    </w:p>
+    <w:p>
+      <w:pPr>
+        <w:ind w:left="0" w:firstLine="0"/>
+      </w:pPr>
+    </w:p>
+    <w:p>
+      <w:pPr>
+        <w:ind w:left="0" w:firstLine="0"/>
+      </w:pPr>
+    </w:p>
+    <w:p>
+      <w:pPr>
+        <w:ind w:left="0" w:firstLine="0"/>
+      </w:pPr>
+    </w:p>
+    <w:p>
+      <w:pPr>
+        <w:ind w:left="0" w:firstLine="0"/>
+      </w:pPr>
+    </w:p>
+    <w:p>
+      <w:pPr>
+        <w:ind w:left="0" w:firstLine="0"/>
+      </w:pPr>
+    </w:p>
+    <w:p>
+      <w:pPr>
+        <w:ind w:left="0" w:firstLine="0"/>
+      </w:pPr>
+    </w:p>
+    <w:p>
+      <w:pPr>
+        <w:ind w:left="0" w:firstLine="0"/>
+      </w:pPr>
+    </w:p>
+    <w:p>
+      <w:pPr>
+        <w:numPr>
+          <w:ilvl w:val="0"/>
+          <w:numId w:val="21"/>
+        </w:numPr>
+      </w:pPr>
+      <w:r>
+        <w:rPr>
+          <w:b/>
+          <w:bCs/>
+        </w:rPr>
+        <w:lastRenderedPageBreak/>
+        <w:t>Checkout / datos de compra</w:t>
+      </w:r>
+      <w:r>
+        <w:t xml:space="preserve"> </w:t>
+      </w:r>
+    </w:p>
+    <w:p>
+      <w:pPr>
+        <w:ind w:left="1440" w:firstLine="0"/>
+      </w:pPr>
+      <w:r>
+        <w:rPr>
+          <w:noProof/>
+        </w:rPr>
+        <w:drawing>
+          <wp:anchor distT="0" distB="0" distL="114300" distR="114300" simplePos="0" relativeHeight="251675648" behindDoc="0" locked="0" layoutInCell="1" allowOverlap="1" wp14:anchorId="57E90B7B" wp14:editId="047902FF">
+            <wp:simplePos x="0" y="0"/>
+            <wp:positionH relativeFrom="margin">
+              <wp:posOffset>16510</wp:posOffset>
+            </wp:positionH>
+            <wp:positionV relativeFrom="paragraph">
+              <wp:posOffset>378460</wp:posOffset>
+            </wp:positionV>
+            <wp:extent cx="5883910" cy="3663950"/>
+            <wp:effectExtent l="0" t="0" r="2540" b="0"/>
+            <wp:wrapTopAndBottom/>
+            <wp:docPr id="2020415462" name="Imagen 1"/>
+            <wp:cNvGraphicFramePr>
+              <a:graphicFrameLocks xmlns:a="http://schemas.openxmlformats.org/drawingml/2006/main" noChangeAspect="1"/>
+            </wp:cNvGraphicFramePr>
+            <a:graphic xmlns:a="http://schemas.openxmlformats.org/drawingml/2006/main">
+              <a:graphicData uri="http://schemas.openxmlformats.org/drawingml/2006/picture">
+                <pic:pic xmlns:pic="http://schemas.openxmlformats.org/drawingml/2006/picture">
+                  <pic:nvPicPr>
+                    <pic:cNvPr id="2020415462" name=""/>
+                    <pic:cNvPicPr/>
+                  </pic:nvPicPr>
+                  <pic:blipFill>
+                    <a:blip r:embed="rId22">
+                      <a:extLst>
+                        <a:ext uri="{28A0092B-C50C-407E-A947-70E740481C1C}">
+                          <a14:useLocalDpi xmlns:a14="http://schemas.microsoft.com/office/drawing/2010/main" val="0"/>
+                        </a:ext>
+                      </a:extLst>
+                    </a:blip>
+                    <a:stretch>
+                      <a:fillRect/>
+                    </a:stretch>
+                  </pic:blipFill>
+                  <pic:spPr>
+                    <a:xfrm>
+                      <a:off x="0" y="0"/>
+                      <a:ext cx="5883910" cy="3663950"/>
+                    </a:xfrm>
+                    <a:prstGeom prst="rect">
+                      <a:avLst/>
+                    </a:prstGeom>
+                  </pic:spPr>
+                </pic:pic>
+              </a:graphicData>
+            </a:graphic>
+          </wp:anchor>
+        </w:drawing>
+      </w:r>
+      <w:r>
+        <w:t>Nombre</w:t>
+      </w:r>
+      <w:r>
+        <w:t xml:space="preserve">, </w:t>
+      </w:r>
+      <w:r>
+        <w:t>Dirección</w:t>
+      </w:r>
+      <w:r>
+        <w:t xml:space="preserve">, </w:t>
+      </w:r>
+      <w:r>
+        <w:t>Contacto</w:t>
+      </w:r>
+      <w:r>
+        <w:t xml:space="preserve">, </w:t>
+      </w:r>
+      <w:r>
+        <w:t xml:space="preserve">Método de pago </w:t>
+      </w:r>
+    </w:p>
+    <w:p>
+      <w:pPr>
+        <w:ind w:left="1440" w:firstLine="0"/>
+      </w:pPr>
+    </w:p>
+    <w:p>
+      <w:pPr>
+        <w:ind w:left="1440" w:firstLine="0"/>
+      </w:pPr>
+    </w:p>
+    <w:p>
+      <w:pPr>
+        <w:numPr>
+          <w:ilvl w:val="0"/>
+          <w:numId w:val="21"/>
+        </w:numPr>
+      </w:pPr>
+      <w:r>
+        <w:rPr>
+          <w:b/>
+          <w:bCs/>
+        </w:rPr>
+        <w:t>Confirmación de compra</w:t>
+      </w:r>
+      <w:r>
+        <w:t xml:space="preserve"> </w:t>
       </w:r>
     </w:p>
     <w:p>
@@ -13807,29 +14821,49 @@
         </w:numPr>
       </w:pPr>
       <w:r>
-        <w:t xml:space="preserve">Cantidad </w:t>
-      </w:r>
-    </w:p>
-    <w:p>
-      <w:pPr>
-        <w:numPr>
-          <w:ilvl w:val="1"/>
-          <w:numId w:val="21"/>
-        </w:numPr>
-      </w:pPr>
-      <w:r>
-        <w:t xml:space="preserve">Eliminar producto </w:t>
-      </w:r>
-    </w:p>
-    <w:p>
-      <w:pPr>
-        <w:numPr>
-          <w:ilvl w:val="1"/>
-          <w:numId w:val="21"/>
-        </w:numPr>
-      </w:pPr>
-      <w:r>
-        <w:t xml:space="preserve">Total </w:t>
+        <w:t xml:space="preserve">Pedido realizado </w:t>
+      </w:r>
+    </w:p>
+    <w:p>
+      <w:r>
+        <w:rPr>
+          <w:noProof/>
+        </w:rPr>
+        <w:drawing>
+          <wp:inline distT="0" distB="0" distL="0" distR="0" wp14:anchorId="42C974D1" wp14:editId="057B6E60">
+            <wp:extent cx="5883910" cy="2053590"/>
+            <wp:effectExtent l="0" t="0" r="2540" b="3810"/>
+            <wp:docPr id="943431801" name="Imagen 1"/>
+            <wp:cNvGraphicFramePr>
+              <a:graphicFrameLocks xmlns:a="http://schemas.openxmlformats.org/drawingml/2006/main" noChangeAspect="1"/>
+            </wp:cNvGraphicFramePr>
+            <a:graphic xmlns:a="http://schemas.openxmlformats.org/drawingml/2006/main">
+              <a:graphicData uri="http://schemas.openxmlformats.org/drawingml/2006/picture">
+                <pic:pic xmlns:pic="http://schemas.openxmlformats.org/drawingml/2006/picture">
+                  <pic:nvPicPr>
+                    <pic:cNvPr id="943431801" name=""/>
+                    <pic:cNvPicPr/>
+                  </pic:nvPicPr>
+                  <pic:blipFill>
+                    <a:blip r:embed="rId23"/>
+                    <a:stretch>
+                      <a:fillRect/>
+                    </a:stretch>
+                  </pic:blipFill>
+                  <pic:spPr>
+                    <a:xfrm>
+                      <a:off x="0" y="0"/>
+                      <a:ext cx="5883910" cy="2053590"/>
+                    </a:xfrm>
+                    <a:prstGeom prst="rect">
+                      <a:avLst/>
+                    </a:prstGeom>
+                  </pic:spPr>
+                </pic:pic>
+              </a:graphicData>
+            </a:graphic>
+          </wp:inline>
+        </w:drawing>
       </w:r>
     </w:p>
     <w:p>
@@ -13844,109 +14878,7 @@
           <w:b/>
           <w:bCs/>
         </w:rPr>
-        <w:t>Checkout / datos de compra</w:t>
-      </w:r>
-      <w:r>
-        <w:t xml:space="preserve"> </w:t>
-      </w:r>
-    </w:p>
-    <w:p>
-      <w:pPr>
-        <w:numPr>
-          <w:ilvl w:val="1"/>
-          <w:numId w:val="21"/>
-        </w:numPr>
-      </w:pPr>
-      <w:r>
         <w:lastRenderedPageBreak/>
-        <w:t xml:space="preserve">Nombre </w:t>
-      </w:r>
-    </w:p>
-    <w:p>
-      <w:pPr>
-        <w:numPr>
-          <w:ilvl w:val="1"/>
-          <w:numId w:val="21"/>
-        </w:numPr>
-      </w:pPr>
-      <w:r>
-        <w:t xml:space="preserve">Dirección </w:t>
-      </w:r>
-    </w:p>
-    <w:p>
-      <w:pPr>
-        <w:numPr>
-          <w:ilvl w:val="1"/>
-          <w:numId w:val="21"/>
-        </w:numPr>
-      </w:pPr>
-      <w:r>
-        <w:t xml:space="preserve">Contacto </w:t>
-      </w:r>
-    </w:p>
-    <w:p>
-      <w:pPr>
-        <w:numPr>
-          <w:ilvl w:val="1"/>
-          <w:numId w:val="21"/>
-        </w:numPr>
-      </w:pPr>
-      <w:r>
-        <w:t xml:space="preserve">Método de pago </w:t>
-      </w:r>
-    </w:p>
-    <w:p>
-      <w:pPr>
-        <w:numPr>
-          <w:ilvl w:val="0"/>
-          <w:numId w:val="21"/>
-        </w:numPr>
-      </w:pPr>
-      <w:r>
-        <w:rPr>
-          <w:b/>
-          <w:bCs/>
-        </w:rPr>
-        <w:t>Confirmación de compra</w:t>
-      </w:r>
-      <w:r>
-        <w:t xml:space="preserve"> </w:t>
-      </w:r>
-    </w:p>
-    <w:p>
-      <w:pPr>
-        <w:numPr>
-          <w:ilvl w:val="1"/>
-          <w:numId w:val="21"/>
-        </w:numPr>
-      </w:pPr>
-      <w:r>
-        <w:t xml:space="preserve">Pedido realizado </w:t>
-      </w:r>
-    </w:p>
-    <w:p>
-      <w:pPr>
-        <w:numPr>
-          <w:ilvl w:val="1"/>
-          <w:numId w:val="21"/>
-        </w:numPr>
-      </w:pPr>
-      <w:r>
-        <w:t xml:space="preserve">Número de pedido </w:t>
-      </w:r>
-    </w:p>
-    <w:p>
-      <w:pPr>
-        <w:numPr>
-          <w:ilvl w:val="0"/>
-          <w:numId w:val="21"/>
-        </w:numPr>
-      </w:pPr>
-      <w:r>
-        <w:rPr>
-          <w:b/>
-          <w:bCs/>
-        </w:rPr>
         <w:t>Estado del pedido</w:t>
       </w:r>
       <w:r>
@@ -13961,29 +14893,90 @@
         </w:numPr>
       </w:pPr>
       <w:r>
-        <w:t xml:space="preserve">Pendiente </w:t>
-      </w:r>
-    </w:p>
-    <w:p>
-      <w:pPr>
-        <w:numPr>
-          <w:ilvl w:val="0"/>
-          <w:numId w:val="22"/>
-        </w:numPr>
-      </w:pPr>
-      <w:r>
-        <w:t xml:space="preserve">En proceso </w:t>
-      </w:r>
-    </w:p>
-    <w:p>
-      <w:pPr>
-        <w:numPr>
-          <w:ilvl w:val="0"/>
-          <w:numId w:val="22"/>
-        </w:numPr>
-      </w:pPr>
+        <w:t>Pendiente</w:t>
+      </w:r>
+      <w:r>
+        <w:t xml:space="preserve">, </w:t>
+      </w:r>
+      <w:r>
+        <w:t>En proceso</w:t>
+      </w:r>
+      <w:r>
+        <w:t>,</w:t>
+      </w:r>
+      <w:r>
+        <w:t xml:space="preserve"> </w:t>
+      </w:r>
       <w:r>
         <w:t xml:space="preserve">Entregado </w:t>
+      </w:r>
+      <w:r>
+        <w:t>y detalles</w:t>
+      </w:r>
+    </w:p>
+    <w:p>
+      <w:pPr>
+        <w:ind w:left="720" w:firstLine="0"/>
+      </w:pPr>
+      <w:r>
+        <w:rPr>
+          <w:noProof/>
+        </w:rPr>
+        <w:drawing>
+          <wp:anchor distT="0" distB="0" distL="114300" distR="114300" simplePos="0" relativeHeight="251677696" behindDoc="0" locked="0" layoutInCell="1" allowOverlap="1" wp14:anchorId="3CDDC7D5" wp14:editId="7BF2E04B">
+            <wp:simplePos x="0" y="0"/>
+            <wp:positionH relativeFrom="margin">
+              <wp:align>center</wp:align>
+            </wp:positionH>
+            <wp:positionV relativeFrom="paragraph">
+              <wp:posOffset>212090</wp:posOffset>
+            </wp:positionV>
+            <wp:extent cx="6823409" cy="4229100"/>
+            <wp:effectExtent l="0" t="0" r="0" b="0"/>
+            <wp:wrapTopAndBottom/>
+            <wp:docPr id="217075511" name="Imagen 1"/>
+            <wp:cNvGraphicFramePr>
+              <a:graphicFrameLocks xmlns:a="http://schemas.openxmlformats.org/drawingml/2006/main" noChangeAspect="1"/>
+            </wp:cNvGraphicFramePr>
+            <a:graphic xmlns:a="http://schemas.openxmlformats.org/drawingml/2006/main">
+              <a:graphicData uri="http://schemas.openxmlformats.org/drawingml/2006/picture">
+                <pic:pic xmlns:pic="http://schemas.openxmlformats.org/drawingml/2006/picture">
+                  <pic:nvPicPr>
+                    <pic:cNvPr id="217075511" name=""/>
+                    <pic:cNvPicPr/>
+                  </pic:nvPicPr>
+                  <pic:blipFill>
+                    <a:blip r:embed="rId24">
+                      <a:extLst>
+                        <a:ext uri="{28A0092B-C50C-407E-A947-70E740481C1C}">
+                          <a14:useLocalDpi xmlns:a14="http://schemas.microsoft.com/office/drawing/2010/main" val="0"/>
+                        </a:ext>
+                      </a:extLst>
+                    </a:blip>
+                    <a:stretch>
+                      <a:fillRect/>
+                    </a:stretch>
+                  </pic:blipFill>
+                  <pic:spPr>
+                    <a:xfrm>
+                      <a:off x="0" y="0"/>
+                      <a:ext cx="6823409" cy="4229100"/>
+                    </a:xfrm>
+                    <a:prstGeom prst="rect">
+                      <a:avLst/>
+                    </a:prstGeom>
+                  </pic:spPr>
+                </pic:pic>
+              </a:graphicData>
+            </a:graphic>
+            <wp14:sizeRelH relativeFrom="margin">
+              <wp14:pctWidth>0</wp14:pctWidth>
+            </wp14:sizeRelH>
+            <wp14:sizeRelV relativeFrom="margin">
+              <wp14:pctHeight>0</wp14:pctHeight>
+            </wp14:sizeRelV>
+          </wp:anchor>
+        </w:drawing>
       </w:r>
     </w:p>
     <w:p>
@@ -14002,11 +14995,76 @@
       </w:r>
     </w:p>
     <w:p>
-      <w:r>
+      <w:pPr>
         <w:rPr>
           <w:b/>
           <w:bCs/>
         </w:rPr>
+      </w:pPr>
+    </w:p>
+    <w:p>
+      <w:pPr>
+        <w:rPr>
+          <w:b/>
+          <w:bCs/>
+        </w:rPr>
+      </w:pPr>
+    </w:p>
+    <w:p>
+      <w:pPr>
+        <w:rPr>
+          <w:b/>
+          <w:bCs/>
+        </w:rPr>
+      </w:pPr>
+    </w:p>
+    <w:p>
+      <w:pPr>
+        <w:rPr>
+          <w:b/>
+          <w:bCs/>
+        </w:rPr>
+      </w:pPr>
+    </w:p>
+    <w:p>
+      <w:pPr>
+        <w:rPr>
+          <w:b/>
+          <w:bCs/>
+        </w:rPr>
+      </w:pPr>
+    </w:p>
+    <w:p>
+      <w:pPr>
+        <w:rPr>
+          <w:b/>
+          <w:bCs/>
+        </w:rPr>
+      </w:pPr>
+    </w:p>
+    <w:p>
+      <w:pPr>
+        <w:rPr>
+          <w:b/>
+          <w:bCs/>
+        </w:rPr>
+      </w:pPr>
+    </w:p>
+    <w:p>
+      <w:pPr>
+        <w:rPr>
+          <w:b/>
+          <w:bCs/>
+        </w:rPr>
+      </w:pPr>
+    </w:p>
+    <w:p>
+      <w:r>
+        <w:rPr>
+          <w:b/>
+          <w:bCs/>
+        </w:rPr>
+        <w:lastRenderedPageBreak/>
         <w:t>Pantallas:</w:t>
       </w:r>
     </w:p>
@@ -14019,6 +15077,66 @@
       </w:pPr>
       <w:r>
         <w:rPr>
+          <w:noProof/>
+        </w:rPr>
+        <w:drawing>
+          <wp:anchor distT="0" distB="0" distL="114300" distR="114300" simplePos="0" relativeHeight="251676672" behindDoc="0" locked="0" layoutInCell="1" allowOverlap="1" wp14:anchorId="1D1CBEFD" wp14:editId="452B82FC">
+            <wp:simplePos x="0" y="0"/>
+            <wp:positionH relativeFrom="column">
+              <wp:posOffset>642620</wp:posOffset>
+            </wp:positionH>
+            <wp:positionV relativeFrom="paragraph">
+              <wp:posOffset>432435</wp:posOffset>
+            </wp:positionV>
+            <wp:extent cx="4866005" cy="4057650"/>
+            <wp:effectExtent l="0" t="0" r="0" b="0"/>
+            <wp:wrapTopAndBottom/>
+            <wp:docPr id="191976468" name="Imagen 1"/>
+            <wp:cNvGraphicFramePr>
+              <a:graphicFrameLocks xmlns:a="http://schemas.openxmlformats.org/drawingml/2006/main" noChangeAspect="1"/>
+            </wp:cNvGraphicFramePr>
+            <a:graphic xmlns:a="http://schemas.openxmlformats.org/drawingml/2006/main">
+              <a:graphicData uri="http://schemas.openxmlformats.org/drawingml/2006/picture">
+                <pic:pic xmlns:pic="http://schemas.openxmlformats.org/drawingml/2006/picture">
+                  <pic:nvPicPr>
+                    <pic:cNvPr id="191976468" name=""/>
+                    <pic:cNvPicPr/>
+                  </pic:nvPicPr>
+                  <pic:blipFill>
+                    <a:blip r:embed="rId25">
+                      <a:extLst>
+                        <a:ext uri="{28A0092B-C50C-407E-A947-70E740481C1C}">
+                          <a14:useLocalDpi xmlns:a14="http://schemas.microsoft.com/office/drawing/2010/main" val="0"/>
+                        </a:ext>
+                      </a:extLst>
+                    </a:blip>
+                    <a:stretch>
+                      <a:fillRect/>
+                    </a:stretch>
+                  </pic:blipFill>
+                  <pic:spPr>
+                    <a:xfrm>
+                      <a:off x="0" y="0"/>
+                      <a:ext cx="4866005" cy="4057650"/>
+                    </a:xfrm>
+                    <a:prstGeom prst="rect">
+                      <a:avLst/>
+                    </a:prstGeom>
+                  </pic:spPr>
+                </pic:pic>
+              </a:graphicData>
+            </a:graphic>
+            <wp14:sizeRelH relativeFrom="margin">
+              <wp14:pctWidth>0</wp14:pctWidth>
+            </wp14:sizeRelH>
+            <wp14:sizeRelV relativeFrom="margin">
+              <wp14:pctHeight>0</wp14:pctHeight>
+            </wp14:sizeRelV>
+          </wp:anchor>
+        </w:drawing>
+      </w:r>
+      <w:r>
+        <w:rPr>
           <w:b/>
           <w:bCs/>
         </w:rPr>
@@ -14027,6 +15145,51 @@
       <w:r>
         <w:t xml:space="preserve"> </w:t>
       </w:r>
+    </w:p>
+    <w:p>
+      <w:pPr>
+        <w:ind w:left="720" w:firstLine="0"/>
+      </w:pPr>
+    </w:p>
+    <w:p>
+      <w:pPr>
+        <w:ind w:left="720" w:firstLine="0"/>
+      </w:pPr>
+    </w:p>
+    <w:p>
+      <w:pPr>
+        <w:ind w:left="720" w:firstLine="0"/>
+      </w:pPr>
+    </w:p>
+    <w:p>
+      <w:pPr>
+        <w:ind w:left="720" w:firstLine="0"/>
+      </w:pPr>
+    </w:p>
+    <w:p>
+      <w:pPr>
+        <w:ind w:left="720" w:firstLine="0"/>
+      </w:pPr>
+    </w:p>
+    <w:p>
+      <w:pPr>
+        <w:ind w:left="720" w:firstLine="0"/>
+      </w:pPr>
+    </w:p>
+    <w:p>
+      <w:pPr>
+        <w:ind w:left="720" w:firstLine="0"/>
+      </w:pPr>
+    </w:p>
+    <w:p>
+      <w:pPr>
+        <w:ind w:left="720" w:firstLine="0"/>
+      </w:pPr>
+    </w:p>
+    <w:p>
+      <w:pPr>
+        <w:ind w:left="720" w:firstLine="0"/>
+      </w:pPr>
     </w:p>
     <w:p>
       <w:pPr>
@@ -14037,6 +15200,67 @@
       </w:pPr>
       <w:r>
         <w:rPr>
+          <w:noProof/>
+        </w:rPr>
+        <w:lastRenderedPageBreak/>
+        <w:drawing>
+          <wp:anchor distT="0" distB="0" distL="114300" distR="114300" simplePos="0" relativeHeight="251678720" behindDoc="0" locked="0" layoutInCell="1" allowOverlap="1" wp14:anchorId="1DCE632C" wp14:editId="727A5A2E">
+            <wp:simplePos x="0" y="0"/>
+            <wp:positionH relativeFrom="margin">
+              <wp:align>center</wp:align>
+            </wp:positionH>
+            <wp:positionV relativeFrom="paragraph">
+              <wp:posOffset>271145</wp:posOffset>
+            </wp:positionV>
+            <wp:extent cx="4792345" cy="4514850"/>
+            <wp:effectExtent l="0" t="0" r="8255" b="0"/>
+            <wp:wrapTopAndBottom/>
+            <wp:docPr id="2015004632" name="Imagen 1"/>
+            <wp:cNvGraphicFramePr>
+              <a:graphicFrameLocks xmlns:a="http://schemas.openxmlformats.org/drawingml/2006/main" noChangeAspect="1"/>
+            </wp:cNvGraphicFramePr>
+            <a:graphic xmlns:a="http://schemas.openxmlformats.org/drawingml/2006/main">
+              <a:graphicData uri="http://schemas.openxmlformats.org/drawingml/2006/picture">
+                <pic:pic xmlns:pic="http://schemas.openxmlformats.org/drawingml/2006/picture">
+                  <pic:nvPicPr>
+                    <pic:cNvPr id="2015004632" name=""/>
+                    <pic:cNvPicPr/>
+                  </pic:nvPicPr>
+                  <pic:blipFill>
+                    <a:blip r:embed="rId26">
+                      <a:extLst>
+                        <a:ext uri="{28A0092B-C50C-407E-A947-70E740481C1C}">
+                          <a14:useLocalDpi xmlns:a14="http://schemas.microsoft.com/office/drawing/2010/main" val="0"/>
+                        </a:ext>
+                      </a:extLst>
+                    </a:blip>
+                    <a:stretch>
+                      <a:fillRect/>
+                    </a:stretch>
+                  </pic:blipFill>
+                  <pic:spPr>
+                    <a:xfrm>
+                      <a:off x="0" y="0"/>
+                      <a:ext cx="4792345" cy="4514850"/>
+                    </a:xfrm>
+                    <a:prstGeom prst="rect">
+                      <a:avLst/>
+                    </a:prstGeom>
+                  </pic:spPr>
+                </pic:pic>
+              </a:graphicData>
+            </a:graphic>
+            <wp14:sizeRelH relativeFrom="margin">
+              <wp14:pctWidth>0</wp14:pctWidth>
+            </wp14:sizeRelH>
+            <wp14:sizeRelV relativeFrom="margin">
+              <wp14:pctHeight>0</wp14:pctHeight>
+            </wp14:sizeRelV>
+          </wp:anchor>
+        </w:drawing>
+      </w:r>
+      <w:r>
+        <w:rPr>
           <w:b/>
           <w:bCs/>
         </w:rPr>
@@ -14046,6 +15270,17 @@
         <w:t xml:space="preserve"> </w:t>
       </w:r>
     </w:p>
+    <w:p/>
+    <w:p/>
+    <w:p/>
+    <w:p/>
+    <w:p/>
+    <w:p/>
+    <w:p/>
+    <w:p/>
+    <w:p/>
+    <w:p/>
+    <w:p/>
     <w:p>
       <w:pPr>
         <w:numPr>
@@ -14055,42 +15290,119 @@
       </w:pPr>
       <w:r>
         <w:rPr>
+          <w:noProof/>
+        </w:rPr>
+        <w:drawing>
+          <wp:anchor distT="0" distB="0" distL="114300" distR="114300" simplePos="0" relativeHeight="251679744" behindDoc="0" locked="0" layoutInCell="1" allowOverlap="1" wp14:anchorId="149C2361" wp14:editId="3878D3E2">
+            <wp:simplePos x="0" y="0"/>
+            <wp:positionH relativeFrom="page">
+              <wp:align>center</wp:align>
+            </wp:positionH>
+            <wp:positionV relativeFrom="paragraph">
+              <wp:posOffset>413385</wp:posOffset>
+            </wp:positionV>
+            <wp:extent cx="5172075" cy="4391025"/>
+            <wp:effectExtent l="0" t="0" r="9525" b="9525"/>
+            <wp:wrapTopAndBottom/>
+            <wp:docPr id="212784531" name="Imagen 1"/>
+            <wp:cNvGraphicFramePr>
+              <a:graphicFrameLocks xmlns:a="http://schemas.openxmlformats.org/drawingml/2006/main" noChangeAspect="1"/>
+            </wp:cNvGraphicFramePr>
+            <a:graphic xmlns:a="http://schemas.openxmlformats.org/drawingml/2006/main">
+              <a:graphicData uri="http://schemas.openxmlformats.org/drawingml/2006/picture">
+                <pic:pic xmlns:pic="http://schemas.openxmlformats.org/drawingml/2006/picture">
+                  <pic:nvPicPr>
+                    <pic:cNvPr id="212784531" name=""/>
+                    <pic:cNvPicPr/>
+                  </pic:nvPicPr>
+                  <pic:blipFill>
+                    <a:blip r:embed="rId27">
+                      <a:extLst>
+                        <a:ext uri="{28A0092B-C50C-407E-A947-70E740481C1C}">
+                          <a14:useLocalDpi xmlns:a14="http://schemas.microsoft.com/office/drawing/2010/main" val="0"/>
+                        </a:ext>
+                      </a:extLst>
+                    </a:blip>
+                    <a:stretch>
+                      <a:fillRect/>
+                    </a:stretch>
+                  </pic:blipFill>
+                  <pic:spPr>
+                    <a:xfrm>
+                      <a:off x="0" y="0"/>
+                      <a:ext cx="5172075" cy="4391025"/>
+                    </a:xfrm>
+                    <a:prstGeom prst="rect">
+                      <a:avLst/>
+                    </a:prstGeom>
+                  </pic:spPr>
+                </pic:pic>
+              </a:graphicData>
+            </a:graphic>
+          </wp:anchor>
+        </w:drawing>
+      </w:r>
+      <w:r>
+        <w:rPr>
           <w:b/>
           <w:bCs/>
         </w:rPr>
         <w:t>Recuperar contraseña</w:t>
       </w:r>
-      <w:r>
-        <w:t xml:space="preserve"> </w:t>
-      </w:r>
-    </w:p>
-    <w:p>
-      <w:pPr>
-        <w:numPr>
-          <w:ilvl w:val="0"/>
-          <w:numId w:val="23"/>
-        </w:numPr>
-      </w:pPr>
-      <w:r>
+    </w:p>
+    <w:p>
+      <w:pPr>
+        <w:ind w:left="720" w:firstLine="0"/>
+      </w:pPr>
+    </w:p>
+    <w:p>
+      <w:pPr>
+        <w:ind w:left="0" w:firstLine="0"/>
+      </w:pPr>
+    </w:p>
+    <w:p>
+      <w:pPr>
+        <w:ind w:left="0" w:firstLine="0"/>
+      </w:pPr>
+    </w:p>
+    <w:p>
+      <w:pPr>
+        <w:ind w:left="720" w:firstLine="0"/>
+      </w:pPr>
+    </w:p>
+    <w:p>
+      <w:pPr>
+        <w:ind w:left="720" w:firstLine="0"/>
+      </w:pPr>
+    </w:p>
+    <w:p>
+      <w:pPr>
+        <w:ind w:left="720" w:firstLine="0"/>
+      </w:pPr>
+    </w:p>
+    <w:p>
+      <w:pPr>
+        <w:ind w:left="720" w:firstLine="0"/>
+      </w:pPr>
+    </w:p>
+    <w:p>
+      <w:pPr>
+        <w:ind w:left="720" w:firstLine="0"/>
+      </w:pPr>
+    </w:p>
+    <w:p>
+      <w:pPr>
         <w:rPr>
           <w:b/>
           <w:bCs/>
         </w:rPr>
-        <w:t>Cerrar sesión / perfil usuario</w:t>
-      </w:r>
-    </w:p>
-    <w:p>
-      <w:pPr>
+      </w:pPr>
+      <w:r>
         <w:rPr>
           <w:b/>
           <w:bCs/>
         </w:rPr>
-      </w:pPr>
-      <w:r>
-        <w:rPr>
-          <w:b/>
-          <w:bCs/>
-        </w:rPr>
+        <w:lastRenderedPageBreak/>
         <w:t>Módulo: Interacción con el cliente</w:t>
       </w:r>
     </w:p>
@@ -14112,6 +15424,60 @@
       </w:pPr>
       <w:r>
         <w:rPr>
+          <w:noProof/>
+        </w:rPr>
+        <w:drawing>
+          <wp:anchor distT="0" distB="0" distL="114300" distR="114300" simplePos="0" relativeHeight="251680768" behindDoc="0" locked="0" layoutInCell="1" allowOverlap="1" wp14:anchorId="09BA182A" wp14:editId="7D71009A">
+            <wp:simplePos x="0" y="0"/>
+            <wp:positionH relativeFrom="margin">
+              <wp:align>right</wp:align>
+            </wp:positionH>
+            <wp:positionV relativeFrom="paragraph">
+              <wp:posOffset>278765</wp:posOffset>
+            </wp:positionV>
+            <wp:extent cx="5857875" cy="4752975"/>
+            <wp:effectExtent l="0" t="0" r="9525" b="9525"/>
+            <wp:wrapTopAndBottom/>
+            <wp:docPr id="1136984947" name="Imagen 1"/>
+            <wp:cNvGraphicFramePr>
+              <a:graphicFrameLocks xmlns:a="http://schemas.openxmlformats.org/drawingml/2006/main" noChangeAspect="1"/>
+            </wp:cNvGraphicFramePr>
+            <a:graphic xmlns:a="http://schemas.openxmlformats.org/drawingml/2006/main">
+              <a:graphicData uri="http://schemas.openxmlformats.org/drawingml/2006/picture">
+                <pic:pic xmlns:pic="http://schemas.openxmlformats.org/drawingml/2006/picture">
+                  <pic:nvPicPr>
+                    <pic:cNvPr id="1136984947" name=""/>
+                    <pic:cNvPicPr/>
+                  </pic:nvPicPr>
+                  <pic:blipFill>
+                    <a:blip r:embed="rId28">
+                      <a:extLst>
+                        <a:ext uri="{28A0092B-C50C-407E-A947-70E740481C1C}">
+                          <a14:useLocalDpi xmlns:a14="http://schemas.microsoft.com/office/drawing/2010/main" val="0"/>
+                        </a:ext>
+                      </a:extLst>
+                    </a:blip>
+                    <a:stretch>
+                      <a:fillRect/>
+                    </a:stretch>
+                  </pic:blipFill>
+                  <pic:spPr>
+                    <a:xfrm>
+                      <a:off x="0" y="0"/>
+                      <a:ext cx="5857875" cy="4752975"/>
+                    </a:xfrm>
+                    <a:prstGeom prst="rect">
+                      <a:avLst/>
+                    </a:prstGeom>
+                  </pic:spPr>
+                </pic:pic>
+              </a:graphicData>
+            </a:graphic>
+          </wp:anchor>
+        </w:drawing>
+      </w:r>
+      <w:r>
+        <w:rPr>
           <w:b/>
           <w:bCs/>
         </w:rPr>
@@ -14120,6 +15486,41 @@
       <w:r>
         <w:t xml:space="preserve"> </w:t>
       </w:r>
+    </w:p>
+    <w:p>
+      <w:pPr>
+        <w:ind w:left="720" w:firstLine="0"/>
+      </w:pPr>
+    </w:p>
+    <w:p>
+      <w:pPr>
+        <w:ind w:left="720" w:firstLine="0"/>
+      </w:pPr>
+    </w:p>
+    <w:p>
+      <w:pPr>
+        <w:ind w:left="720" w:firstLine="0"/>
+      </w:pPr>
+    </w:p>
+    <w:p>
+      <w:pPr>
+        <w:ind w:left="720" w:firstLine="0"/>
+      </w:pPr>
+    </w:p>
+    <w:p>
+      <w:pPr>
+        <w:ind w:left="720" w:firstLine="0"/>
+      </w:pPr>
+    </w:p>
+    <w:p>
+      <w:pPr>
+        <w:ind w:left="720" w:firstLine="0"/>
+      </w:pPr>
+    </w:p>
+    <w:p>
+      <w:pPr>
+        <w:ind w:left="720" w:firstLine="0"/>
+      </w:pPr>
     </w:p>
     <w:p>
       <w:pPr>
@@ -14133,12 +15534,64 @@
           <w:b/>
           <w:bCs/>
         </w:rPr>
+        <w:lastRenderedPageBreak/>
         <w:t>Reportar errores</w:t>
+      </w:r>
+    </w:p>
+    <w:p>
+      <w:pPr>
+        <w:ind w:left="370"/>
+      </w:pPr>
+      <w:r>
+        <w:rPr>
+          <w:noProof/>
+        </w:rPr>
+        <w:drawing>
+          <wp:inline distT="0" distB="0" distL="0" distR="0" wp14:anchorId="6B36979B" wp14:editId="2862F90A">
+            <wp:extent cx="5076825" cy="4400550"/>
+            <wp:effectExtent l="0" t="0" r="9525" b="0"/>
+            <wp:docPr id="543114611" name="Imagen 1"/>
+            <wp:cNvGraphicFramePr>
+              <a:graphicFrameLocks xmlns:a="http://schemas.openxmlformats.org/drawingml/2006/main" noChangeAspect="1"/>
+            </wp:cNvGraphicFramePr>
+            <a:graphic xmlns:a="http://schemas.openxmlformats.org/drawingml/2006/main">
+              <a:graphicData uri="http://schemas.openxmlformats.org/drawingml/2006/picture">
+                <pic:pic xmlns:pic="http://schemas.openxmlformats.org/drawingml/2006/picture">
+                  <pic:nvPicPr>
+                    <pic:cNvPr id="543114611" name=""/>
+                    <pic:cNvPicPr/>
+                  </pic:nvPicPr>
+                  <pic:blipFill>
+                    <a:blip r:embed="rId29"/>
+                    <a:stretch>
+                      <a:fillRect/>
+                    </a:stretch>
+                  </pic:blipFill>
+                  <pic:spPr>
+                    <a:xfrm>
+                      <a:off x="0" y="0"/>
+                      <a:ext cx="5076825" cy="4400550"/>
+                    </a:xfrm>
+                    <a:prstGeom prst="rect">
+                      <a:avLst/>
+                    </a:prstGeom>
+                  </pic:spPr>
+                </pic:pic>
+              </a:graphicData>
+            </a:graphic>
+          </wp:inline>
+        </w:drawing>
       </w:r>
     </w:p>
     <w:p/>
     <w:p/>
     <w:p/>
+    <w:p/>
+    <w:p/>
+    <w:p/>
+    <w:p/>
+    <w:p/>
+    <w:p/>
     <w:p>
       <w:pPr>
         <w:rPr>
@@ -14151,6 +15604,7 @@
           <w:b/>
           <w:bCs/>
         </w:rPr>
+        <w:lastRenderedPageBreak/>
         <w:t>Módulo: Panel administrativo</w:t>
       </w:r>
     </w:p>
@@ -14175,30 +15629,21 @@
           <w:numId w:val="25"/>
         </w:numPr>
       </w:pPr>
+      <w:proofErr w:type="spellStart"/>
       <w:r>
         <w:rPr>
           <w:b/>
           <w:bCs/>
         </w:rPr>
-        <w:t>Dashboard administrador</w:t>
-      </w:r>
-      <w:r>
-        <w:t xml:space="preserve"> </w:t>
-      </w:r>
-    </w:p>
-    <w:p>
-      <w:pPr>
-        <w:numPr>
-          <w:ilvl w:val="0"/>
-          <w:numId w:val="25"/>
-        </w:numPr>
-      </w:pPr>
+        <w:t>Dashboard</w:t>
+      </w:r>
+      <w:proofErr w:type="spellEnd"/>
       <w:r>
         <w:rPr>
           <w:b/>
           <w:bCs/>
         </w:rPr>
-        <w:t>Gestión de productos</w:t>
+        <w:t xml:space="preserve"> administrador</w:t>
       </w:r>
       <w:r>
         <w:t xml:space="preserve"> </w:t>
@@ -14250,6 +15695,76 @@
     </w:p>
     <w:p>
       <w:pPr>
+        <w:ind w:left="720" w:firstLine="0"/>
+      </w:pPr>
+      <w:r>
+        <w:rPr>
+          <w:noProof/>
+        </w:rPr>
+        <w:drawing>
+          <wp:inline distT="0" distB="0" distL="0" distR="0" wp14:anchorId="45D1A0AF" wp14:editId="428D52BF">
+            <wp:extent cx="5883910" cy="3347720"/>
+            <wp:effectExtent l="0" t="0" r="2540" b="5080"/>
+            <wp:docPr id="171603769" name="Imagen 1"/>
+            <wp:cNvGraphicFramePr>
+              <a:graphicFrameLocks xmlns:a="http://schemas.openxmlformats.org/drawingml/2006/main" noChangeAspect="1"/>
+            </wp:cNvGraphicFramePr>
+            <a:graphic xmlns:a="http://schemas.openxmlformats.org/drawingml/2006/main">
+              <a:graphicData uri="http://schemas.openxmlformats.org/drawingml/2006/picture">
+                <pic:pic xmlns:pic="http://schemas.openxmlformats.org/drawingml/2006/picture">
+                  <pic:nvPicPr>
+                    <pic:cNvPr id="171603769" name=""/>
+                    <pic:cNvPicPr/>
+                  </pic:nvPicPr>
+                  <pic:blipFill>
+                    <a:blip r:embed="rId30"/>
+                    <a:stretch>
+                      <a:fillRect/>
+                    </a:stretch>
+                  </pic:blipFill>
+                  <pic:spPr>
+                    <a:xfrm>
+                      <a:off x="0" y="0"/>
+                      <a:ext cx="5883910" cy="3347720"/>
+                    </a:xfrm>
+                    <a:prstGeom prst="rect">
+                      <a:avLst/>
+                    </a:prstGeom>
+                  </pic:spPr>
+                </pic:pic>
+              </a:graphicData>
+            </a:graphic>
+          </wp:inline>
+        </w:drawing>
+      </w:r>
+    </w:p>
+    <w:p>
+      <w:pPr>
+        <w:ind w:left="720" w:firstLine="0"/>
+      </w:pPr>
+    </w:p>
+    <w:p>
+      <w:pPr>
+        <w:ind w:left="720" w:firstLine="0"/>
+      </w:pPr>
+    </w:p>
+    <w:p>
+      <w:pPr>
+        <w:ind w:left="720" w:firstLine="0"/>
+      </w:pPr>
+    </w:p>
+    <w:p>
+      <w:pPr>
+        <w:ind w:left="720" w:firstLine="0"/>
+      </w:pPr>
+    </w:p>
+    <w:p>
+      <w:pPr>
+        <w:ind w:left="720" w:firstLine="0"/>
+      </w:pPr>
+    </w:p>
+    <w:p>
+      <w:pPr>
         <w:numPr>
           <w:ilvl w:val="0"/>
           <w:numId w:val="27"/>
@@ -14260,6 +15775,7 @@
           <w:b/>
           <w:bCs/>
         </w:rPr>
+        <w:lastRenderedPageBreak/>
         <w:t>Gestión de usuarios</w:t>
       </w:r>
       <w:r>
@@ -14307,48 +15823,102 @@
         </w:numPr>
       </w:pPr>
       <w:r>
+        <w:rPr>
+          <w:noProof/>
+        </w:rPr>
+        <w:drawing>
+          <wp:anchor distT="0" distB="0" distL="114300" distR="114300" simplePos="0" relativeHeight="251681792" behindDoc="0" locked="0" layoutInCell="1" allowOverlap="1" wp14:anchorId="166E4497" wp14:editId="78966723">
+            <wp:simplePos x="0" y="0"/>
+            <wp:positionH relativeFrom="column">
+              <wp:posOffset>128270</wp:posOffset>
+            </wp:positionH>
+            <wp:positionV relativeFrom="paragraph">
+              <wp:posOffset>391160</wp:posOffset>
+            </wp:positionV>
+            <wp:extent cx="5883910" cy="3432175"/>
+            <wp:effectExtent l="0" t="0" r="2540" b="0"/>
+            <wp:wrapTopAndBottom/>
+            <wp:docPr id="1231615075" name="Imagen 1"/>
+            <wp:cNvGraphicFramePr>
+              <a:graphicFrameLocks xmlns:a="http://schemas.openxmlformats.org/drawingml/2006/main" noChangeAspect="1"/>
+            </wp:cNvGraphicFramePr>
+            <a:graphic xmlns:a="http://schemas.openxmlformats.org/drawingml/2006/main">
+              <a:graphicData uri="http://schemas.openxmlformats.org/drawingml/2006/picture">
+                <pic:pic xmlns:pic="http://schemas.openxmlformats.org/drawingml/2006/picture">
+                  <pic:nvPicPr>
+                    <pic:cNvPr id="1231615075" name=""/>
+                    <pic:cNvPicPr/>
+                  </pic:nvPicPr>
+                  <pic:blipFill>
+                    <a:blip r:embed="rId31">
+                      <a:extLst>
+                        <a:ext uri="{28A0092B-C50C-407E-A947-70E740481C1C}">
+                          <a14:useLocalDpi xmlns:a14="http://schemas.microsoft.com/office/drawing/2010/main" val="0"/>
+                        </a:ext>
+                      </a:extLst>
+                    </a:blip>
+                    <a:stretch>
+                      <a:fillRect/>
+                    </a:stretch>
+                  </pic:blipFill>
+                  <pic:spPr>
+                    <a:xfrm>
+                      <a:off x="0" y="0"/>
+                      <a:ext cx="5883910" cy="3432175"/>
+                    </a:xfrm>
+                    <a:prstGeom prst="rect">
+                      <a:avLst/>
+                    </a:prstGeom>
+                  </pic:spPr>
+                </pic:pic>
+              </a:graphicData>
+            </a:graphic>
+          </wp:anchor>
+        </w:drawing>
+      </w:r>
+      <w:r>
         <w:t xml:space="preserve">Eliminar usuario </w:t>
       </w:r>
     </w:p>
     <w:p>
       <w:pPr>
-        <w:numPr>
-          <w:ilvl w:val="0"/>
-          <w:numId w:val="29"/>
-        </w:numPr>
-      </w:pPr>
-      <w:r>
-        <w:rPr>
-          <w:b/>
-          <w:bCs/>
-        </w:rPr>
-        <w:t>Inventario</w:t>
-      </w:r>
-      <w:r>
-        <w:t xml:space="preserve"> </w:t>
-      </w:r>
-    </w:p>
-    <w:p>
-      <w:pPr>
-        <w:numPr>
-          <w:ilvl w:val="0"/>
-          <w:numId w:val="30"/>
-        </w:numPr>
-      </w:pPr>
-      <w:r>
-        <w:t xml:space="preserve">Cantidad de productos </w:t>
-      </w:r>
-    </w:p>
-    <w:p>
-      <w:pPr>
-        <w:numPr>
-          <w:ilvl w:val="0"/>
-          <w:numId w:val="30"/>
-        </w:numPr>
-      </w:pPr>
-      <w:r>
-        <w:t xml:space="preserve">Alertas de stock </w:t>
-      </w:r>
+        <w:ind w:left="720" w:firstLine="0"/>
+      </w:pPr>
+    </w:p>
+    <w:p>
+      <w:pPr>
+        <w:ind w:left="720" w:firstLine="0"/>
+      </w:pPr>
+    </w:p>
+    <w:p>
+      <w:pPr>
+        <w:ind w:left="720" w:firstLine="0"/>
+      </w:pPr>
+    </w:p>
+    <w:p>
+      <w:pPr>
+        <w:ind w:left="720" w:firstLine="0"/>
+      </w:pPr>
+    </w:p>
+    <w:p>
+      <w:pPr>
+        <w:ind w:left="720" w:firstLine="0"/>
+      </w:pPr>
+    </w:p>
+    <w:p>
+      <w:pPr>
+        <w:ind w:left="720" w:firstLine="0"/>
+      </w:pPr>
+    </w:p>
+    <w:p>
+      <w:pPr>
+        <w:ind w:left="720" w:firstLine="0"/>
+      </w:pPr>
+    </w:p>
+    <w:p>
+      <w:pPr>
+        <w:ind w:left="720" w:firstLine="0"/>
+      </w:pPr>
     </w:p>
     <w:p>
       <w:pPr>
@@ -14362,6 +15932,7 @@
           <w:b/>
           <w:bCs/>
         </w:rPr>
+        <w:lastRenderedPageBreak/>
         <w:t>Reportes</w:t>
       </w:r>
       <w:r>
@@ -14387,7 +15958,161 @@
         </w:numPr>
       </w:pPr>
       <w:r>
+        <w:rPr>
+          <w:noProof/>
+        </w:rPr>
+        <w:drawing>
+          <wp:anchor distT="0" distB="0" distL="114300" distR="114300" simplePos="0" relativeHeight="251683840" behindDoc="0" locked="0" layoutInCell="1" allowOverlap="1" wp14:anchorId="6AE8E95B" wp14:editId="087ECA69">
+            <wp:simplePos x="0" y="0"/>
+            <wp:positionH relativeFrom="column">
+              <wp:posOffset>327187</wp:posOffset>
+            </wp:positionH>
+            <wp:positionV relativeFrom="paragraph">
+              <wp:posOffset>4037832</wp:posOffset>
+            </wp:positionV>
+            <wp:extent cx="5883910" cy="3283585"/>
+            <wp:effectExtent l="0" t="0" r="2540" b="0"/>
+            <wp:wrapTopAndBottom/>
+            <wp:docPr id="336683980" name="Imagen 1"/>
+            <wp:cNvGraphicFramePr>
+              <a:graphicFrameLocks xmlns:a="http://schemas.openxmlformats.org/drawingml/2006/main" noChangeAspect="1"/>
+            </wp:cNvGraphicFramePr>
+            <a:graphic xmlns:a="http://schemas.openxmlformats.org/drawingml/2006/main">
+              <a:graphicData uri="http://schemas.openxmlformats.org/drawingml/2006/picture">
+                <pic:pic xmlns:pic="http://schemas.openxmlformats.org/drawingml/2006/picture">
+                  <pic:nvPicPr>
+                    <pic:cNvPr id="336683980" name=""/>
+                    <pic:cNvPicPr/>
+                  </pic:nvPicPr>
+                  <pic:blipFill>
+                    <a:blip r:embed="rId32">
+                      <a:extLst>
+                        <a:ext uri="{28A0092B-C50C-407E-A947-70E740481C1C}">
+                          <a14:useLocalDpi xmlns:a14="http://schemas.microsoft.com/office/drawing/2010/main" val="0"/>
+                        </a:ext>
+                      </a:extLst>
+                    </a:blip>
+                    <a:stretch>
+                      <a:fillRect/>
+                    </a:stretch>
+                  </pic:blipFill>
+                  <pic:spPr>
+                    <a:xfrm>
+                      <a:off x="0" y="0"/>
+                      <a:ext cx="5883910" cy="3283585"/>
+                    </a:xfrm>
+                    <a:prstGeom prst="rect">
+                      <a:avLst/>
+                    </a:prstGeom>
+                  </pic:spPr>
+                </pic:pic>
+              </a:graphicData>
+            </a:graphic>
+          </wp:anchor>
+        </w:drawing>
+      </w:r>
+      <w:r>
+        <w:rPr>
+          <w:noProof/>
+        </w:rPr>
+        <w:drawing>
+          <wp:anchor distT="0" distB="0" distL="114300" distR="114300" simplePos="0" relativeHeight="251682816" behindDoc="0" locked="0" layoutInCell="1" allowOverlap="1" wp14:anchorId="469DB538" wp14:editId="7A7B6BE0">
+            <wp:simplePos x="0" y="0"/>
+            <wp:positionH relativeFrom="column">
+              <wp:posOffset>299720</wp:posOffset>
+            </wp:positionH>
+            <wp:positionV relativeFrom="paragraph">
+              <wp:posOffset>269240</wp:posOffset>
+            </wp:positionV>
+            <wp:extent cx="5883910" cy="3311525"/>
+            <wp:effectExtent l="0" t="0" r="2540" b="3175"/>
+            <wp:wrapTopAndBottom/>
+            <wp:docPr id="279317486" name="Imagen 1"/>
+            <wp:cNvGraphicFramePr>
+              <a:graphicFrameLocks xmlns:a="http://schemas.openxmlformats.org/drawingml/2006/main" noChangeAspect="1"/>
+            </wp:cNvGraphicFramePr>
+            <a:graphic xmlns:a="http://schemas.openxmlformats.org/drawingml/2006/main">
+              <a:graphicData uri="http://schemas.openxmlformats.org/drawingml/2006/picture">
+                <pic:pic xmlns:pic="http://schemas.openxmlformats.org/drawingml/2006/picture">
+                  <pic:nvPicPr>
+                    <pic:cNvPr id="279317486" name=""/>
+                    <pic:cNvPicPr/>
+                  </pic:nvPicPr>
+                  <pic:blipFill>
+                    <a:blip r:embed="rId33">
+                      <a:extLst>
+                        <a:ext uri="{28A0092B-C50C-407E-A947-70E740481C1C}">
+                          <a14:useLocalDpi xmlns:a14="http://schemas.microsoft.com/office/drawing/2010/main" val="0"/>
+                        </a:ext>
+                      </a:extLst>
+                    </a:blip>
+                    <a:stretch>
+                      <a:fillRect/>
+                    </a:stretch>
+                  </pic:blipFill>
+                  <pic:spPr>
+                    <a:xfrm>
+                      <a:off x="0" y="0"/>
+                      <a:ext cx="5883910" cy="3311525"/>
+                    </a:xfrm>
+                    <a:prstGeom prst="rect">
+                      <a:avLst/>
+                    </a:prstGeom>
+                  </pic:spPr>
+                </pic:pic>
+              </a:graphicData>
+            </a:graphic>
+          </wp:anchor>
+        </w:drawing>
+      </w:r>
+      <w:r>
         <w:t>Productos más vendidos</w:t>
+      </w:r>
+    </w:p>
+    <w:p>
+      <w:pPr>
+        <w:ind w:left="720" w:firstLine="0"/>
+      </w:pPr>
+      <w:r>
+        <w:rPr>
+          <w:noProof/>
+        </w:rPr>
+        <w:lastRenderedPageBreak/>
+        <w:drawing>
+          <wp:inline distT="0" distB="0" distL="0" distR="0" wp14:anchorId="0A463F9B" wp14:editId="363994D6">
+            <wp:extent cx="5883910" cy="4037330"/>
+            <wp:effectExtent l="0" t="0" r="2540" b="1270"/>
+            <wp:docPr id="1325015967" name="Imagen 1"/>
+            <wp:cNvGraphicFramePr>
+              <a:graphicFrameLocks xmlns:a="http://schemas.openxmlformats.org/drawingml/2006/main" noChangeAspect="1"/>
+            </wp:cNvGraphicFramePr>
+            <a:graphic xmlns:a="http://schemas.openxmlformats.org/drawingml/2006/main">
+              <a:graphicData uri="http://schemas.openxmlformats.org/drawingml/2006/picture">
+                <pic:pic xmlns:pic="http://schemas.openxmlformats.org/drawingml/2006/picture">
+                  <pic:nvPicPr>
+                    <pic:cNvPr id="1325015967" name=""/>
+                    <pic:cNvPicPr/>
+                  </pic:nvPicPr>
+                  <pic:blipFill>
+                    <a:blip r:embed="rId34"/>
+                    <a:stretch>
+                      <a:fillRect/>
+                    </a:stretch>
+                  </pic:blipFill>
+                  <pic:spPr>
+                    <a:xfrm>
+                      <a:off x="0" y="0"/>
+                      <a:ext cx="5883910" cy="4037330"/>
+                    </a:xfrm>
+                    <a:prstGeom prst="rect">
+                      <a:avLst/>
+                    </a:prstGeom>
+                  </pic:spPr>
+                </pic:pic>
+              </a:graphicData>
+            </a:graphic>
+          </wp:inline>
+        </w:drawing>
       </w:r>
     </w:p>
     <w:p>
@@ -14414,59 +16139,152 @@
     </w:p>
     <w:p>
       <w:pPr>
+        <w:ind w:left="720" w:firstLine="0"/>
+      </w:pPr>
+    </w:p>
+    <w:p>
+      <w:pPr>
         <w:pStyle w:val="Ttulo2"/>
         <w:rPr>
           <w:rFonts w:ascii="Times New Roman" w:hAnsi="Times New Roman" w:cs="Times New Roman"/>
         </w:rPr>
       </w:pPr>
-      <w:r>
-        <w:rPr>
-          <w:rFonts w:ascii="Times New Roman" w:hAnsi="Times New Roman" w:cs="Times New Roman"/>
-        </w:rPr>
+    </w:p>
+    <w:p/>
+    <w:p/>
+    <w:p/>
+    <w:p/>
+    <w:p/>
+    <w:p/>
+    <w:p/>
+    <w:p/>
+    <w:p>
+      <w:r>
         <w:lastRenderedPageBreak/>
-        <w:t>Plan de Pruebas</w:t>
-      </w:r>
-    </w:p>
-    <w:p>
-      <w:pPr>
-        <w:pStyle w:val="Ttulo2"/>
-        <w:rPr>
-          <w:rFonts w:ascii="Times New Roman" w:hAnsi="Times New Roman" w:cs="Times New Roman"/>
-        </w:rPr>
-      </w:pPr>
-      <w:r>
-        <w:rPr>
-          <w:rFonts w:ascii="Times New Roman" w:hAnsi="Times New Roman" w:cs="Times New Roman"/>
-        </w:rPr>
-        <w:t>Especificación Técnica</w:t>
-      </w:r>
-    </w:p>
-    <w:p>
-      <w:pPr>
-        <w:pStyle w:val="Ttulo2"/>
-        <w:rPr>
-          <w:rFonts w:ascii="Times New Roman" w:hAnsi="Times New Roman" w:cs="Times New Roman"/>
-        </w:rPr>
-      </w:pPr>
-      <w:r>
-        <w:rPr>
-          <w:rFonts w:ascii="Times New Roman" w:hAnsi="Times New Roman" w:cs="Times New Roman"/>
-        </w:rPr>
-        <w:t>Manual de Usuario</w:t>
-      </w:r>
-    </w:p>
-    <w:p>
-      <w:pPr>
-        <w:pStyle w:val="Ttulo2"/>
-        <w:rPr>
-          <w:rFonts w:ascii="Times New Roman" w:hAnsi="Times New Roman" w:cs="Times New Roman"/>
-        </w:rPr>
-      </w:pPr>
-      <w:r>
-        <w:rPr>
-          <w:rFonts w:ascii="Times New Roman" w:hAnsi="Times New Roman" w:cs="Times New Roman"/>
-        </w:rPr>
-        <w:t>Conclusiones</w:t>
+        <w:t>Diagrama de clases:</w:t>
+      </w:r>
+    </w:p>
+    <w:p>
+      <w:r>
+        <w:rPr>
+          <w:noProof/>
+        </w:rPr>
+        <mc:AlternateContent>
+          <mc:Choice Requires="wps">
+            <w:drawing>
+              <wp:inline distT="0" distB="0" distL="0" distR="0" wp14:anchorId="693629A8" wp14:editId="4A510546">
+                <wp:extent cx="308610" cy="308610"/>
+                <wp:effectExtent l="0" t="0" r="0" b="0"/>
+                <wp:docPr id="1471825889" name="Rectángulo 1" descr="Diagrama de clases UML para ventas"/>
+                <wp:cNvGraphicFramePr>
+                  <a:graphicFrameLocks xmlns:a="http://schemas.openxmlformats.org/drawingml/2006/main" noChangeAspect="1"/>
+                </wp:cNvGraphicFramePr>
+                <a:graphic xmlns:a="http://schemas.openxmlformats.org/drawingml/2006/main">
+                  <a:graphicData uri="http://schemas.microsoft.com/office/word/2010/wordprocessingShape">
+                    <wps:wsp>
+                      <wps:cNvSpPr>
+                        <a:spLocks noChangeAspect="1" noChangeArrowheads="1"/>
+                      </wps:cNvSpPr>
+                      <wps:spPr bwMode="auto">
+                        <a:xfrm>
+                          <a:off x="0" y="0"/>
+                          <a:ext cx="308610" cy="308610"/>
+                        </a:xfrm>
+                        <a:prstGeom prst="rect">
+                          <a:avLst/>
+                        </a:prstGeom>
+                        <a:noFill/>
+                        <a:ln>
+                          <a:noFill/>
+                        </a:ln>
+                        <a:extLst>
+                          <a:ext uri="{909E8E84-426E-40DD-AFC4-6F175D3DCCD1}">
+                            <a14:hiddenFill xmlns:a14="http://schemas.microsoft.com/office/drawing/2010/main">
+                              <a:solidFill>
+                                <a:srgbClr val="FFFFFF"/>
+                              </a:solidFill>
+                            </a14:hiddenFill>
+                          </a:ext>
+                          <a:ext uri="{91240B29-F687-4F45-9708-019B960494DF}">
+                            <a14:hiddenLine xmlns:a14="http://schemas.microsoft.com/office/drawing/2010/main" w="9525">
+                              <a:solidFill>
+                                <a:srgbClr val="000000"/>
+                              </a:solidFill>
+                              <a:miter lim="800000"/>
+                              <a:headEnd/>
+                              <a:tailEnd/>
+                            </a14:hiddenLine>
+                          </a:ext>
+                        </a:extLst>
+                      </wps:spPr>
+                      <wps:bodyPr rot="0" vert="horz" wrap="square" lIns="91440" tIns="45720" rIns="91440" bIns="45720" anchor="t" anchorCtr="0" upright="1">
+                        <a:noAutofit/>
+                      </wps:bodyPr>
+                    </wps:wsp>
+                  </a:graphicData>
+                </a:graphic>
+              </wp:inline>
+            </w:drawing>
+          </mc:Choice>
+          <mc:Fallback>
+            <w:pict>
+              <v:rect w14:anchorId="1C98E8A4" id="Rectángulo 1" o:spid="_x0000_s1026" alt="Diagrama de clases UML para ventas" style="width:24.3pt;height:24.3pt;visibility:visible;mso-wrap-style:square;mso-left-percent:-10001;mso-top-percent:-10001;mso-position-horizontal:absolute;mso-position-horizontal-relative:char;mso-position-vertical:absolute;mso-position-vertical-relative:line;mso-left-percent:-10001;mso-top-percent:-10001;v-text-anchor:top" o:gfxdata="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" filled="f" stroked="f">
+                <o:lock v:ext="edit" aspectratio="t"/>
+                <w10:anchorlock/>
+              </v:rect>
+            </w:pict>
+          </mc:Fallback>
+        </mc:AlternateContent>
+      </w:r>
+      <w:r>
+        <w:rPr>
+          <w:noProof/>
+        </w:rPr>
+        <w:drawing>
+          <wp:inline distT="0" distB="0" distL="0" distR="0" wp14:anchorId="2181B0E0" wp14:editId="6969EF75">
+            <wp:extent cx="5894173" cy="3929449"/>
+            <wp:effectExtent l="0" t="0" r="0" b="0"/>
+            <wp:docPr id="1744854325" name="Imagen 3"/>
+            <wp:cNvGraphicFramePr>
+              <a:graphicFrameLocks xmlns:a="http://schemas.openxmlformats.org/drawingml/2006/main" noChangeAspect="1"/>
+            </wp:cNvGraphicFramePr>
+            <a:graphic xmlns:a="http://schemas.openxmlformats.org/drawingml/2006/main">
+              <a:graphicData uri="http://schemas.openxmlformats.org/drawingml/2006/picture">
+                <pic:pic xmlns:pic="http://schemas.openxmlformats.org/drawingml/2006/picture">
+                  <pic:nvPicPr>
+                    <pic:cNvPr id="0" name="Picture 2"/>
+                    <pic:cNvPicPr>
+                      <a:picLocks noChangeAspect="1" noChangeArrowheads="1"/>
+                    </pic:cNvPicPr>
+                  </pic:nvPicPr>
+                  <pic:blipFill>
+                    <a:blip r:embed="rId35" cstate="print">
+                      <a:extLst>
+                        <a:ext uri="{28A0092B-C50C-407E-A947-70E740481C1C}">
+                          <a14:useLocalDpi xmlns:a14="http://schemas.microsoft.com/office/drawing/2010/main" val="0"/>
+                        </a:ext>
+                      </a:extLst>
+                    </a:blip>
+                    <a:srcRect/>
+                    <a:stretch>
+                      <a:fillRect/>
+                    </a:stretch>
+                  </pic:blipFill>
+                  <pic:spPr bwMode="auto">
+                    <a:xfrm>
+                      <a:off x="0" y="0"/>
+                      <a:ext cx="5906098" cy="3937399"/>
+                    </a:xfrm>
+                    <a:prstGeom prst="rect">
+                      <a:avLst/>
+                    </a:prstGeom>
+                    <a:noFill/>
+                  </pic:spPr>
+                </pic:pic>
+              </a:graphicData>
+            </a:graphic>
+          </wp:inline>
+        </w:drawing>
       </w:r>
     </w:p>
     <w:sectPr>
@@ -19960,6 +21778,17 @@
       <w:color w:val="0F4761" w:themeColor="accent1" w:themeShade="BF"/>
     </w:rPr>
   </w:style>
+  <w:style w:type="paragraph" w:styleId="Prrafodelista">
+    <w:name w:val="List Paragraph"/>
+    <w:basedOn w:val="Normal"/>
+    <w:uiPriority w:val="34"/>
+    <w:qFormat/>
+    <w:rsid w:val="001C0266"/>
+    <w:pPr>
+      <w:ind w:left="720"/>
+      <w:contextualSpacing/>
+    </w:pPr>
+  </w:style>
 </w:styles>
 </file>
 

</xml_diff>